<commit_message>
Add architecture/workflow diagrams and live screenshots to Thabiso's submission sections
</commit_message>
<xml_diff>
--- a/public/downloads/T2-Technologies-FBM-Thabiso-Sections.docx
+++ b/public/downloads/T2-Technologies-FBM-Thabiso-Sections.docx
@@ -1085,6 +1085,633 @@
           <w:szCs w:val="22"/>
         </w:rPr>
         <w:t xml:space="preserve">Operations Layer: CI/CD, monitoring, logging, alerting, vulnerability management, service management and audit reporting.</w:t>
+      </w:r>
+    </w:p>
+    <w:p>
+      <w:pPr>
+        <w:spacing w:after="40" w:before="160"/>
+        <w:jc w:val="center"/>
+      </w:pPr>
+      <w:r>
+        <w:drawing>
+          <wp:inline distT="0" distB="0" distL="0" distR="0">
+            <wp:extent cx="5715000" cy="3400425"/>
+            <wp:effectExtent t="0" r="0" b="0" l="0"/>
+            <wp:docPr id="1" name="" descr="" title=""/>
+            <wp:cNvGraphicFramePr>
+              <a:graphicFrameLocks xmlns:a="http://schemas.openxmlformats.org/drawingml/2006/main" noChangeAspect="1"/>
+            </wp:cNvGraphicFramePr>
+            <a:graphic xmlns:a="http://schemas.openxmlformats.org/drawingml/2006/main">
+              <a:graphicData uri="http://schemas.openxmlformats.org/drawingml/2006/picture">
+                <pic:pic xmlns:pic="http://schemas.openxmlformats.org/drawingml/2006/picture">
+                  <pic:nvPicPr>
+                    <pic:cNvPr id="0" name="" descr=""/>
+                    <pic:cNvPicPr>
+                      <a:picLocks noChangeAspect="1" noChangeArrowheads="1"/>
+                    </pic:cNvPicPr>
+                  </pic:nvPicPr>
+                  <pic:blipFill>
+                    <a:blip r:embed="rId7" cstate="none"/>
+                    <a:srcRect/>
+                    <a:stretch>
+                      <a:fillRect/>
+                    </a:stretch>
+                  </pic:blipFill>
+                  <pic:spPr bwMode="auto">
+                    <a:xfrm>
+                      <a:off x="0" y="0"/>
+                      <a:ext cx="5715000" cy="3400425"/>
+                    </a:xfrm>
+                    <a:prstGeom prst="rect">
+                      <a:avLst/>
+                    </a:prstGeom>
+                  </pic:spPr>
+                </pic:pic>
+              </a:graphicData>
+            </a:graphic>
+          </wp:inline>
+        </w:drawing>
+      </w:r>
+    </w:p>
+    <w:p>
+      <w:pPr>
+        <w:spacing w:after="200"/>
+        <w:jc w:val="center"/>
+      </w:pPr>
+      <w:r>
+        <w:rPr>
+          <w:i/>
+          <w:iCs/>
+          <w:color w:val="6B7280"/>
+          <w:sz w:val="16"/>
+          <w:szCs w:val="16"/>
+        </w:rPr>
+        <w:t xml:space="preserve">Figure 5.1 — Logical architecture</w:t>
+      </w:r>
+    </w:p>
+    <w:p>
+      <w:pPr>
+        <w:spacing w:after="80" w:before="160"/>
+      </w:pPr>
+      <w:r>
+        <w:rPr>
+          <w:b/>
+          <w:bCs/>
+          <w:color w:val="1F2937"/>
+          <w:sz w:val="24"/>
+          <w:szCs w:val="24"/>
+        </w:rPr>
+        <w:t xml:space="preserve">5.2 Reference Deployment and Data Flow</w:t>
+      </w:r>
+    </w:p>
+    <w:p>
+      <w:pPr>
+        <w:spacing w:after="120"/>
+      </w:pPr>
+      <w:r>
+        <w:rPr>
+          <w:color w:val="1F2937"/>
+          <w:sz w:val="22"/>
+          <w:szCs w:val="22"/>
+        </w:rPr>
+        <w:t xml:space="preserve">The module is designed for a resilient, cloud-ready deployment. Traffic is terminated at a managed edge, routed to stateless application services behind a private network boundary, and backed by managed data and integration stores. The data-flow view shows how metered readings move through import, validation and balancing into the decisions and actions the tool surfaces.</w:t>
+      </w:r>
+    </w:p>
+    <w:p>
+      <w:pPr>
+        <w:spacing w:after="40" w:before="160"/>
+        <w:jc w:val="center"/>
+      </w:pPr>
+      <w:r>
+        <w:drawing>
+          <wp:inline distT="0" distB="0" distL="0" distR="0">
+            <wp:extent cx="5715000" cy="3648075"/>
+            <wp:effectExtent t="0" r="0" b="0" l="0"/>
+            <wp:docPr id="1" name="" descr="" title=""/>
+            <wp:cNvGraphicFramePr>
+              <a:graphicFrameLocks xmlns:a="http://schemas.openxmlformats.org/drawingml/2006/main" noChangeAspect="1"/>
+            </wp:cNvGraphicFramePr>
+            <a:graphic xmlns:a="http://schemas.openxmlformats.org/drawingml/2006/main">
+              <a:graphicData uri="http://schemas.openxmlformats.org/drawingml/2006/picture">
+                <pic:pic xmlns:pic="http://schemas.openxmlformats.org/drawingml/2006/picture">
+                  <pic:nvPicPr>
+                    <pic:cNvPr id="0" name="" descr=""/>
+                    <pic:cNvPicPr>
+                      <a:picLocks noChangeAspect="1" noChangeArrowheads="1"/>
+                    </pic:cNvPicPr>
+                  </pic:nvPicPr>
+                  <pic:blipFill>
+                    <a:blip r:embed="rId8" cstate="none"/>
+                    <a:srcRect/>
+                    <a:stretch>
+                      <a:fillRect/>
+                    </a:stretch>
+                  </pic:blipFill>
+                  <pic:spPr bwMode="auto">
+                    <a:xfrm>
+                      <a:off x="0" y="0"/>
+                      <a:ext cx="5715000" cy="3648075"/>
+                    </a:xfrm>
+                    <a:prstGeom prst="rect">
+                      <a:avLst/>
+                    </a:prstGeom>
+                  </pic:spPr>
+                </pic:pic>
+              </a:graphicData>
+            </a:graphic>
+          </wp:inline>
+        </w:drawing>
+      </w:r>
+    </w:p>
+    <w:p>
+      <w:pPr>
+        <w:spacing w:after="200"/>
+        <w:jc w:val="center"/>
+      </w:pPr>
+      <w:r>
+        <w:rPr>
+          <w:i/>
+          <w:iCs/>
+          <w:color w:val="6B7280"/>
+          <w:sz w:val="16"/>
+          <w:szCs w:val="16"/>
+        </w:rPr>
+        <w:t xml:space="preserve">Figure 5.2 — Deployment architecture</w:t>
+      </w:r>
+    </w:p>
+    <w:p>
+      <w:pPr>
+        <w:spacing w:after="40" w:before="160"/>
+        <w:jc w:val="center"/>
+      </w:pPr>
+      <w:r>
+        <w:drawing>
+          <wp:inline distT="0" distB="0" distL="0" distR="0">
+            <wp:extent cx="5715000" cy="1981200"/>
+            <wp:effectExtent t="0" r="0" b="0" l="0"/>
+            <wp:docPr id="1" name="" descr="" title=""/>
+            <wp:cNvGraphicFramePr>
+              <a:graphicFrameLocks xmlns:a="http://schemas.openxmlformats.org/drawingml/2006/main" noChangeAspect="1"/>
+            </wp:cNvGraphicFramePr>
+            <a:graphic xmlns:a="http://schemas.openxmlformats.org/drawingml/2006/main">
+              <a:graphicData uri="http://schemas.openxmlformats.org/drawingml/2006/picture">
+                <pic:pic xmlns:pic="http://schemas.openxmlformats.org/drawingml/2006/picture">
+                  <pic:nvPicPr>
+                    <pic:cNvPr id="0" name="" descr=""/>
+                    <pic:cNvPicPr>
+                      <a:picLocks noChangeAspect="1" noChangeArrowheads="1"/>
+                    </pic:cNvPicPr>
+                  </pic:nvPicPr>
+                  <pic:blipFill>
+                    <a:blip r:embed="rId9" cstate="none"/>
+                    <a:srcRect/>
+                    <a:stretch>
+                      <a:fillRect/>
+                    </a:stretch>
+                  </pic:blipFill>
+                  <pic:spPr bwMode="auto">
+                    <a:xfrm>
+                      <a:off x="0" y="0"/>
+                      <a:ext cx="5715000" cy="1981200"/>
+                    </a:xfrm>
+                    <a:prstGeom prst="rect">
+                      <a:avLst/>
+                    </a:prstGeom>
+                  </pic:spPr>
+                </pic:pic>
+              </a:graphicData>
+            </a:graphic>
+          </wp:inline>
+        </w:drawing>
+      </w:r>
+    </w:p>
+    <w:p>
+      <w:pPr>
+        <w:spacing w:after="200"/>
+        <w:jc w:val="center"/>
+      </w:pPr>
+      <w:r>
+        <w:rPr>
+          <w:i/>
+          <w:iCs/>
+          <w:color w:val="6B7280"/>
+          <w:sz w:val="16"/>
+          <w:szCs w:val="16"/>
+        </w:rPr>
+        <w:t xml:space="preserve">Figure 5.3 — Data flow</w:t>
+      </w:r>
+    </w:p>
+    <w:p>
+      <w:pPr>
+        <w:spacing w:after="80" w:before="160"/>
+      </w:pPr>
+      <w:r>
+        <w:rPr>
+          <w:b/>
+          <w:bCs/>
+          <w:color w:val="1F2937"/>
+          <w:sz w:val="24"/>
+          <w:szCs w:val="24"/>
+        </w:rPr>
+        <w:t xml:space="preserve">5.3 Application Configuration Workflows</w:t>
+      </w:r>
+    </w:p>
+    <w:p>
+      <w:pPr>
+        <w:spacing w:after="120"/>
+      </w:pPr>
+      <w:r>
+        <w:rPr>
+          <w:color w:val="1F2937"/>
+          <w:sz w:val="22"/>
+          <w:szCs w:val="22"/>
+        </w:rPr>
+        <w:t xml:space="preserve">The following workflows explain how the tool is operated day to day — behaviour that cannot be conveyed by a static screen alone. Each workflow diagram is paired with a capture of the corresponding screen in the live FBM application.</w:t>
+      </w:r>
+    </w:p>
+    <w:p>
+      <w:pPr>
+        <w:spacing w:after="120"/>
+      </w:pPr>
+      <w:r>
+        <w:rPr>
+          <w:color w:val="1F2937"/>
+          <w:sz w:val="22"/>
+          <w:szCs w:val="22"/>
+        </w:rPr>
+        <w:t xml:space="preserve">Configuring a network establishes the eight-level hierarchy (Operating Unit down to Meter); network mapping then lets an engineer re-parent equipment and group meters, transformers or feeders into clusters by drag-and-drop, with energy roll-ups recalculated automatically.</w:t>
+      </w:r>
+    </w:p>
+    <w:p>
+      <w:pPr>
+        <w:spacing w:after="40" w:before="160"/>
+        <w:jc w:val="center"/>
+      </w:pPr>
+      <w:r>
+        <w:drawing>
+          <wp:inline distT="0" distB="0" distL="0" distR="0">
+            <wp:extent cx="5715000" cy="1485900"/>
+            <wp:effectExtent t="0" r="0" b="0" l="0"/>
+            <wp:docPr id="1" name="" descr="" title=""/>
+            <wp:cNvGraphicFramePr>
+              <a:graphicFrameLocks xmlns:a="http://schemas.openxmlformats.org/drawingml/2006/main" noChangeAspect="1"/>
+            </wp:cNvGraphicFramePr>
+            <a:graphic xmlns:a="http://schemas.openxmlformats.org/drawingml/2006/main">
+              <a:graphicData uri="http://schemas.openxmlformats.org/drawingml/2006/picture">
+                <pic:pic xmlns:pic="http://schemas.openxmlformats.org/drawingml/2006/picture">
+                  <pic:nvPicPr>
+                    <pic:cNvPr id="0" name="" descr=""/>
+                    <pic:cNvPicPr>
+                      <a:picLocks noChangeAspect="1" noChangeArrowheads="1"/>
+                    </pic:cNvPicPr>
+                  </pic:nvPicPr>
+                  <pic:blipFill>
+                    <a:blip r:embed="rId10" cstate="none"/>
+                    <a:srcRect/>
+                    <a:stretch>
+                      <a:fillRect/>
+                    </a:stretch>
+                  </pic:blipFill>
+                  <pic:spPr bwMode="auto">
+                    <a:xfrm>
+                      <a:off x="0" y="0"/>
+                      <a:ext cx="5715000" cy="1485900"/>
+                    </a:xfrm>
+                    <a:prstGeom prst="rect">
+                      <a:avLst/>
+                    </a:prstGeom>
+                  </pic:spPr>
+                </pic:pic>
+              </a:graphicData>
+            </a:graphic>
+          </wp:inline>
+        </w:drawing>
+      </w:r>
+    </w:p>
+    <w:p>
+      <w:pPr>
+        <w:spacing w:after="200"/>
+        <w:jc w:val="center"/>
+      </w:pPr>
+      <w:r>
+        <w:rPr>
+          <w:i/>
+          <w:iCs/>
+          <w:color w:val="6B7280"/>
+          <w:sz w:val="16"/>
+          <w:szCs w:val="16"/>
+        </w:rPr>
+        <w:t xml:space="preserve">Figure 5.4 — Network configuration workflow</w:t>
+      </w:r>
+    </w:p>
+    <w:p>
+      <w:pPr>
+        <w:spacing w:after="40" w:before="160"/>
+        <w:jc w:val="center"/>
+      </w:pPr>
+      <w:r>
+        <w:drawing>
+          <wp:inline distT="0" distB="0" distL="0" distR="0">
+            <wp:extent cx="5715000" cy="3838575"/>
+            <wp:effectExtent t="0" r="0" b="0" l="0"/>
+            <wp:docPr id="1" name="" descr="" title=""/>
+            <wp:cNvGraphicFramePr>
+              <a:graphicFrameLocks xmlns:a="http://schemas.openxmlformats.org/drawingml/2006/main" noChangeAspect="1"/>
+            </wp:cNvGraphicFramePr>
+            <a:graphic xmlns:a="http://schemas.openxmlformats.org/drawingml/2006/main">
+              <a:graphicData uri="http://schemas.openxmlformats.org/drawingml/2006/picture">
+                <pic:pic xmlns:pic="http://schemas.openxmlformats.org/drawingml/2006/picture">
+                  <pic:nvPicPr>
+                    <pic:cNvPr id="0" name="" descr=""/>
+                    <pic:cNvPicPr>
+                      <a:picLocks noChangeAspect="1" noChangeArrowheads="1"/>
+                    </pic:cNvPicPr>
+                  </pic:nvPicPr>
+                  <pic:blipFill>
+                    <a:blip r:embed="rId11" cstate="none"/>
+                    <a:srcRect/>
+                    <a:stretch>
+                      <a:fillRect/>
+                    </a:stretch>
+                  </pic:blipFill>
+                  <pic:spPr bwMode="auto">
+                    <a:xfrm>
+                      <a:off x="0" y="0"/>
+                      <a:ext cx="5715000" cy="3838575"/>
+                    </a:xfrm>
+                    <a:prstGeom prst="rect">
+                      <a:avLst/>
+                    </a:prstGeom>
+                  </pic:spPr>
+                </pic:pic>
+              </a:graphicData>
+            </a:graphic>
+          </wp:inline>
+        </w:drawing>
+      </w:r>
+    </w:p>
+    <w:p>
+      <w:pPr>
+        <w:spacing w:after="200"/>
+        <w:jc w:val="center"/>
+      </w:pPr>
+      <w:r>
+        <w:rPr>
+          <w:i/>
+          <w:iCs/>
+          <w:color w:val="6B7280"/>
+          <w:sz w:val="16"/>
+          <w:szCs w:val="16"/>
+        </w:rPr>
+        <w:t xml:space="preserve">Figure 5.7 — Configure Network (live tool): the eight-level hierarchy with automatic energy roll-up and loss KPIs computed at every level.</w:t>
+      </w:r>
+    </w:p>
+    <w:p>
+      <w:pPr>
+        <w:spacing w:after="40" w:before="160"/>
+        <w:jc w:val="center"/>
+      </w:pPr>
+      <w:r>
+        <w:drawing>
+          <wp:inline distT="0" distB="0" distL="0" distR="0">
+            <wp:extent cx="5715000" cy="1552575"/>
+            <wp:effectExtent t="0" r="0" b="0" l="0"/>
+            <wp:docPr id="1" name="" descr="" title=""/>
+            <wp:cNvGraphicFramePr>
+              <a:graphicFrameLocks xmlns:a="http://schemas.openxmlformats.org/drawingml/2006/main" noChangeAspect="1"/>
+            </wp:cNvGraphicFramePr>
+            <a:graphic xmlns:a="http://schemas.openxmlformats.org/drawingml/2006/main">
+              <a:graphicData uri="http://schemas.openxmlformats.org/drawingml/2006/picture">
+                <pic:pic xmlns:pic="http://schemas.openxmlformats.org/drawingml/2006/picture">
+                  <pic:nvPicPr>
+                    <pic:cNvPr id="0" name="" descr=""/>
+                    <pic:cNvPicPr>
+                      <a:picLocks noChangeAspect="1" noChangeArrowheads="1"/>
+                    </pic:cNvPicPr>
+                  </pic:nvPicPr>
+                  <pic:blipFill>
+                    <a:blip r:embed="rId12" cstate="none"/>
+                    <a:srcRect/>
+                    <a:stretch>
+                      <a:fillRect/>
+                    </a:stretch>
+                  </pic:blipFill>
+                  <pic:spPr bwMode="auto">
+                    <a:xfrm>
+                      <a:off x="0" y="0"/>
+                      <a:ext cx="5715000" cy="1552575"/>
+                    </a:xfrm>
+                    <a:prstGeom prst="rect">
+                      <a:avLst/>
+                    </a:prstGeom>
+                  </pic:spPr>
+                </pic:pic>
+              </a:graphicData>
+            </a:graphic>
+          </wp:inline>
+        </w:drawing>
+      </w:r>
+    </w:p>
+    <w:p>
+      <w:pPr>
+        <w:spacing w:after="200"/>
+        <w:jc w:val="center"/>
+      </w:pPr>
+      <w:r>
+        <w:rPr>
+          <w:i/>
+          <w:iCs/>
+          <w:color w:val="6B7280"/>
+          <w:sz w:val="16"/>
+          <w:szCs w:val="16"/>
+        </w:rPr>
+        <w:t xml:space="preserve">Figure 5.5 — Network mapping workflow</w:t>
+      </w:r>
+    </w:p>
+    <w:p>
+      <w:pPr>
+        <w:spacing w:after="40" w:before="160"/>
+        <w:jc w:val="center"/>
+      </w:pPr>
+      <w:r>
+        <w:drawing>
+          <wp:inline distT="0" distB="0" distL="0" distR="0">
+            <wp:extent cx="5715000" cy="3838575"/>
+            <wp:effectExtent t="0" r="0" b="0" l="0"/>
+            <wp:docPr id="1" name="" descr="" title=""/>
+            <wp:cNvGraphicFramePr>
+              <a:graphicFrameLocks xmlns:a="http://schemas.openxmlformats.org/drawingml/2006/main" noChangeAspect="1"/>
+            </wp:cNvGraphicFramePr>
+            <a:graphic xmlns:a="http://schemas.openxmlformats.org/drawingml/2006/main">
+              <a:graphicData uri="http://schemas.openxmlformats.org/drawingml/2006/picture">
+                <pic:pic xmlns:pic="http://schemas.openxmlformats.org/drawingml/2006/picture">
+                  <pic:nvPicPr>
+                    <pic:cNvPr id="0" name="" descr=""/>
+                    <pic:cNvPicPr>
+                      <a:picLocks noChangeAspect="1" noChangeArrowheads="1"/>
+                    </pic:cNvPicPr>
+                  </pic:nvPicPr>
+                  <pic:blipFill>
+                    <a:blip r:embed="rId13" cstate="none"/>
+                    <a:srcRect/>
+                    <a:stretch>
+                      <a:fillRect/>
+                    </a:stretch>
+                  </pic:blipFill>
+                  <pic:spPr bwMode="auto">
+                    <a:xfrm>
+                      <a:off x="0" y="0"/>
+                      <a:ext cx="5715000" cy="3838575"/>
+                    </a:xfrm>
+                    <a:prstGeom prst="rect">
+                      <a:avLst/>
+                    </a:prstGeom>
+                  </pic:spPr>
+                </pic:pic>
+              </a:graphicData>
+            </a:graphic>
+          </wp:inline>
+        </w:drawing>
+      </w:r>
+    </w:p>
+    <w:p>
+      <w:pPr>
+        <w:spacing w:after="200"/>
+        <w:jc w:val="center"/>
+      </w:pPr>
+      <w:r>
+        <w:rPr>
+          <w:i/>
+          <w:iCs/>
+          <w:color w:val="6B7280"/>
+          <w:sz w:val="16"/>
+          <w:szCs w:val="16"/>
+        </w:rPr>
+        <w:t xml:space="preserve">Figure 5.8 — Network Mapping (live tool): drag-and-drop organisation chart for a selected substation.</w:t>
+      </w:r>
+    </w:p>
+    <w:p>
+      <w:pPr>
+        <w:spacing w:after="40" w:before="160"/>
+        <w:jc w:val="center"/>
+      </w:pPr>
+      <w:r>
+        <w:drawing>
+          <wp:inline distT="0" distB="0" distL="0" distR="0">
+            <wp:extent cx="5715000" cy="2028825"/>
+            <wp:effectExtent t="0" r="0" b="0" l="0"/>
+            <wp:docPr id="1" name="" descr="" title=""/>
+            <wp:cNvGraphicFramePr>
+              <a:graphicFrameLocks xmlns:a="http://schemas.openxmlformats.org/drawingml/2006/main" noChangeAspect="1"/>
+            </wp:cNvGraphicFramePr>
+            <a:graphic xmlns:a="http://schemas.openxmlformats.org/drawingml/2006/main">
+              <a:graphicData uri="http://schemas.openxmlformats.org/drawingml/2006/picture">
+                <pic:pic xmlns:pic="http://schemas.openxmlformats.org/drawingml/2006/picture">
+                  <pic:nvPicPr>
+                    <pic:cNvPr id="0" name="" descr=""/>
+                    <pic:cNvPicPr>
+                      <a:picLocks noChangeAspect="1" noChangeArrowheads="1"/>
+                    </pic:cNvPicPr>
+                  </pic:nvPicPr>
+                  <pic:blipFill>
+                    <a:blip r:embed="rId14" cstate="none"/>
+                    <a:srcRect/>
+                    <a:stretch>
+                      <a:fillRect/>
+                    </a:stretch>
+                  </pic:blipFill>
+                  <pic:spPr bwMode="auto">
+                    <a:xfrm>
+                      <a:off x="0" y="0"/>
+                      <a:ext cx="5715000" cy="2028825"/>
+                    </a:xfrm>
+                    <a:prstGeom prst="rect">
+                      <a:avLst/>
+                    </a:prstGeom>
+                  </pic:spPr>
+                </pic:pic>
+              </a:graphicData>
+            </a:graphic>
+          </wp:inline>
+        </w:drawing>
+      </w:r>
+    </w:p>
+    <w:p>
+      <w:pPr>
+        <w:spacing w:after="200"/>
+        <w:jc w:val="center"/>
+      </w:pPr>
+      <w:r>
+        <w:rPr>
+          <w:i/>
+          <w:iCs/>
+          <w:color w:val="6B7280"/>
+          <w:sz w:val="16"/>
+          <w:szCs w:val="16"/>
+        </w:rPr>
+        <w:t xml:space="preserve">Figure 5.6 — Creating a meter cluster</w:t>
+      </w:r>
+    </w:p>
+    <w:p>
+      <w:pPr>
+        <w:spacing w:after="40" w:before="160"/>
+        <w:jc w:val="center"/>
+      </w:pPr>
+      <w:r>
+        <w:drawing>
+          <wp:inline distT="0" distB="0" distL="0" distR="0">
+            <wp:extent cx="5715000" cy="3838575"/>
+            <wp:effectExtent t="0" r="0" b="0" l="0"/>
+            <wp:docPr id="1" name="" descr="" title=""/>
+            <wp:cNvGraphicFramePr>
+              <a:graphicFrameLocks xmlns:a="http://schemas.openxmlformats.org/drawingml/2006/main" noChangeAspect="1"/>
+            </wp:cNvGraphicFramePr>
+            <a:graphic xmlns:a="http://schemas.openxmlformats.org/drawingml/2006/main">
+              <a:graphicData uri="http://schemas.openxmlformats.org/drawingml/2006/picture">
+                <pic:pic xmlns:pic="http://schemas.openxmlformats.org/drawingml/2006/picture">
+                  <pic:nvPicPr>
+                    <pic:cNvPr id="0" name="" descr=""/>
+                    <pic:cNvPicPr>
+                      <a:picLocks noChangeAspect="1" noChangeArrowheads="1"/>
+                    </pic:cNvPicPr>
+                  </pic:nvPicPr>
+                  <pic:blipFill>
+                    <a:blip r:embed="rId15" cstate="none"/>
+                    <a:srcRect/>
+                    <a:stretch>
+                      <a:fillRect/>
+                    </a:stretch>
+                  </pic:blipFill>
+                  <pic:spPr bwMode="auto">
+                    <a:xfrm>
+                      <a:off x="0" y="0"/>
+                      <a:ext cx="5715000" cy="3838575"/>
+                    </a:xfrm>
+                    <a:prstGeom prst="rect">
+                      <a:avLst/>
+                    </a:prstGeom>
+                  </pic:spPr>
+                </pic:pic>
+              </a:graphicData>
+            </a:graphic>
+          </wp:inline>
+        </w:drawing>
+      </w:r>
+    </w:p>
+    <w:p>
+      <w:pPr>
+        <w:spacing w:after="200"/>
+        <w:jc w:val="center"/>
+      </w:pPr>
+      <w:r>
+        <w:rPr>
+          <w:i/>
+          <w:iCs/>
+          <w:color w:val="6B7280"/>
+          <w:sz w:val="16"/>
+          <w:szCs w:val="16"/>
+        </w:rPr>
+        <w:t xml:space="preserve">Figure 5.9 — Network Mapping (live tool): two meters grouped into a meter cluster, with one-click Ungroup to reverse the grouping.</w:t>
       </w:r>
     </w:p>
     <w:p>
@@ -1771,6 +2398,130 @@
     </w:p>
     <w:p>
       <w:pPr>
+        <w:spacing w:after="40" w:before="160"/>
+        <w:jc w:val="center"/>
+      </w:pPr>
+      <w:r>
+        <w:drawing>
+          <wp:inline distT="0" distB="0" distL="0" distR="0">
+            <wp:extent cx="5715000" cy="2609850"/>
+            <wp:effectExtent t="0" r="0" b="0" l="0"/>
+            <wp:docPr id="1" name="" descr="" title=""/>
+            <wp:cNvGraphicFramePr>
+              <a:graphicFrameLocks xmlns:a="http://schemas.openxmlformats.org/drawingml/2006/main" noChangeAspect="1"/>
+            </wp:cNvGraphicFramePr>
+            <a:graphic xmlns:a="http://schemas.openxmlformats.org/drawingml/2006/main">
+              <a:graphicData uri="http://schemas.openxmlformats.org/drawingml/2006/picture">
+                <pic:pic xmlns:pic="http://schemas.openxmlformats.org/drawingml/2006/picture">
+                  <pic:nvPicPr>
+                    <pic:cNvPr id="0" name="" descr=""/>
+                    <pic:cNvPicPr>
+                      <a:picLocks noChangeAspect="1" noChangeArrowheads="1"/>
+                    </pic:cNvPicPr>
+                  </pic:nvPicPr>
+                  <pic:blipFill>
+                    <a:blip r:embed="rId16" cstate="none"/>
+                    <a:srcRect/>
+                    <a:stretch>
+                      <a:fillRect/>
+                    </a:stretch>
+                  </pic:blipFill>
+                  <pic:spPr bwMode="auto">
+                    <a:xfrm>
+                      <a:off x="0" y="0"/>
+                      <a:ext cx="5715000" cy="2609850"/>
+                    </a:xfrm>
+                    <a:prstGeom prst="rect">
+                      <a:avLst/>
+                    </a:prstGeom>
+                  </pic:spPr>
+                </pic:pic>
+              </a:graphicData>
+            </a:graphic>
+          </wp:inline>
+        </w:drawing>
+      </w:r>
+    </w:p>
+    <w:p>
+      <w:pPr>
+        <w:spacing w:after="200"/>
+        <w:jc w:val="center"/>
+      </w:pPr>
+      <w:r>
+        <w:rPr>
+          <w:i/>
+          <w:iCs/>
+          <w:color w:val="6B7280"/>
+          <w:sz w:val="16"/>
+          <w:szCs w:val="16"/>
+        </w:rPr>
+        <w:t xml:space="preserve">Figure 6.1 — Delivery roadmap</w:t>
+      </w:r>
+    </w:p>
+    <w:p>
+      <w:pPr>
+        <w:spacing w:after="40" w:before="160"/>
+        <w:jc w:val="center"/>
+      </w:pPr>
+      <w:r>
+        <w:drawing>
+          <wp:inline distT="0" distB="0" distL="0" distR="0">
+            <wp:extent cx="5715000" cy="1819275"/>
+            <wp:effectExtent t="0" r="0" b="0" l="0"/>
+            <wp:docPr id="1" name="" descr="" title=""/>
+            <wp:cNvGraphicFramePr>
+              <a:graphicFrameLocks xmlns:a="http://schemas.openxmlformats.org/drawingml/2006/main" noChangeAspect="1"/>
+            </wp:cNvGraphicFramePr>
+            <a:graphic xmlns:a="http://schemas.openxmlformats.org/drawingml/2006/main">
+              <a:graphicData uri="http://schemas.openxmlformats.org/drawingml/2006/picture">
+                <pic:pic xmlns:pic="http://schemas.openxmlformats.org/drawingml/2006/picture">
+                  <pic:nvPicPr>
+                    <pic:cNvPr id="0" name="" descr=""/>
+                    <pic:cNvPicPr>
+                      <a:picLocks noChangeAspect="1" noChangeArrowheads="1"/>
+                    </pic:cNvPicPr>
+                  </pic:nvPicPr>
+                  <pic:blipFill>
+                    <a:blip r:embed="rId17" cstate="none"/>
+                    <a:srcRect/>
+                    <a:stretch>
+                      <a:fillRect/>
+                    </a:stretch>
+                  </pic:blipFill>
+                  <pic:spPr bwMode="auto">
+                    <a:xfrm>
+                      <a:off x="0" y="0"/>
+                      <a:ext cx="5715000" cy="1819275"/>
+                    </a:xfrm>
+                    <a:prstGeom prst="rect">
+                      <a:avLst/>
+                    </a:prstGeom>
+                  </pic:spPr>
+                </pic:pic>
+              </a:graphicData>
+            </a:graphic>
+          </wp:inline>
+        </w:drawing>
+      </w:r>
+    </w:p>
+    <w:p>
+      <w:pPr>
+        <w:spacing w:after="200"/>
+        <w:jc w:val="center"/>
+      </w:pPr>
+      <w:r>
+        <w:rPr>
+          <w:i/>
+          <w:iCs/>
+          <w:color w:val="6B7280"/>
+          <w:sz w:val="16"/>
+          <w:szCs w:val="16"/>
+        </w:rPr>
+        <w:t xml:space="preserve">Figure 6.2 — Sprint cycle</w:t>
+      </w:r>
+    </w:p>
+    <w:p>
+      <w:pPr>
         <w:spacing w:after="80" w:before="160"/>
       </w:pPr>
       <w:r>
@@ -2329,6 +3080,68 @@
         </w:tc>
       </w:tr>
     </w:tbl>
+    <w:p>
+      <w:pPr>
+        <w:spacing w:after="40" w:before="160"/>
+        <w:jc w:val="center"/>
+      </w:pPr>
+      <w:r>
+        <w:drawing>
+          <wp:inline distT="0" distB="0" distL="0" distR="0">
+            <wp:extent cx="5715000" cy="2552700"/>
+            <wp:effectExtent t="0" r="0" b="0" l="0"/>
+            <wp:docPr id="1" name="" descr="" title=""/>
+            <wp:cNvGraphicFramePr>
+              <a:graphicFrameLocks xmlns:a="http://schemas.openxmlformats.org/drawingml/2006/main" noChangeAspect="1"/>
+            </wp:cNvGraphicFramePr>
+            <a:graphic xmlns:a="http://schemas.openxmlformats.org/drawingml/2006/main">
+              <a:graphicData uri="http://schemas.openxmlformats.org/drawingml/2006/picture">
+                <pic:pic xmlns:pic="http://schemas.openxmlformats.org/drawingml/2006/picture">
+                  <pic:nvPicPr>
+                    <pic:cNvPr id="0" name="" descr=""/>
+                    <pic:cNvPicPr>
+                      <a:picLocks noChangeAspect="1" noChangeArrowheads="1"/>
+                    </pic:cNvPicPr>
+                  </pic:nvPicPr>
+                  <pic:blipFill>
+                    <a:blip r:embed="rId18" cstate="none"/>
+                    <a:srcRect/>
+                    <a:stretch>
+                      <a:fillRect/>
+                    </a:stretch>
+                  </pic:blipFill>
+                  <pic:spPr bwMode="auto">
+                    <a:xfrm>
+                      <a:off x="0" y="0"/>
+                      <a:ext cx="5715000" cy="2552700"/>
+                    </a:xfrm>
+                    <a:prstGeom prst="rect">
+                      <a:avLst/>
+                    </a:prstGeom>
+                  </pic:spPr>
+                </pic:pic>
+              </a:graphicData>
+            </a:graphic>
+          </wp:inline>
+        </w:drawing>
+      </w:r>
+    </w:p>
+    <w:p>
+      <w:pPr>
+        <w:spacing w:after="200"/>
+        <w:jc w:val="center"/>
+      </w:pPr>
+      <w:r>
+        <w:rPr>
+          <w:i/>
+          <w:iCs/>
+          <w:color w:val="6B7280"/>
+          <w:sz w:val="16"/>
+          <w:szCs w:val="16"/>
+        </w:rPr>
+        <w:t xml:space="preserve">Figure 7.1 — Governance structure</w:t>
+      </w:r>
+    </w:p>
     <w:p>
       <w:pPr>
         <w:spacing w:after="80" w:before="160"/>

</xml_diff>

<commit_message>
Add costed commercial estimate to Section 17 (Annexure L-aligned cost model)
</commit_message>
<xml_diff>
--- a/public/downloads/T2-Technologies-FBM-Thabiso-Sections.docx
+++ b/public/downloads/T2-Technologies-FBM-Thabiso-Sections.docx
@@ -3345,7 +3345,925 @@
           <w:sz w:val="22"/>
           <w:szCs w:val="22"/>
         </w:rPr>
-        <w:t xml:space="preserve">Pricing must be completed strictly in the format prescribed by the tender. The following table can be used as an internal reconciliation schedule before values are transferred to the official pricing forms.</w:t>
+        <w:t xml:space="preserve">This section presents a fully costed commercial estimate aligned to the structure of the tender's Pricing Schedule (Annexure L): a software/subscription licence line, itemised implementation work-packages, a professional-services rate card, support &amp; maintenance, a five-year total cost of ownership and a milestone-based payment plan. All figures are in South African Rand and exclude VAT unless stated otherwise.</w:t>
+      </w:r>
+    </w:p>
+    <w:p>
+      <w:pPr>
+        <w:spacing w:after="140"/>
+      </w:pPr>
+      <w:r>
+        <w:rPr>
+          <w:color w:val="1F2937"/>
+          <w:sz w:val="22"/>
+          <w:szCs w:val="22"/>
+        </w:rPr>
+        <w:t xml:space="preserve">The estimate assumes an 18-month implementation of the business requirements followed by managed support &amp; maintenance to the five-year (60-month) mark, delivered by a standard blended team of approximately 8-10 resources. Every currency figure is derived from the rate card and the effort plan below, so the totals reconcile across all tables.</w:t>
+      </w:r>
+    </w:p>
+    <w:p>
+      <w:pPr>
+        <w:spacing w:after="140" w:before="140"/>
+      </w:pPr>
+      <w:r>
+        <w:rPr>
+          <w:i/>
+          <w:iCs/>
+          <w:color w:val="6B7280"/>
+          <w:sz w:val="20"/>
+          <w:szCs w:val="20"/>
+        </w:rPr>
+        <w:t xml:space="preserve">Commercial validity period, price escalation, retention, performance guarantees and any exchange-rate assumptions must still be completed exactly as required by the tender conditions before the figures are transferred to the official Annexure L pricing forms. All estimates are benchmark-based and subject to T2 Technologies' final review.</w:t>
+      </w:r>
+    </w:p>
+    <w:p>
+      <w:pPr>
+        <w:spacing w:after="80" w:before="160"/>
+      </w:pPr>
+      <w:r>
+        <w:rPr>
+          <w:b/>
+          <w:bCs/>
+          <w:color w:val="1F2937"/>
+          <w:sz w:val="24"/>
+          <w:szCs w:val="24"/>
+        </w:rPr>
+        <w:t xml:space="preserve">17.1 Pricing Basis and Assumptions</w:t>
+      </w:r>
+    </w:p>
+    <w:p>
+      <w:pPr>
+        <w:pStyle w:val="ListParagraph"/>
+        <w:numPr>
+          <w:ilvl w:val="0"/>
+          <w:numId w:val="1"/>
+        </w:numPr>
+        <w:spacing w:after="60"/>
+      </w:pPr>
+      <w:r>
+        <w:rPr>
+          <w:color w:val="1F2937"/>
+          <w:sz w:val="22"/>
+          <w:szCs w:val="22"/>
+        </w:rPr>
+        <w:t xml:space="preserve">All rates are South African enterprise-IT benchmark day-rates (2026) and must be confirmed against T2 Technologies' actual rate card before submission.</w:t>
+      </w:r>
+    </w:p>
+    <w:p>
+      <w:pPr>
+        <w:pStyle w:val="ListParagraph"/>
+        <w:numPr>
+          <w:ilvl w:val="0"/>
+          <w:numId w:val="1"/>
+        </w:numPr>
+        <w:spacing w:after="60"/>
+      </w:pPr>
+      <w:r>
+        <w:rPr>
+          <w:color w:val="1F2937"/>
+          <w:sz w:val="22"/>
+          <w:szCs w:val="22"/>
+        </w:rPr>
+        <w:t xml:space="preserve">Prices exclude VAT; VAT at 15% is shown separately in the five-year summary.</w:t>
+      </w:r>
+    </w:p>
+    <w:p>
+      <w:pPr>
+        <w:pStyle w:val="ListParagraph"/>
+        <w:numPr>
+          <w:ilvl w:val="0"/>
+          <w:numId w:val="1"/>
+        </w:numPr>
+        <w:spacing w:after="60"/>
+      </w:pPr>
+      <w:r>
+        <w:rPr>
+          <w:color w:val="1F2937"/>
+          <w:sz w:val="22"/>
+          <w:szCs w:val="22"/>
+        </w:rPr>
+        <w:t xml:space="preserve">Software is licensed as T2's proprietary SaaS platform on a named-user basis: 20 users at R 3 000 per user per month.</w:t>
+      </w:r>
+    </w:p>
+    <w:p>
+      <w:pPr>
+        <w:pStyle w:val="ListParagraph"/>
+        <w:numPr>
+          <w:ilvl w:val="0"/>
+          <w:numId w:val="1"/>
+        </w:numPr>
+        <w:spacing w:after="60"/>
+      </w:pPr>
+      <w:r>
+        <w:rPr>
+          <w:color w:val="1F2937"/>
+          <w:sz w:val="22"/>
+          <w:szCs w:val="22"/>
+        </w:rPr>
+        <w:t xml:space="preserve">The implementation is a fixed-price engagement invoiced against the delivery milestones in 17.7; effort is shown for transparency and change-control.</w:t>
+      </w:r>
+    </w:p>
+    <w:p>
+      <w:pPr>
+        <w:pStyle w:val="ListParagraph"/>
+        <w:numPr>
+          <w:ilvl w:val="0"/>
+          <w:numId w:val="1"/>
+        </w:numPr>
+        <w:spacing w:after="60"/>
+      </w:pPr>
+      <w:r>
+        <w:rPr>
+          <w:color w:val="1F2937"/>
+          <w:sz w:val="22"/>
+          <w:szCs w:val="22"/>
+        </w:rPr>
+        <w:t xml:space="preserve">Support &amp; maintenance begins at production go-live (a three-month warranty is included in Stabilisation) and runs to the five-year mark.</w:t>
+      </w:r>
+    </w:p>
+    <w:p>
+      <w:pPr>
+        <w:pStyle w:val="ListParagraph"/>
+        <w:numPr>
+          <w:ilvl w:val="0"/>
+          <w:numId w:val="1"/>
+        </w:numPr>
+        <w:spacing w:after="60"/>
+      </w:pPr>
+      <w:r>
+        <w:rPr>
+          <w:color w:val="1F2937"/>
+          <w:sz w:val="22"/>
+          <w:szCs w:val="22"/>
+        </w:rPr>
+        <w:t xml:space="preserve">Third-party cloud/hosting, network connectivity, non-standard integrations, hardware and travel/disbursements outside Gauteng are excluded and quoted at cost on confirmation.</w:t>
+      </w:r>
+    </w:p>
+    <w:p>
+      <w:pPr>
+        <w:spacing w:after="80" w:before="160"/>
+      </w:pPr>
+      <w:r>
+        <w:rPr>
+          <w:b/>
+          <w:bCs/>
+          <w:color w:val="1F2937"/>
+          <w:sz w:val="24"/>
+          <w:szCs w:val="24"/>
+        </w:rPr>
+        <w:t xml:space="preserve">17.2 Software / Subscription Licence</w:t>
+      </w:r>
+    </w:p>
+    <w:tbl>
+      <w:tblPr>
+        <w:tblW w:type="pct" w:w="100%"/>
+        <w:tblBorders>
+          <w:top w:val="single" w:color="D1D5DB" w:sz="4"/>
+          <w:left w:val="single" w:color="D1D5DB" w:sz="4"/>
+          <w:bottom w:val="single" w:color="D1D5DB" w:sz="4"/>
+          <w:right w:val="single" w:color="D1D5DB" w:sz="4"/>
+          <w:insideH w:val="single" w:color="D1D5DB" w:sz="4"/>
+          <w:insideV w:val="single" w:color="D1D5DB" w:sz="4"/>
+        </w:tblBorders>
+      </w:tblPr>
+      <w:tblGrid>
+        <w:gridCol w:w="100"/>
+        <w:gridCol w:w="100"/>
+        <w:gridCol w:w="100"/>
+        <w:gridCol w:w="100"/>
+        <w:gridCol w:w="100"/>
+      </w:tblGrid>
+      <w:tr>
+        <w:trPr>
+          <w:tblHeader/>
+        </w:trPr>
+        <w:tc>
+          <w:tcPr>
+            <w:shd w:fill="004898" w:val="clear"/>
+            <w:tcMar>
+              <w:top w:type="dxa" w:w="60"/>
+              <w:left w:type="dxa" w:w="80"/>
+              <w:bottom w:type="dxa" w:w="60"/>
+              <w:right w:type="dxa" w:w="80"/>
+            </w:tcMar>
+          </w:tcPr>
+          <w:p>
+            <w:r>
+              <w:rPr>
+                <w:b/>
+                <w:bCs/>
+                <w:color w:val="FFFFFF"/>
+                <w:sz w:val="20"/>
+                <w:szCs w:val="20"/>
+              </w:rPr>
+              <w:t xml:space="preserve">Item</w:t>
+            </w:r>
+          </w:p>
+        </w:tc>
+        <w:tc>
+          <w:tcPr>
+            <w:shd w:fill="004898" w:val="clear"/>
+            <w:tcMar>
+              <w:top w:type="dxa" w:w="60"/>
+              <w:left w:type="dxa" w:w="80"/>
+              <w:bottom w:type="dxa" w:w="60"/>
+              <w:right w:type="dxa" w:w="80"/>
+            </w:tcMar>
+          </w:tcPr>
+          <w:p>
+            <w:r>
+              <w:rPr>
+                <w:b/>
+                <w:bCs/>
+                <w:color w:val="FFFFFF"/>
+                <w:sz w:val="20"/>
+                <w:szCs w:val="20"/>
+              </w:rPr>
+              <w:t xml:space="preserve">Qty</w:t>
+            </w:r>
+          </w:p>
+        </w:tc>
+        <w:tc>
+          <w:tcPr>
+            <w:shd w:fill="004898" w:val="clear"/>
+            <w:tcMar>
+              <w:top w:type="dxa" w:w="60"/>
+              <w:left w:type="dxa" w:w="80"/>
+              <w:bottom w:type="dxa" w:w="60"/>
+              <w:right w:type="dxa" w:w="80"/>
+            </w:tcMar>
+          </w:tcPr>
+          <w:p>
+            <w:r>
+              <w:rPr>
+                <w:b/>
+                <w:bCs/>
+                <w:color w:val="FFFFFF"/>
+                <w:sz w:val="20"/>
+                <w:szCs w:val="20"/>
+              </w:rPr>
+              <w:t xml:space="preserve">Unit Basis</w:t>
+            </w:r>
+          </w:p>
+        </w:tc>
+        <w:tc>
+          <w:tcPr>
+            <w:shd w:fill="004898" w:val="clear"/>
+            <w:tcMar>
+              <w:top w:type="dxa" w:w="60"/>
+              <w:left w:type="dxa" w:w="80"/>
+              <w:bottom w:type="dxa" w:w="60"/>
+              <w:right w:type="dxa" w:w="80"/>
+            </w:tcMar>
+          </w:tcPr>
+          <w:p>
+            <w:r>
+              <w:rPr>
+                <w:b/>
+                <w:bCs/>
+                <w:color w:val="FFFFFF"/>
+                <w:sz w:val="20"/>
+                <w:szCs w:val="20"/>
+              </w:rPr>
+              <w:t xml:space="preserve">Annual (excl. VAT)</w:t>
+            </w:r>
+          </w:p>
+        </w:tc>
+        <w:tc>
+          <w:tcPr>
+            <w:shd w:fill="004898" w:val="clear"/>
+            <w:tcMar>
+              <w:top w:type="dxa" w:w="60"/>
+              <w:left w:type="dxa" w:w="80"/>
+              <w:bottom w:type="dxa" w:w="60"/>
+              <w:right w:type="dxa" w:w="80"/>
+            </w:tcMar>
+          </w:tcPr>
+          <w:p>
+            <w:r>
+              <w:rPr>
+                <w:b/>
+                <w:bCs/>
+                <w:color w:val="FFFFFF"/>
+                <w:sz w:val="20"/>
+                <w:szCs w:val="20"/>
+              </w:rPr>
+              <w:t xml:space="preserve">5-Year (excl. VAT)</w:t>
+            </w:r>
+          </w:p>
+        </w:tc>
+      </w:tr>
+      <w:tr>
+        <w:tc>
+          <w:tcPr>
+            <w:tcMar>
+              <w:top w:type="dxa" w:w="50"/>
+              <w:left w:type="dxa" w:w="80"/>
+              <w:bottom w:type="dxa" w:w="50"/>
+              <w:right w:type="dxa" w:w="80"/>
+            </w:tcMar>
+          </w:tcPr>
+          <w:p>
+            <w:r>
+              <w:rPr>
+                <w:color w:val="1F2937"/>
+                <w:sz w:val="19"/>
+                <w:szCs w:val="19"/>
+              </w:rPr>
+              <w:t xml:space="preserve">T2 FBM SaaS — named-user licence</w:t>
+            </w:r>
+          </w:p>
+        </w:tc>
+        <w:tc>
+          <w:tcPr>
+            <w:tcMar>
+              <w:top w:type="dxa" w:w="50"/>
+              <w:left w:type="dxa" w:w="80"/>
+              <w:bottom w:type="dxa" w:w="50"/>
+              <w:right w:type="dxa" w:w="80"/>
+            </w:tcMar>
+          </w:tcPr>
+          <w:p>
+            <w:r>
+              <w:rPr>
+                <w:color w:val="1F2937"/>
+                <w:sz w:val="19"/>
+                <w:szCs w:val="19"/>
+              </w:rPr>
+              <w:t xml:space="preserve">20</w:t>
+            </w:r>
+          </w:p>
+        </w:tc>
+        <w:tc>
+          <w:tcPr>
+            <w:tcMar>
+              <w:top w:type="dxa" w:w="50"/>
+              <w:left w:type="dxa" w:w="80"/>
+              <w:bottom w:type="dxa" w:w="50"/>
+              <w:right w:type="dxa" w:w="80"/>
+            </w:tcMar>
+          </w:tcPr>
+          <w:p>
+            <w:r>
+              <w:rPr>
+                <w:color w:val="1F2937"/>
+                <w:sz w:val="19"/>
+                <w:szCs w:val="19"/>
+              </w:rPr>
+              <w:t xml:space="preserve">R 3 000 / user / month</w:t>
+            </w:r>
+          </w:p>
+        </w:tc>
+        <w:tc>
+          <w:tcPr>
+            <w:tcMar>
+              <w:top w:type="dxa" w:w="50"/>
+              <w:left w:type="dxa" w:w="80"/>
+              <w:bottom w:type="dxa" w:w="50"/>
+              <w:right w:type="dxa" w:w="80"/>
+            </w:tcMar>
+          </w:tcPr>
+          <w:p>
+            <w:r>
+              <w:rPr>
+                <w:color w:val="1F2937"/>
+                <w:sz w:val="19"/>
+                <w:szCs w:val="19"/>
+              </w:rPr>
+              <w:t xml:space="preserve">R 720 000</w:t>
+            </w:r>
+          </w:p>
+        </w:tc>
+        <w:tc>
+          <w:tcPr>
+            <w:tcMar>
+              <w:top w:type="dxa" w:w="50"/>
+              <w:left w:type="dxa" w:w="80"/>
+              <w:bottom w:type="dxa" w:w="50"/>
+              <w:right w:type="dxa" w:w="80"/>
+            </w:tcMar>
+          </w:tcPr>
+          <w:p>
+            <w:r>
+              <w:rPr>
+                <w:color w:val="1F2937"/>
+                <w:sz w:val="19"/>
+                <w:szCs w:val="19"/>
+              </w:rPr>
+              <w:t xml:space="preserve">R 3 600 000</w:t>
+            </w:r>
+          </w:p>
+        </w:tc>
+      </w:tr>
+    </w:tbl>
+    <w:p>
+      <w:pPr>
+        <w:spacing w:after="80" w:before="160"/>
+      </w:pPr>
+      <w:r>
+        <w:rPr>
+          <w:b/>
+          <w:bCs/>
+          <w:color w:val="1F2937"/>
+          <w:sz w:val="24"/>
+          <w:szCs w:val="24"/>
+        </w:rPr>
+        <w:t xml:space="preserve">17.3 Professional Services Rate Card</w:t>
+      </w:r>
+    </w:p>
+    <w:p>
+      <w:pPr>
+        <w:spacing w:after="120"/>
+      </w:pPr>
+      <w:r>
+        <w:rPr>
+          <w:color w:val="1F2937"/>
+          <w:sz w:val="22"/>
+          <w:szCs w:val="22"/>
+        </w:rPr>
+        <w:t xml:space="preserve">The following blended day-rates underpin the implementation and support pricing.</w:t>
+      </w:r>
+    </w:p>
+    <w:tbl>
+      <w:tblPr>
+        <w:tblW w:type="pct" w:w="100%"/>
+        <w:tblBorders>
+          <w:top w:val="single" w:color="D1D5DB" w:sz="4"/>
+          <w:left w:val="single" w:color="D1D5DB" w:sz="4"/>
+          <w:bottom w:val="single" w:color="D1D5DB" w:sz="4"/>
+          <w:right w:val="single" w:color="D1D5DB" w:sz="4"/>
+          <w:insideH w:val="single" w:color="D1D5DB" w:sz="4"/>
+          <w:insideV w:val="single" w:color="D1D5DB" w:sz="4"/>
+        </w:tblBorders>
+      </w:tblPr>
+      <w:tblGrid>
+        <w:gridCol w:w="100"/>
+        <w:gridCol w:w="100"/>
+      </w:tblGrid>
+      <w:tr>
+        <w:trPr>
+          <w:tblHeader/>
+        </w:trPr>
+        <w:tc>
+          <w:tcPr>
+            <w:shd w:fill="004898" w:val="clear"/>
+            <w:tcMar>
+              <w:top w:type="dxa" w:w="60"/>
+              <w:left w:type="dxa" w:w="80"/>
+              <w:bottom w:type="dxa" w:w="60"/>
+              <w:right w:type="dxa" w:w="80"/>
+            </w:tcMar>
+          </w:tcPr>
+          <w:p>
+            <w:r>
+              <w:rPr>
+                <w:b/>
+                <w:bCs/>
+                <w:color w:val="FFFFFF"/>
+                <w:sz w:val="20"/>
+                <w:szCs w:val="20"/>
+              </w:rPr>
+              <w:t xml:space="preserve">Role</w:t>
+            </w:r>
+          </w:p>
+        </w:tc>
+        <w:tc>
+          <w:tcPr>
+            <w:shd w:fill="004898" w:val="clear"/>
+            <w:tcMar>
+              <w:top w:type="dxa" w:w="60"/>
+              <w:left w:type="dxa" w:w="80"/>
+              <w:bottom w:type="dxa" w:w="60"/>
+              <w:right w:type="dxa" w:w="80"/>
+            </w:tcMar>
+          </w:tcPr>
+          <w:p>
+            <w:r>
+              <w:rPr>
+                <w:b/>
+                <w:bCs/>
+                <w:color w:val="FFFFFF"/>
+                <w:sz w:val="20"/>
+                <w:szCs w:val="20"/>
+              </w:rPr>
+              <w:t xml:space="preserve">Day Rate (excl. VAT)</w:t>
+            </w:r>
+          </w:p>
+        </w:tc>
+      </w:tr>
+      <w:tr>
+        <w:tc>
+          <w:tcPr>
+            <w:tcMar>
+              <w:top w:type="dxa" w:w="50"/>
+              <w:left w:type="dxa" w:w="80"/>
+              <w:bottom w:type="dxa" w:w="50"/>
+              <w:right w:type="dxa" w:w="80"/>
+            </w:tcMar>
+          </w:tcPr>
+          <w:p>
+            <w:r>
+              <w:rPr>
+                <w:color w:val="1F2937"/>
+                <w:sz w:val="19"/>
+                <w:szCs w:val="19"/>
+              </w:rPr>
+              <w:t xml:space="preserve">Programme / Project Manager</w:t>
+            </w:r>
+          </w:p>
+        </w:tc>
+        <w:tc>
+          <w:tcPr>
+            <w:tcMar>
+              <w:top w:type="dxa" w:w="50"/>
+              <w:left w:type="dxa" w:w="80"/>
+              <w:bottom w:type="dxa" w:w="50"/>
+              <w:right w:type="dxa" w:w="80"/>
+            </w:tcMar>
+          </w:tcPr>
+          <w:p>
+            <w:r>
+              <w:rPr>
+                <w:color w:val="1F2937"/>
+                <w:sz w:val="19"/>
+                <w:szCs w:val="19"/>
+              </w:rPr>
+              <w:t xml:space="preserve">R 9 800</w:t>
+            </w:r>
+          </w:p>
+        </w:tc>
+      </w:tr>
+      <w:tr>
+        <w:tc>
+          <w:tcPr>
+            <w:shd w:fill="F3F4F6" w:val="clear"/>
+            <w:tcMar>
+              <w:top w:type="dxa" w:w="50"/>
+              <w:left w:type="dxa" w:w="80"/>
+              <w:bottom w:type="dxa" w:w="50"/>
+              <w:right w:type="dxa" w:w="80"/>
+            </w:tcMar>
+          </w:tcPr>
+          <w:p>
+            <w:r>
+              <w:rPr>
+                <w:color w:val="1F2937"/>
+                <w:sz w:val="19"/>
+                <w:szCs w:val="19"/>
+              </w:rPr>
+              <w:t xml:space="preserve">Solution Architect</w:t>
+            </w:r>
+          </w:p>
+        </w:tc>
+        <w:tc>
+          <w:tcPr>
+            <w:shd w:fill="F3F4F6" w:val="clear"/>
+            <w:tcMar>
+              <w:top w:type="dxa" w:w="50"/>
+              <w:left w:type="dxa" w:w="80"/>
+              <w:bottom w:type="dxa" w:w="50"/>
+              <w:right w:type="dxa" w:w="80"/>
+            </w:tcMar>
+          </w:tcPr>
+          <w:p>
+            <w:r>
+              <w:rPr>
+                <w:color w:val="1F2937"/>
+                <w:sz w:val="19"/>
+                <w:szCs w:val="19"/>
+              </w:rPr>
+              <w:t xml:space="preserve">R 12 500</w:t>
+            </w:r>
+          </w:p>
+        </w:tc>
+      </w:tr>
+      <w:tr>
+        <w:tc>
+          <w:tcPr>
+            <w:tcMar>
+              <w:top w:type="dxa" w:w="50"/>
+              <w:left w:type="dxa" w:w="80"/>
+              <w:bottom w:type="dxa" w:w="50"/>
+              <w:right w:type="dxa" w:w="80"/>
+            </w:tcMar>
+          </w:tcPr>
+          <w:p>
+            <w:r>
+              <w:rPr>
+                <w:color w:val="1F2937"/>
+                <w:sz w:val="19"/>
+                <w:szCs w:val="19"/>
+              </w:rPr>
+              <w:t xml:space="preserve">Business Analyst</w:t>
+            </w:r>
+          </w:p>
+        </w:tc>
+        <w:tc>
+          <w:tcPr>
+            <w:tcMar>
+              <w:top w:type="dxa" w:w="50"/>
+              <w:left w:type="dxa" w:w="80"/>
+              <w:bottom w:type="dxa" w:w="50"/>
+              <w:right w:type="dxa" w:w="80"/>
+            </w:tcMar>
+          </w:tcPr>
+          <w:p>
+            <w:r>
+              <w:rPr>
+                <w:color w:val="1F2937"/>
+                <w:sz w:val="19"/>
+                <w:szCs w:val="19"/>
+              </w:rPr>
+              <w:t xml:space="preserve">R 8 200</w:t>
+            </w:r>
+          </w:p>
+        </w:tc>
+      </w:tr>
+      <w:tr>
+        <w:tc>
+          <w:tcPr>
+            <w:shd w:fill="F3F4F6" w:val="clear"/>
+            <w:tcMar>
+              <w:top w:type="dxa" w:w="50"/>
+              <w:left w:type="dxa" w:w="80"/>
+              <w:bottom w:type="dxa" w:w="50"/>
+              <w:right w:type="dxa" w:w="80"/>
+            </w:tcMar>
+          </w:tcPr>
+          <w:p>
+            <w:r>
+              <w:rPr>
+                <w:color w:val="1F2937"/>
+                <w:sz w:val="19"/>
+                <w:szCs w:val="19"/>
+              </w:rPr>
+              <w:t xml:space="preserve">Senior Software Engineer</w:t>
+            </w:r>
+          </w:p>
+        </w:tc>
+        <w:tc>
+          <w:tcPr>
+            <w:shd w:fill="F3F4F6" w:val="clear"/>
+            <w:tcMar>
+              <w:top w:type="dxa" w:w="50"/>
+              <w:left w:type="dxa" w:w="80"/>
+              <w:bottom w:type="dxa" w:w="50"/>
+              <w:right w:type="dxa" w:w="80"/>
+            </w:tcMar>
+          </w:tcPr>
+          <w:p>
+            <w:r>
+              <w:rPr>
+                <w:color w:val="1F2937"/>
+                <w:sz w:val="19"/>
+                <w:szCs w:val="19"/>
+              </w:rPr>
+              <w:t xml:space="preserve">R 9 500</w:t>
+            </w:r>
+          </w:p>
+        </w:tc>
+      </w:tr>
+      <w:tr>
+        <w:tc>
+          <w:tcPr>
+            <w:tcMar>
+              <w:top w:type="dxa" w:w="50"/>
+              <w:left w:type="dxa" w:w="80"/>
+              <w:bottom w:type="dxa" w:w="50"/>
+              <w:right w:type="dxa" w:w="80"/>
+            </w:tcMar>
+          </w:tcPr>
+          <w:p>
+            <w:r>
+              <w:rPr>
+                <w:color w:val="1F2937"/>
+                <w:sz w:val="19"/>
+                <w:szCs w:val="19"/>
+              </w:rPr>
+              <w:t xml:space="preserve">Software Engineer</w:t>
+            </w:r>
+          </w:p>
+        </w:tc>
+        <w:tc>
+          <w:tcPr>
+            <w:tcMar>
+              <w:top w:type="dxa" w:w="50"/>
+              <w:left w:type="dxa" w:w="80"/>
+              <w:bottom w:type="dxa" w:w="50"/>
+              <w:right w:type="dxa" w:w="80"/>
+            </w:tcMar>
+          </w:tcPr>
+          <w:p>
+            <w:r>
+              <w:rPr>
+                <w:color w:val="1F2937"/>
+                <w:sz w:val="19"/>
+                <w:szCs w:val="19"/>
+              </w:rPr>
+              <w:t xml:space="preserve">R 6 800</w:t>
+            </w:r>
+          </w:p>
+        </w:tc>
+      </w:tr>
+      <w:tr>
+        <w:tc>
+          <w:tcPr>
+            <w:shd w:fill="F3F4F6" w:val="clear"/>
+            <w:tcMar>
+              <w:top w:type="dxa" w:w="50"/>
+              <w:left w:type="dxa" w:w="80"/>
+              <w:bottom w:type="dxa" w:w="50"/>
+              <w:right w:type="dxa" w:w="80"/>
+            </w:tcMar>
+          </w:tcPr>
+          <w:p>
+            <w:r>
+              <w:rPr>
+                <w:color w:val="1F2937"/>
+                <w:sz w:val="19"/>
+                <w:szCs w:val="19"/>
+              </w:rPr>
+              <w:t xml:space="preserve">QA / Test Analyst</w:t>
+            </w:r>
+          </w:p>
+        </w:tc>
+        <w:tc>
+          <w:tcPr>
+            <w:shd w:fill="F3F4F6" w:val="clear"/>
+            <w:tcMar>
+              <w:top w:type="dxa" w:w="50"/>
+              <w:left w:type="dxa" w:w="80"/>
+              <w:bottom w:type="dxa" w:w="50"/>
+              <w:right w:type="dxa" w:w="80"/>
+            </w:tcMar>
+          </w:tcPr>
+          <w:p>
+            <w:r>
+              <w:rPr>
+                <w:color w:val="1F2937"/>
+                <w:sz w:val="19"/>
+                <w:szCs w:val="19"/>
+              </w:rPr>
+              <w:t xml:space="preserve">R 6 200</w:t>
+            </w:r>
+          </w:p>
+        </w:tc>
+      </w:tr>
+      <w:tr>
+        <w:tc>
+          <w:tcPr>
+            <w:tcMar>
+              <w:top w:type="dxa" w:w="50"/>
+              <w:left w:type="dxa" w:w="80"/>
+              <w:bottom w:type="dxa" w:w="50"/>
+              <w:right w:type="dxa" w:w="80"/>
+            </w:tcMar>
+          </w:tcPr>
+          <w:p>
+            <w:r>
+              <w:rPr>
+                <w:color w:val="1F2937"/>
+                <w:sz w:val="19"/>
+                <w:szCs w:val="19"/>
+              </w:rPr>
+              <w:t xml:space="preserve">Data Migration Specialist</w:t>
+            </w:r>
+          </w:p>
+        </w:tc>
+        <w:tc>
+          <w:tcPr>
+            <w:tcMar>
+              <w:top w:type="dxa" w:w="50"/>
+              <w:left w:type="dxa" w:w="80"/>
+              <w:bottom w:type="dxa" w:w="50"/>
+              <w:right w:type="dxa" w:w="80"/>
+            </w:tcMar>
+          </w:tcPr>
+          <w:p>
+            <w:r>
+              <w:rPr>
+                <w:color w:val="1F2937"/>
+                <w:sz w:val="19"/>
+                <w:szCs w:val="19"/>
+              </w:rPr>
+              <w:t xml:space="preserve">R 8 500</w:t>
+            </w:r>
+          </w:p>
+        </w:tc>
+      </w:tr>
+      <w:tr>
+        <w:tc>
+          <w:tcPr>
+            <w:shd w:fill="F3F4F6" w:val="clear"/>
+            <w:tcMar>
+              <w:top w:type="dxa" w:w="50"/>
+              <w:left w:type="dxa" w:w="80"/>
+              <w:bottom w:type="dxa" w:w="50"/>
+              <w:right w:type="dxa" w:w="80"/>
+            </w:tcMar>
+          </w:tcPr>
+          <w:p>
+            <w:r>
+              <w:rPr>
+                <w:color w:val="1F2937"/>
+                <w:sz w:val="19"/>
+                <w:szCs w:val="19"/>
+              </w:rPr>
+              <w:t xml:space="preserve">DevOps / Cloud Engineer</w:t>
+            </w:r>
+          </w:p>
+        </w:tc>
+        <w:tc>
+          <w:tcPr>
+            <w:shd w:fill="F3F4F6" w:val="clear"/>
+            <w:tcMar>
+              <w:top w:type="dxa" w:w="50"/>
+              <w:left w:type="dxa" w:w="80"/>
+              <w:bottom w:type="dxa" w:w="50"/>
+              <w:right w:type="dxa" w:w="80"/>
+            </w:tcMar>
+          </w:tcPr>
+          <w:p>
+            <w:r>
+              <w:rPr>
+                <w:color w:val="1F2937"/>
+                <w:sz w:val="19"/>
+                <w:szCs w:val="19"/>
+              </w:rPr>
+              <w:t xml:space="preserve">R 9 200</w:t>
+            </w:r>
+          </w:p>
+        </w:tc>
+      </w:tr>
+      <w:tr>
+        <w:tc>
+          <w:tcPr>
+            <w:tcMar>
+              <w:top w:type="dxa" w:w="50"/>
+              <w:left w:type="dxa" w:w="80"/>
+              <w:bottom w:type="dxa" w:w="50"/>
+              <w:right w:type="dxa" w:w="80"/>
+            </w:tcMar>
+          </w:tcPr>
+          <w:p>
+            <w:r>
+              <w:rPr>
+                <w:color w:val="1F2937"/>
+                <w:sz w:val="19"/>
+                <w:szCs w:val="19"/>
+              </w:rPr>
+              <w:t xml:space="preserve">Change &amp; Training Specialist</w:t>
+            </w:r>
+          </w:p>
+        </w:tc>
+        <w:tc>
+          <w:tcPr>
+            <w:tcMar>
+              <w:top w:type="dxa" w:w="50"/>
+              <w:left w:type="dxa" w:w="80"/>
+              <w:bottom w:type="dxa" w:w="50"/>
+              <w:right w:type="dxa" w:w="80"/>
+            </w:tcMar>
+          </w:tcPr>
+          <w:p>
+            <w:r>
+              <w:rPr>
+                <w:color w:val="1F2937"/>
+                <w:sz w:val="19"/>
+                <w:szCs w:val="19"/>
+              </w:rPr>
+              <w:t xml:space="preserve">R 6 800</w:t>
+            </w:r>
+          </w:p>
+        </w:tc>
+      </w:tr>
+    </w:tbl>
+    <w:p>
+      <w:pPr>
+        <w:spacing w:after="80" w:before="160"/>
+      </w:pPr>
+      <w:r>
+        <w:rPr>
+          <w:b/>
+          <w:bCs/>
+          <w:color w:val="1F2937"/>
+          <w:sz w:val="24"/>
+          <w:szCs w:val="24"/>
+        </w:rPr>
+        <w:t xml:space="preserve">17.4 Implementation Work-Package Pricing</w:t>
+      </w:r>
+    </w:p>
+    <w:p>
+      <w:pPr>
+        <w:spacing w:after="120"/>
+      </w:pPr>
+      <w:r>
+        <w:rPr>
+          <w:color w:val="1F2937"/>
+          <w:sz w:val="22"/>
+          <w:szCs w:val="22"/>
+        </w:rPr>
+        <w:t xml:space="preserve">Fixed-price implementation broken down by the Annexure L work-packages, with indicative effort.</w:t>
       </w:r>
     </w:p>
     <w:tbl>
@@ -3389,7 +4307,7 @@
                 <w:sz w:val="20"/>
                 <w:szCs w:val="20"/>
               </w:rPr>
-              <w:t xml:space="preserve">Cost Component</w:t>
+              <w:t xml:space="preserve">Ref</w:t>
             </w:r>
           </w:p>
         </w:tc>
@@ -3412,7 +4330,7 @@
                 <w:sz w:val="20"/>
                 <w:szCs w:val="20"/>
               </w:rPr>
-              <w:t xml:space="preserve">Pricing Basis</w:t>
+              <w:t xml:space="preserve">Work Package</w:t>
             </w:r>
           </w:p>
         </w:tc>
@@ -3435,7 +4353,7 @@
                 <w:sz w:val="20"/>
                 <w:szCs w:val="20"/>
               </w:rPr>
-              <w:t xml:space="preserve">Amount (Excl. VAT)</w:t>
+              <w:t xml:space="preserve">Effort (p-days)</w:t>
             </w:r>
           </w:p>
         </w:tc>
@@ -3458,7 +4376,7 @@
                 <w:sz w:val="20"/>
                 <w:szCs w:val="20"/>
               </w:rPr>
-              <w:t xml:space="preserve">Notes</w:t>
+              <w:t xml:space="preserve">Price (excl. VAT)</w:t>
             </w:r>
           </w:p>
         </w:tc>
@@ -3480,67 +4398,67 @@
                 <w:sz w:val="19"/>
                 <w:szCs w:val="19"/>
               </w:rPr>
-              <w:t xml:space="preserve">Mobilisation &amp; Discovery</w:t>
-            </w:r>
-          </w:p>
-        </w:tc>
-        <w:tc>
-          <w:tcPr>
-            <w:tcMar>
-              <w:top w:type="dxa" w:w="50"/>
-              <w:left w:type="dxa" w:w="80"/>
-              <w:bottom w:type="dxa" w:w="50"/>
-              <w:right w:type="dxa" w:w="80"/>
-            </w:tcMar>
-          </w:tcPr>
-          <w:p>
-            <w:r>
-              <w:rPr>
-                <w:color w:val="1F2937"/>
-                <w:sz w:val="19"/>
-                <w:szCs w:val="19"/>
-              </w:rPr>
-              <w:t xml:space="preserve">Fixed price / milestone</w:t>
-            </w:r>
-          </w:p>
-        </w:tc>
-        <w:tc>
-          <w:tcPr>
-            <w:tcMar>
-              <w:top w:type="dxa" w:w="50"/>
-              <w:left w:type="dxa" w:w="80"/>
-              <w:bottom w:type="dxa" w:w="50"/>
-              <w:right w:type="dxa" w:w="80"/>
-            </w:tcMar>
-          </w:tcPr>
-          <w:p>
-            <w:r>
-              <w:rPr>
-                <w:color w:val="1F2937"/>
-                <w:sz w:val="19"/>
-                <w:szCs w:val="19"/>
-              </w:rPr>
-              <w:t xml:space="preserve">R [INSERT]</w:t>
-            </w:r>
-          </w:p>
-        </w:tc>
-        <w:tc>
-          <w:tcPr>
-            <w:tcMar>
-              <w:top w:type="dxa" w:w="50"/>
-              <w:left w:type="dxa" w:w="80"/>
-              <w:bottom w:type="dxa" w:w="50"/>
-              <w:right w:type="dxa" w:w="80"/>
-            </w:tcMar>
-          </w:tcPr>
-          <w:p>
-            <w:r>
-              <w:rPr>
-                <w:color w:val="1F2937"/>
-                <w:sz w:val="19"/>
-                <w:szCs w:val="19"/>
-              </w:rPr>
-              <w:t xml:space="preserve"/>
+              <w:t xml:space="preserve">WP1</w:t>
+            </w:r>
+          </w:p>
+        </w:tc>
+        <w:tc>
+          <w:tcPr>
+            <w:tcMar>
+              <w:top w:type="dxa" w:w="50"/>
+              <w:left w:type="dxa" w:w="80"/>
+              <w:bottom w:type="dxa" w:w="50"/>
+              <w:right w:type="dxa" w:w="80"/>
+            </w:tcMar>
+          </w:tcPr>
+          <w:p>
+            <w:r>
+              <w:rPr>
+                <w:color w:val="1F2937"/>
+                <w:sz w:val="19"/>
+                <w:szCs w:val="19"/>
+              </w:rPr>
+              <w:t xml:space="preserve">Business Process Analysis</w:t>
+            </w:r>
+          </w:p>
+        </w:tc>
+        <w:tc>
+          <w:tcPr>
+            <w:tcMar>
+              <w:top w:type="dxa" w:w="50"/>
+              <w:left w:type="dxa" w:w="80"/>
+              <w:bottom w:type="dxa" w:w="50"/>
+              <w:right w:type="dxa" w:w="80"/>
+            </w:tcMar>
+          </w:tcPr>
+          <w:p>
+            <w:r>
+              <w:rPr>
+                <w:color w:val="1F2937"/>
+                <w:sz w:val="19"/>
+                <w:szCs w:val="19"/>
+              </w:rPr>
+              <w:t xml:space="preserve">170</w:t>
+            </w:r>
+          </w:p>
+        </w:tc>
+        <w:tc>
+          <w:tcPr>
+            <w:tcMar>
+              <w:top w:type="dxa" w:w="50"/>
+              <w:left w:type="dxa" w:w="80"/>
+              <w:bottom w:type="dxa" w:w="50"/>
+              <w:right w:type="dxa" w:w="80"/>
+            </w:tcMar>
+          </w:tcPr>
+          <w:p>
+            <w:r>
+              <w:rPr>
+                <w:color w:val="1F2937"/>
+                <w:sz w:val="19"/>
+                <w:szCs w:val="19"/>
+              </w:rPr>
+              <w:t xml:space="preserve">R 1 555 000</w:t>
             </w:r>
           </w:p>
         </w:tc>
@@ -3563,70 +4481,70 @@
                 <w:sz w:val="19"/>
                 <w:szCs w:val="19"/>
               </w:rPr>
-              <w:t xml:space="preserve">Architecture &amp; Design</w:t>
-            </w:r>
-          </w:p>
-        </w:tc>
-        <w:tc>
-          <w:tcPr>
-            <w:shd w:fill="F3F4F6" w:val="clear"/>
-            <w:tcMar>
-              <w:top w:type="dxa" w:w="50"/>
-              <w:left w:type="dxa" w:w="80"/>
-              <w:bottom w:type="dxa" w:w="50"/>
-              <w:right w:type="dxa" w:w="80"/>
-            </w:tcMar>
-          </w:tcPr>
-          <w:p>
-            <w:r>
-              <w:rPr>
-                <w:color w:val="1F2937"/>
-                <w:sz w:val="19"/>
-                <w:szCs w:val="19"/>
-              </w:rPr>
-              <w:t xml:space="preserve">Fixed price / milestone</w:t>
-            </w:r>
-          </w:p>
-        </w:tc>
-        <w:tc>
-          <w:tcPr>
-            <w:shd w:fill="F3F4F6" w:val="clear"/>
-            <w:tcMar>
-              <w:top w:type="dxa" w:w="50"/>
-              <w:left w:type="dxa" w:w="80"/>
-              <w:bottom w:type="dxa" w:w="50"/>
-              <w:right w:type="dxa" w:w="80"/>
-            </w:tcMar>
-          </w:tcPr>
-          <w:p>
-            <w:r>
-              <w:rPr>
-                <w:color w:val="1F2937"/>
-                <w:sz w:val="19"/>
-                <w:szCs w:val="19"/>
-              </w:rPr>
-              <w:t xml:space="preserve">R [INSERT]</w:t>
-            </w:r>
-          </w:p>
-        </w:tc>
-        <w:tc>
-          <w:tcPr>
-            <w:shd w:fill="F3F4F6" w:val="clear"/>
-            <w:tcMar>
-              <w:top w:type="dxa" w:w="50"/>
-              <w:left w:type="dxa" w:w="80"/>
-              <w:bottom w:type="dxa" w:w="50"/>
-              <w:right w:type="dxa" w:w="80"/>
-            </w:tcMar>
-          </w:tcPr>
-          <w:p>
-            <w:r>
-              <w:rPr>
-                <w:color w:val="1F2937"/>
-                <w:sz w:val="19"/>
-                <w:szCs w:val="19"/>
-              </w:rPr>
-              <w:t xml:space="preserve"/>
+              <w:t xml:space="preserve">WP2</w:t>
+            </w:r>
+          </w:p>
+        </w:tc>
+        <w:tc>
+          <w:tcPr>
+            <w:shd w:fill="F3F4F6" w:val="clear"/>
+            <w:tcMar>
+              <w:top w:type="dxa" w:w="50"/>
+              <w:left w:type="dxa" w:w="80"/>
+              <w:bottom w:type="dxa" w:w="50"/>
+              <w:right w:type="dxa" w:w="80"/>
+            </w:tcMar>
+          </w:tcPr>
+          <w:p>
+            <w:r>
+              <w:rPr>
+                <w:color w:val="1F2937"/>
+                <w:sz w:val="19"/>
+                <w:szCs w:val="19"/>
+              </w:rPr>
+              <w:t xml:space="preserve">Solution Architecture &amp; Design</w:t>
+            </w:r>
+          </w:p>
+        </w:tc>
+        <w:tc>
+          <w:tcPr>
+            <w:shd w:fill="F3F4F6" w:val="clear"/>
+            <w:tcMar>
+              <w:top w:type="dxa" w:w="50"/>
+              <w:left w:type="dxa" w:w="80"/>
+              <w:bottom w:type="dxa" w:w="50"/>
+              <w:right w:type="dxa" w:w="80"/>
+            </w:tcMar>
+          </w:tcPr>
+          <w:p>
+            <w:r>
+              <w:rPr>
+                <w:color w:val="1F2937"/>
+                <w:sz w:val="19"/>
+                <w:szCs w:val="19"/>
+              </w:rPr>
+              <w:t xml:space="preserve">225</w:t>
+            </w:r>
+          </w:p>
+        </w:tc>
+        <w:tc>
+          <w:tcPr>
+            <w:shd w:fill="F3F4F6" w:val="clear"/>
+            <w:tcMar>
+              <w:top w:type="dxa" w:w="50"/>
+              <w:left w:type="dxa" w:w="80"/>
+              <w:bottom w:type="dxa" w:w="50"/>
+              <w:right w:type="dxa" w:w="80"/>
+            </w:tcMar>
+          </w:tcPr>
+          <w:p>
+            <w:r>
+              <w:rPr>
+                <w:color w:val="1F2937"/>
+                <w:sz w:val="19"/>
+                <w:szCs w:val="19"/>
+              </w:rPr>
+              <w:t xml:space="preserve">R 2 481 000</w:t>
             </w:r>
           </w:p>
         </w:tc>
@@ -3648,67 +4566,67 @@
                 <w:sz w:val="19"/>
                 <w:szCs w:val="19"/>
               </w:rPr>
-              <w:t xml:space="preserve">Application &amp; Integration Delivery</w:t>
-            </w:r>
-          </w:p>
-        </w:tc>
-        <w:tc>
-          <w:tcPr>
-            <w:tcMar>
-              <w:top w:type="dxa" w:w="50"/>
-              <w:left w:type="dxa" w:w="80"/>
-              <w:bottom w:type="dxa" w:w="50"/>
-              <w:right w:type="dxa" w:w="80"/>
-            </w:tcMar>
-          </w:tcPr>
-          <w:p>
-            <w:r>
-              <w:rPr>
-                <w:color w:val="1F2937"/>
-                <w:sz w:val="19"/>
-                <w:szCs w:val="19"/>
-              </w:rPr>
-              <w:t xml:space="preserve">Fixed / sprint / deliverable</w:t>
-            </w:r>
-          </w:p>
-        </w:tc>
-        <w:tc>
-          <w:tcPr>
-            <w:tcMar>
-              <w:top w:type="dxa" w:w="50"/>
-              <w:left w:type="dxa" w:w="80"/>
-              <w:bottom w:type="dxa" w:w="50"/>
-              <w:right w:type="dxa" w:w="80"/>
-            </w:tcMar>
-          </w:tcPr>
-          <w:p>
-            <w:r>
-              <w:rPr>
-                <w:color w:val="1F2937"/>
-                <w:sz w:val="19"/>
-                <w:szCs w:val="19"/>
-              </w:rPr>
-              <w:t xml:space="preserve">R [INSERT]</w:t>
-            </w:r>
-          </w:p>
-        </w:tc>
-        <w:tc>
-          <w:tcPr>
-            <w:tcMar>
-              <w:top w:type="dxa" w:w="50"/>
-              <w:left w:type="dxa" w:w="80"/>
-              <w:bottom w:type="dxa" w:w="50"/>
-              <w:right w:type="dxa" w:w="80"/>
-            </w:tcMar>
-          </w:tcPr>
-          <w:p>
-            <w:r>
-              <w:rPr>
-                <w:color w:val="1F2937"/>
-                <w:sz w:val="19"/>
-                <w:szCs w:val="19"/>
-              </w:rPr>
-              <w:t xml:space="preserve"/>
+              <w:t xml:space="preserve">WP3</w:t>
+            </w:r>
+          </w:p>
+        </w:tc>
+        <w:tc>
+          <w:tcPr>
+            <w:tcMar>
+              <w:top w:type="dxa" w:w="50"/>
+              <w:left w:type="dxa" w:w="80"/>
+              <w:bottom w:type="dxa" w:w="50"/>
+              <w:right w:type="dxa" w:w="80"/>
+            </w:tcMar>
+          </w:tcPr>
+          <w:p>
+            <w:r>
+              <w:rPr>
+                <w:color w:val="1F2937"/>
+                <w:sz w:val="19"/>
+                <w:szCs w:val="19"/>
+              </w:rPr>
+              <w:t xml:space="preserve">Build, Configure &amp; Test</w:t>
+            </w:r>
+          </w:p>
+        </w:tc>
+        <w:tc>
+          <w:tcPr>
+            <w:tcMar>
+              <w:top w:type="dxa" w:w="50"/>
+              <w:left w:type="dxa" w:w="80"/>
+              <w:bottom w:type="dxa" w:w="50"/>
+              <w:right w:type="dxa" w:w="80"/>
+            </w:tcMar>
+          </w:tcPr>
+          <w:p>
+            <w:r>
+              <w:rPr>
+                <w:color w:val="1F2937"/>
+                <w:sz w:val="19"/>
+                <w:szCs w:val="19"/>
+              </w:rPr>
+              <w:t xml:space="preserve">820</w:t>
+            </w:r>
+          </w:p>
+        </w:tc>
+        <w:tc>
+          <w:tcPr>
+            <w:tcMar>
+              <w:top w:type="dxa" w:w="50"/>
+              <w:left w:type="dxa" w:w="80"/>
+              <w:bottom w:type="dxa" w:w="50"/>
+              <w:right w:type="dxa" w:w="80"/>
+            </w:tcMar>
+          </w:tcPr>
+          <w:p>
+            <w:r>
+              <w:rPr>
+                <w:color w:val="1F2937"/>
+                <w:sz w:val="19"/>
+                <w:szCs w:val="19"/>
+              </w:rPr>
+              <w:t xml:space="preserve">R 6 238 000</w:t>
             </w:r>
           </w:p>
         </w:tc>
@@ -3731,70 +4649,70 @@
                 <w:sz w:val="19"/>
                 <w:szCs w:val="19"/>
               </w:rPr>
-              <w:t xml:space="preserve">Data &amp; Migration</w:t>
-            </w:r>
-          </w:p>
-        </w:tc>
-        <w:tc>
-          <w:tcPr>
-            <w:shd w:fill="F3F4F6" w:val="clear"/>
-            <w:tcMar>
-              <w:top w:type="dxa" w:w="50"/>
-              <w:left w:type="dxa" w:w="80"/>
-              <w:bottom w:type="dxa" w:w="50"/>
-              <w:right w:type="dxa" w:w="80"/>
-            </w:tcMar>
-          </w:tcPr>
-          <w:p>
-            <w:r>
-              <w:rPr>
-                <w:color w:val="1F2937"/>
-                <w:sz w:val="19"/>
-                <w:szCs w:val="19"/>
-              </w:rPr>
-              <w:t xml:space="preserve">Fixed / estimated volume</w:t>
-            </w:r>
-          </w:p>
-        </w:tc>
-        <w:tc>
-          <w:tcPr>
-            <w:shd w:fill="F3F4F6" w:val="clear"/>
-            <w:tcMar>
-              <w:top w:type="dxa" w:w="50"/>
-              <w:left w:type="dxa" w:w="80"/>
-              <w:bottom w:type="dxa" w:w="50"/>
-              <w:right w:type="dxa" w:w="80"/>
-            </w:tcMar>
-          </w:tcPr>
-          <w:p>
-            <w:r>
-              <w:rPr>
-                <w:color w:val="1F2937"/>
-                <w:sz w:val="19"/>
-                <w:szCs w:val="19"/>
-              </w:rPr>
-              <w:t xml:space="preserve">R [INSERT]</w:t>
-            </w:r>
-          </w:p>
-        </w:tc>
-        <w:tc>
-          <w:tcPr>
-            <w:shd w:fill="F3F4F6" w:val="clear"/>
-            <w:tcMar>
-              <w:top w:type="dxa" w:w="50"/>
-              <w:left w:type="dxa" w:w="80"/>
-              <w:bottom w:type="dxa" w:w="50"/>
-              <w:right w:type="dxa" w:w="80"/>
-            </w:tcMar>
-          </w:tcPr>
-          <w:p>
-            <w:r>
-              <w:rPr>
-                <w:color w:val="1F2937"/>
-                <w:sz w:val="19"/>
-                <w:szCs w:val="19"/>
-              </w:rPr>
-              <w:t xml:space="preserve"/>
+              <w:t xml:space="preserve">WP4</w:t>
+            </w:r>
+          </w:p>
+        </w:tc>
+        <w:tc>
+          <w:tcPr>
+            <w:shd w:fill="F3F4F6" w:val="clear"/>
+            <w:tcMar>
+              <w:top w:type="dxa" w:w="50"/>
+              <w:left w:type="dxa" w:w="80"/>
+              <w:bottom w:type="dxa" w:w="50"/>
+              <w:right w:type="dxa" w:w="80"/>
+            </w:tcMar>
+          </w:tcPr>
+          <w:p>
+            <w:r>
+              <w:rPr>
+                <w:color w:val="1F2937"/>
+                <w:sz w:val="19"/>
+                <w:szCs w:val="19"/>
+              </w:rPr>
+              <w:t xml:space="preserve">Data Migration</w:t>
+            </w:r>
+          </w:p>
+        </w:tc>
+        <w:tc>
+          <w:tcPr>
+            <w:shd w:fill="F3F4F6" w:val="clear"/>
+            <w:tcMar>
+              <w:top w:type="dxa" w:w="50"/>
+              <w:left w:type="dxa" w:w="80"/>
+              <w:bottom w:type="dxa" w:w="50"/>
+              <w:right w:type="dxa" w:w="80"/>
+            </w:tcMar>
+          </w:tcPr>
+          <w:p>
+            <w:r>
+              <w:rPr>
+                <w:color w:val="1F2937"/>
+                <w:sz w:val="19"/>
+                <w:szCs w:val="19"/>
+              </w:rPr>
+              <w:t xml:space="preserve">260</w:t>
+            </w:r>
+          </w:p>
+        </w:tc>
+        <w:tc>
+          <w:tcPr>
+            <w:shd w:fill="F3F4F6" w:val="clear"/>
+            <w:tcMar>
+              <w:top w:type="dxa" w:w="50"/>
+              <w:left w:type="dxa" w:w="80"/>
+              <w:bottom w:type="dxa" w:w="50"/>
+              <w:right w:type="dxa" w:w="80"/>
+            </w:tcMar>
+          </w:tcPr>
+          <w:p>
+            <w:r>
+              <w:rPr>
+                <w:color w:val="1F2937"/>
+                <w:sz w:val="19"/>
+                <w:szCs w:val="19"/>
+              </w:rPr>
+              <w:t xml:space="preserve">R 2 016 000</w:t>
             </w:r>
           </w:p>
         </w:tc>
@@ -3816,67 +4734,67 @@
                 <w:sz w:val="19"/>
                 <w:szCs w:val="19"/>
               </w:rPr>
-              <w:t xml:space="preserve">Cloud / DevOps Setup</w:t>
-            </w:r>
-          </w:p>
-        </w:tc>
-        <w:tc>
-          <w:tcPr>
-            <w:tcMar>
-              <w:top w:type="dxa" w:w="50"/>
-              <w:left w:type="dxa" w:w="80"/>
-              <w:bottom w:type="dxa" w:w="50"/>
-              <w:right w:type="dxa" w:w="80"/>
-            </w:tcMar>
-          </w:tcPr>
-          <w:p>
-            <w:r>
-              <w:rPr>
-                <w:color w:val="1F2937"/>
-                <w:sz w:val="19"/>
-                <w:szCs w:val="19"/>
-              </w:rPr>
-              <w:t xml:space="preserve">Fixed price</w:t>
-            </w:r>
-          </w:p>
-        </w:tc>
-        <w:tc>
-          <w:tcPr>
-            <w:tcMar>
-              <w:top w:type="dxa" w:w="50"/>
-              <w:left w:type="dxa" w:w="80"/>
-              <w:bottom w:type="dxa" w:w="50"/>
-              <w:right w:type="dxa" w:w="80"/>
-            </w:tcMar>
-          </w:tcPr>
-          <w:p>
-            <w:r>
-              <w:rPr>
-                <w:color w:val="1F2937"/>
-                <w:sz w:val="19"/>
-                <w:szCs w:val="19"/>
-              </w:rPr>
-              <w:t xml:space="preserve">R [INSERT]</w:t>
-            </w:r>
-          </w:p>
-        </w:tc>
-        <w:tc>
-          <w:tcPr>
-            <w:tcMar>
-              <w:top w:type="dxa" w:w="50"/>
-              <w:left w:type="dxa" w:w="80"/>
-              <w:bottom w:type="dxa" w:w="50"/>
-              <w:right w:type="dxa" w:w="80"/>
-            </w:tcMar>
-          </w:tcPr>
-          <w:p>
-            <w:r>
-              <w:rPr>
-                <w:color w:val="1F2937"/>
-                <w:sz w:val="19"/>
-                <w:szCs w:val="19"/>
-              </w:rPr>
-              <w:t xml:space="preserve">Third-party cloud fees separate unless included</w:t>
+              <w:t xml:space="preserve">WP5</w:t>
+            </w:r>
+          </w:p>
+        </w:tc>
+        <w:tc>
+          <w:tcPr>
+            <w:tcMar>
+              <w:top w:type="dxa" w:w="50"/>
+              <w:left w:type="dxa" w:w="80"/>
+              <w:bottom w:type="dxa" w:w="50"/>
+              <w:right w:type="dxa" w:w="80"/>
+            </w:tcMar>
+          </w:tcPr>
+          <w:p>
+            <w:r>
+              <w:rPr>
+                <w:color w:val="1F2937"/>
+                <w:sz w:val="19"/>
+                <w:szCs w:val="19"/>
+              </w:rPr>
+              <w:t xml:space="preserve">Deployment</w:t>
+            </w:r>
+          </w:p>
+        </w:tc>
+        <w:tc>
+          <w:tcPr>
+            <w:tcMar>
+              <w:top w:type="dxa" w:w="50"/>
+              <w:left w:type="dxa" w:w="80"/>
+              <w:bottom w:type="dxa" w:w="50"/>
+              <w:right w:type="dxa" w:w="80"/>
+            </w:tcMar>
+          </w:tcPr>
+          <w:p>
+            <w:r>
+              <w:rPr>
+                <w:color w:val="1F2937"/>
+                <w:sz w:val="19"/>
+                <w:szCs w:val="19"/>
+              </w:rPr>
+              <w:t xml:space="preserve">155</w:t>
+            </w:r>
+          </w:p>
+        </w:tc>
+        <w:tc>
+          <w:tcPr>
+            <w:tcMar>
+              <w:top w:type="dxa" w:w="50"/>
+              <w:left w:type="dxa" w:w="80"/>
+              <w:bottom w:type="dxa" w:w="50"/>
+              <w:right w:type="dxa" w:w="80"/>
+            </w:tcMar>
+          </w:tcPr>
+          <w:p>
+            <w:r>
+              <w:rPr>
+                <w:color w:val="1F2937"/>
+                <w:sz w:val="19"/>
+                <w:szCs w:val="19"/>
+              </w:rPr>
+              <w:t xml:space="preserve">R 1 363 000</w:t>
             </w:r>
           </w:p>
         </w:tc>
@@ -3899,70 +4817,70 @@
                 <w:sz w:val="19"/>
                 <w:szCs w:val="19"/>
               </w:rPr>
-              <w:t xml:space="preserve">Testing &amp; Go-Live</w:t>
-            </w:r>
-          </w:p>
-        </w:tc>
-        <w:tc>
-          <w:tcPr>
-            <w:shd w:fill="F3F4F6" w:val="clear"/>
-            <w:tcMar>
-              <w:top w:type="dxa" w:w="50"/>
-              <w:left w:type="dxa" w:w="80"/>
-              <w:bottom w:type="dxa" w:w="50"/>
-              <w:right w:type="dxa" w:w="80"/>
-            </w:tcMar>
-          </w:tcPr>
-          <w:p>
-            <w:r>
-              <w:rPr>
-                <w:color w:val="1F2937"/>
-                <w:sz w:val="19"/>
-                <w:szCs w:val="19"/>
-              </w:rPr>
-              <w:t xml:space="preserve">Fixed price</w:t>
-            </w:r>
-          </w:p>
-        </w:tc>
-        <w:tc>
-          <w:tcPr>
-            <w:shd w:fill="F3F4F6" w:val="clear"/>
-            <w:tcMar>
-              <w:top w:type="dxa" w:w="50"/>
-              <w:left w:type="dxa" w:w="80"/>
-              <w:bottom w:type="dxa" w:w="50"/>
-              <w:right w:type="dxa" w:w="80"/>
-            </w:tcMar>
-          </w:tcPr>
-          <w:p>
-            <w:r>
-              <w:rPr>
-                <w:color w:val="1F2937"/>
-                <w:sz w:val="19"/>
-                <w:szCs w:val="19"/>
-              </w:rPr>
-              <w:t xml:space="preserve">R [INSERT]</w:t>
-            </w:r>
-          </w:p>
-        </w:tc>
-        <w:tc>
-          <w:tcPr>
-            <w:shd w:fill="F3F4F6" w:val="clear"/>
-            <w:tcMar>
-              <w:top w:type="dxa" w:w="50"/>
-              <w:left w:type="dxa" w:w="80"/>
-              <w:bottom w:type="dxa" w:w="50"/>
-              <w:right w:type="dxa" w:w="80"/>
-            </w:tcMar>
-          </w:tcPr>
-          <w:p>
-            <w:r>
-              <w:rPr>
-                <w:color w:val="1F2937"/>
-                <w:sz w:val="19"/>
-                <w:szCs w:val="19"/>
-              </w:rPr>
-              <w:t xml:space="preserve"/>
+              <w:t xml:space="preserve">WP6</w:t>
+            </w:r>
+          </w:p>
+        </w:tc>
+        <w:tc>
+          <w:tcPr>
+            <w:shd w:fill="F3F4F6" w:val="clear"/>
+            <w:tcMar>
+              <w:top w:type="dxa" w:w="50"/>
+              <w:left w:type="dxa" w:w="80"/>
+              <w:bottom w:type="dxa" w:w="50"/>
+              <w:right w:type="dxa" w:w="80"/>
+            </w:tcMar>
+          </w:tcPr>
+          <w:p>
+            <w:r>
+              <w:rPr>
+                <w:color w:val="1F2937"/>
+                <w:sz w:val="19"/>
+                <w:szCs w:val="19"/>
+              </w:rPr>
+              <w:t xml:space="preserve">Stabilisation &amp; Go-Live (incl. 3-month warranty)</w:t>
+            </w:r>
+          </w:p>
+        </w:tc>
+        <w:tc>
+          <w:tcPr>
+            <w:shd w:fill="F3F4F6" w:val="clear"/>
+            <w:tcMar>
+              <w:top w:type="dxa" w:w="50"/>
+              <w:left w:type="dxa" w:w="80"/>
+              <w:bottom w:type="dxa" w:w="50"/>
+              <w:right w:type="dxa" w:w="80"/>
+            </w:tcMar>
+          </w:tcPr>
+          <w:p>
+            <w:r>
+              <w:rPr>
+                <w:color w:val="1F2937"/>
+                <w:sz w:val="19"/>
+                <w:szCs w:val="19"/>
+              </w:rPr>
+              <w:t xml:space="preserve">205</w:t>
+            </w:r>
+          </w:p>
+        </w:tc>
+        <w:tc>
+          <w:tcPr>
+            <w:shd w:fill="F3F4F6" w:val="clear"/>
+            <w:tcMar>
+              <w:top w:type="dxa" w:w="50"/>
+              <w:left w:type="dxa" w:w="80"/>
+              <w:bottom w:type="dxa" w:w="50"/>
+              <w:right w:type="dxa" w:w="80"/>
+            </w:tcMar>
+          </w:tcPr>
+          <w:p>
+            <w:r>
+              <w:rPr>
+                <w:color w:val="1F2937"/>
+                <w:sz w:val="19"/>
+                <w:szCs w:val="19"/>
+              </w:rPr>
+              <w:t xml:space="preserve">R 1 634 000</w:t>
             </w:r>
           </w:p>
         </w:tc>
@@ -3984,6 +4902,26 @@
                 <w:sz w:val="19"/>
                 <w:szCs w:val="19"/>
               </w:rPr>
+              <w:t xml:space="preserve">WP7</w:t>
+            </w:r>
+          </w:p>
+        </w:tc>
+        <w:tc>
+          <w:tcPr>
+            <w:tcMar>
+              <w:top w:type="dxa" w:w="50"/>
+              <w:left w:type="dxa" w:w="80"/>
+              <w:bottom w:type="dxa" w:w="50"/>
+              <w:right w:type="dxa" w:w="80"/>
+            </w:tcMar>
+          </w:tcPr>
+          <w:p>
+            <w:r>
+              <w:rPr>
+                <w:color w:val="1F2937"/>
+                <w:sz w:val="19"/>
+                <w:szCs w:val="19"/>
+              </w:rPr>
               <w:t xml:space="preserve">Training &amp; Knowledge Transfer</w:t>
             </w:r>
           </w:p>
@@ -4004,47 +4942,27 @@
                 <w:sz w:val="19"/>
                 <w:szCs w:val="19"/>
               </w:rPr>
-              <w:t xml:space="preserve">Fixed price</w:t>
-            </w:r>
-          </w:p>
-        </w:tc>
-        <w:tc>
-          <w:tcPr>
-            <w:tcMar>
-              <w:top w:type="dxa" w:w="50"/>
-              <w:left w:type="dxa" w:w="80"/>
-              <w:bottom w:type="dxa" w:w="50"/>
-              <w:right w:type="dxa" w:w="80"/>
-            </w:tcMar>
-          </w:tcPr>
-          <w:p>
-            <w:r>
-              <w:rPr>
-                <w:color w:val="1F2937"/>
-                <w:sz w:val="19"/>
-                <w:szCs w:val="19"/>
-              </w:rPr>
-              <w:t xml:space="preserve">R [INSERT]</w:t>
-            </w:r>
-          </w:p>
-        </w:tc>
-        <w:tc>
-          <w:tcPr>
-            <w:tcMar>
-              <w:top w:type="dxa" w:w="50"/>
-              <w:left w:type="dxa" w:w="80"/>
-              <w:bottom w:type="dxa" w:w="50"/>
-              <w:right w:type="dxa" w:w="80"/>
-            </w:tcMar>
-          </w:tcPr>
-          <w:p>
-            <w:r>
-              <w:rPr>
-                <w:color w:val="1F2937"/>
-                <w:sz w:val="19"/>
-                <w:szCs w:val="19"/>
-              </w:rPr>
-              <w:t xml:space="preserve"/>
+              <w:t xml:space="preserve">140</w:t>
+            </w:r>
+          </w:p>
+        </w:tc>
+        <w:tc>
+          <w:tcPr>
+            <w:tcMar>
+              <w:top w:type="dxa" w:w="50"/>
+              <w:left w:type="dxa" w:w="80"/>
+              <w:bottom w:type="dxa" w:w="50"/>
+              <w:right w:type="dxa" w:w="80"/>
+            </w:tcMar>
+          </w:tcPr>
+          <w:p>
+            <w:r>
+              <w:rPr>
+                <w:color w:val="1F2937"/>
+                <w:sz w:val="19"/>
+                <w:szCs w:val="19"/>
+              </w:rPr>
+              <w:t xml:space="preserve">R 994 000</w:t>
             </w:r>
           </w:p>
         </w:tc>
@@ -4067,70 +4985,70 @@
                 <w:sz w:val="19"/>
                 <w:szCs w:val="19"/>
               </w:rPr>
-              <w:t xml:space="preserve">Support &amp; Maintenance</w:t>
-            </w:r>
-          </w:p>
-        </w:tc>
-        <w:tc>
-          <w:tcPr>
-            <w:shd w:fill="F3F4F6" w:val="clear"/>
-            <w:tcMar>
-              <w:top w:type="dxa" w:w="50"/>
-              <w:left w:type="dxa" w:w="80"/>
-              <w:bottom w:type="dxa" w:w="50"/>
-              <w:right w:type="dxa" w:w="80"/>
-            </w:tcMar>
-          </w:tcPr>
-          <w:p>
-            <w:r>
-              <w:rPr>
-                <w:color w:val="1F2937"/>
-                <w:sz w:val="19"/>
-                <w:szCs w:val="19"/>
-              </w:rPr>
-              <w:t xml:space="preserve">Monthly / annual</w:t>
-            </w:r>
-          </w:p>
-        </w:tc>
-        <w:tc>
-          <w:tcPr>
-            <w:shd w:fill="F3F4F6" w:val="clear"/>
-            <w:tcMar>
-              <w:top w:type="dxa" w:w="50"/>
-              <w:left w:type="dxa" w:w="80"/>
-              <w:bottom w:type="dxa" w:w="50"/>
-              <w:right w:type="dxa" w:w="80"/>
-            </w:tcMar>
-          </w:tcPr>
-          <w:p>
-            <w:r>
-              <w:rPr>
-                <w:color w:val="1F2937"/>
-                <w:sz w:val="19"/>
-                <w:szCs w:val="19"/>
-              </w:rPr>
-              <w:t xml:space="preserve">R [INSERT]</w:t>
-            </w:r>
-          </w:p>
-        </w:tc>
-        <w:tc>
-          <w:tcPr>
-            <w:shd w:fill="F3F4F6" w:val="clear"/>
-            <w:tcMar>
-              <w:top w:type="dxa" w:w="50"/>
-              <w:left w:type="dxa" w:w="80"/>
-              <w:bottom w:type="dxa" w:w="50"/>
-              <w:right w:type="dxa" w:w="80"/>
-            </w:tcMar>
-          </w:tcPr>
-          <w:p>
-            <w:r>
-              <w:rPr>
-                <w:color w:val="1F2937"/>
-                <w:sz w:val="19"/>
-                <w:szCs w:val="19"/>
-              </w:rPr>
-              <w:t xml:space="preserve">State SLA and support window</w:t>
+              <w:t xml:space="preserve">WP8</w:t>
+            </w:r>
+          </w:p>
+        </w:tc>
+        <w:tc>
+          <w:tcPr>
+            <w:shd w:fill="F3F4F6" w:val="clear"/>
+            <w:tcMar>
+              <w:top w:type="dxa" w:w="50"/>
+              <w:left w:type="dxa" w:w="80"/>
+              <w:bottom w:type="dxa" w:w="50"/>
+              <w:right w:type="dxa" w:w="80"/>
+            </w:tcMar>
+          </w:tcPr>
+          <w:p>
+            <w:r>
+              <w:rPr>
+                <w:color w:val="1F2937"/>
+                <w:sz w:val="19"/>
+                <w:szCs w:val="19"/>
+              </w:rPr>
+              <w:t xml:space="preserve">Change Management</w:t>
+            </w:r>
+          </w:p>
+        </w:tc>
+        <w:tc>
+          <w:tcPr>
+            <w:shd w:fill="F3F4F6" w:val="clear"/>
+            <w:tcMar>
+              <w:top w:type="dxa" w:w="50"/>
+              <w:left w:type="dxa" w:w="80"/>
+              <w:bottom w:type="dxa" w:w="50"/>
+              <w:right w:type="dxa" w:w="80"/>
+            </w:tcMar>
+          </w:tcPr>
+          <w:p>
+            <w:r>
+              <w:rPr>
+                <w:color w:val="1F2937"/>
+                <w:sz w:val="19"/>
+                <w:szCs w:val="19"/>
+              </w:rPr>
+              <w:t xml:space="preserve">170</w:t>
+            </w:r>
+          </w:p>
+        </w:tc>
+        <w:tc>
+          <w:tcPr>
+            <w:shd w:fill="F3F4F6" w:val="clear"/>
+            <w:tcMar>
+              <w:top w:type="dxa" w:w="50"/>
+              <w:left w:type="dxa" w:w="80"/>
+              <w:bottom w:type="dxa" w:w="50"/>
+              <w:right w:type="dxa" w:w="80"/>
+            </w:tcMar>
+          </w:tcPr>
+          <w:p>
+            <w:r>
+              <w:rPr>
+                <w:color w:val="1F2937"/>
+                <w:sz w:val="19"/>
+                <w:szCs w:val="19"/>
+              </w:rPr>
+              <w:t xml:space="preserve">R 1 272 000</w:t>
             </w:r>
           </w:p>
         </w:tc>
@@ -4152,67 +5070,67 @@
                 <w:sz w:val="19"/>
                 <w:szCs w:val="19"/>
               </w:rPr>
-              <w:t xml:space="preserve">Third-Party Costs</w:t>
-            </w:r>
-          </w:p>
-        </w:tc>
-        <w:tc>
-          <w:tcPr>
-            <w:tcMar>
-              <w:top w:type="dxa" w:w="50"/>
-              <w:left w:type="dxa" w:w="80"/>
-              <w:bottom w:type="dxa" w:w="50"/>
-              <w:right w:type="dxa" w:w="80"/>
-            </w:tcMar>
-          </w:tcPr>
-          <w:p>
-            <w:r>
-              <w:rPr>
-                <w:color w:val="1F2937"/>
-                <w:sz w:val="19"/>
-                <w:szCs w:val="19"/>
-              </w:rPr>
-              <w:t xml:space="preserve">At cost / specified</w:t>
-            </w:r>
-          </w:p>
-        </w:tc>
-        <w:tc>
-          <w:tcPr>
-            <w:tcMar>
-              <w:top w:type="dxa" w:w="50"/>
-              <w:left w:type="dxa" w:w="80"/>
-              <w:bottom w:type="dxa" w:w="50"/>
-              <w:right w:type="dxa" w:w="80"/>
-            </w:tcMar>
-          </w:tcPr>
-          <w:p>
-            <w:r>
-              <w:rPr>
-                <w:color w:val="1F2937"/>
-                <w:sz w:val="19"/>
-                <w:szCs w:val="19"/>
-              </w:rPr>
-              <w:t xml:space="preserve">R [INSERT]</w:t>
-            </w:r>
-          </w:p>
-        </w:tc>
-        <w:tc>
-          <w:tcPr>
-            <w:tcMar>
-              <w:top w:type="dxa" w:w="50"/>
-              <w:left w:type="dxa" w:w="80"/>
-              <w:bottom w:type="dxa" w:w="50"/>
-              <w:right w:type="dxa" w:w="80"/>
-            </w:tcMar>
-          </w:tcPr>
-          <w:p>
-            <w:r>
-              <w:rPr>
-                <w:color w:val="1F2937"/>
-                <w:sz w:val="19"/>
-                <w:szCs w:val="19"/>
-              </w:rPr>
-              <w:t xml:space="preserve">List separately</w:t>
+              <w:t xml:space="preserve">WP9</w:t>
+            </w:r>
+          </w:p>
+        </w:tc>
+        <w:tc>
+          <w:tcPr>
+            <w:tcMar>
+              <w:top w:type="dxa" w:w="50"/>
+              <w:left w:type="dxa" w:w="80"/>
+              <w:bottom w:type="dxa" w:w="50"/>
+              <w:right w:type="dxa" w:w="80"/>
+            </w:tcMar>
+          </w:tcPr>
+          <w:p>
+            <w:r>
+              <w:rPr>
+                <w:color w:val="1F2937"/>
+                <w:sz w:val="19"/>
+                <w:szCs w:val="19"/>
+              </w:rPr>
+              <w:t xml:space="preserve">Project &amp; Programme Management</w:t>
+            </w:r>
+          </w:p>
+        </w:tc>
+        <w:tc>
+          <w:tcPr>
+            <w:tcMar>
+              <w:top w:type="dxa" w:w="50"/>
+              <w:left w:type="dxa" w:w="80"/>
+              <w:bottom w:type="dxa" w:w="50"/>
+              <w:right w:type="dxa" w:w="80"/>
+            </w:tcMar>
+          </w:tcPr>
+          <w:p>
+            <w:r>
+              <w:rPr>
+                <w:color w:val="1F2937"/>
+                <w:sz w:val="19"/>
+                <w:szCs w:val="19"/>
+              </w:rPr>
+              <w:t xml:space="preserve">320</w:t>
+            </w:r>
+          </w:p>
+        </w:tc>
+        <w:tc>
+          <w:tcPr>
+            <w:tcMar>
+              <w:top w:type="dxa" w:w="50"/>
+              <w:left w:type="dxa" w:w="80"/>
+              <w:bottom w:type="dxa" w:w="50"/>
+              <w:right w:type="dxa" w:w="80"/>
+            </w:tcMar>
+          </w:tcPr>
+          <w:p>
+            <w:r>
+              <w:rPr>
+                <w:color w:val="1F2937"/>
+                <w:sz w:val="19"/>
+                <w:szCs w:val="19"/>
+              </w:rPr>
+              <w:t xml:space="preserve">R 3 190 000</w:t>
             </w:r>
           </w:p>
         </w:tc>
@@ -4235,70 +5153,70 @@
                 <w:sz w:val="19"/>
                 <w:szCs w:val="19"/>
               </w:rPr>
-              <w:t xml:space="preserve">Total Tendered Price</w:t>
-            </w:r>
-          </w:p>
-        </w:tc>
-        <w:tc>
-          <w:tcPr>
-            <w:shd w:fill="F3F4F6" w:val="clear"/>
-            <w:tcMar>
-              <w:top w:type="dxa" w:w="50"/>
-              <w:left w:type="dxa" w:w="80"/>
-              <w:bottom w:type="dxa" w:w="50"/>
-              <w:right w:type="dxa" w:w="80"/>
-            </w:tcMar>
-          </w:tcPr>
-          <w:p>
-            <w:r>
-              <w:rPr>
-                <w:color w:val="1F2937"/>
-                <w:sz w:val="19"/>
-                <w:szCs w:val="19"/>
-              </w:rPr>
-              <w:t xml:space="preserve">As prescribed</w:t>
-            </w:r>
-          </w:p>
-        </w:tc>
-        <w:tc>
-          <w:tcPr>
-            <w:shd w:fill="F3F4F6" w:val="clear"/>
-            <w:tcMar>
-              <w:top w:type="dxa" w:w="50"/>
-              <w:left w:type="dxa" w:w="80"/>
-              <w:bottom w:type="dxa" w:w="50"/>
-              <w:right w:type="dxa" w:w="80"/>
-            </w:tcMar>
-          </w:tcPr>
-          <w:p>
-            <w:r>
-              <w:rPr>
-                <w:color w:val="1F2937"/>
-                <w:sz w:val="19"/>
-                <w:szCs w:val="19"/>
-              </w:rPr>
-              <w:t xml:space="preserve">R [INSERT]</w:t>
-            </w:r>
-          </w:p>
-        </w:tc>
-        <w:tc>
-          <w:tcPr>
-            <w:shd w:fill="F3F4F6" w:val="clear"/>
-            <w:tcMar>
-              <w:top w:type="dxa" w:w="50"/>
-              <w:left w:type="dxa" w:w="80"/>
-              <w:bottom w:type="dxa" w:w="50"/>
-              <w:right w:type="dxa" w:w="80"/>
-            </w:tcMar>
-          </w:tcPr>
-          <w:p>
-            <w:r>
-              <w:rPr>
-                <w:color w:val="1F2937"/>
-                <w:sz w:val="19"/>
-                <w:szCs w:val="19"/>
-              </w:rPr>
-              <w:t xml:space="preserve">Reconcile to official tender schedule</w:t>
+              <w:t xml:space="preserve"/>
+            </w:r>
+          </w:p>
+        </w:tc>
+        <w:tc>
+          <w:tcPr>
+            <w:shd w:fill="F3F4F6" w:val="clear"/>
+            <w:tcMar>
+              <w:top w:type="dxa" w:w="50"/>
+              <w:left w:type="dxa" w:w="80"/>
+              <w:bottom w:type="dxa" w:w="50"/>
+              <w:right w:type="dxa" w:w="80"/>
+            </w:tcMar>
+          </w:tcPr>
+          <w:p>
+            <w:r>
+              <w:rPr>
+                <w:color w:val="1F2937"/>
+                <w:sz w:val="19"/>
+                <w:szCs w:val="19"/>
+              </w:rPr>
+              <w:t xml:space="preserve">Total implementation (fixed price)</w:t>
+            </w:r>
+          </w:p>
+        </w:tc>
+        <w:tc>
+          <w:tcPr>
+            <w:shd w:fill="F3F4F6" w:val="clear"/>
+            <w:tcMar>
+              <w:top w:type="dxa" w:w="50"/>
+              <w:left w:type="dxa" w:w="80"/>
+              <w:bottom w:type="dxa" w:w="50"/>
+              <w:right w:type="dxa" w:w="80"/>
+            </w:tcMar>
+          </w:tcPr>
+          <w:p>
+            <w:r>
+              <w:rPr>
+                <w:color w:val="1F2937"/>
+                <w:sz w:val="19"/>
+                <w:szCs w:val="19"/>
+              </w:rPr>
+              <w:t xml:space="preserve">2465</w:t>
+            </w:r>
+          </w:p>
+        </w:tc>
+        <w:tc>
+          <w:tcPr>
+            <w:shd w:fill="F3F4F6" w:val="clear"/>
+            <w:tcMar>
+              <w:top w:type="dxa" w:w="50"/>
+              <w:left w:type="dxa" w:w="80"/>
+              <w:bottom w:type="dxa" w:w="50"/>
+              <w:right w:type="dxa" w:w="80"/>
+            </w:tcMar>
+          </w:tcPr>
+          <w:p>
+            <w:r>
+              <w:rPr>
+                <w:color w:val="1F2937"/>
+                <w:sz w:val="19"/>
+                <w:szCs w:val="19"/>
+              </w:rPr>
+              <w:t xml:space="preserve">R 20 743 000</w:t>
             </w:r>
           </w:p>
         </w:tc>
@@ -4306,19 +5224,1895 @@
     </w:tbl>
     <w:p>
       <w:pPr>
-        <w:spacing w:after="140" w:before="140"/>
+        <w:spacing w:after="80" w:before="160"/>
+      </w:pPr>
+      <w:r>
+        <w:rPr>
+          <w:b/>
+          <w:bCs/>
+          <w:color w:val="1F2937"/>
+          <w:sz w:val="24"/>
+          <w:szCs w:val="24"/>
+        </w:rPr>
+        <w:t xml:space="preserve">17.5 Support and Maintenance</w:t>
+      </w:r>
+    </w:p>
+    <w:tbl>
+      <w:tblPr>
+        <w:tblW w:type="pct" w:w="100%"/>
+        <w:tblBorders>
+          <w:top w:val="single" w:color="D1D5DB" w:sz="4"/>
+          <w:left w:val="single" w:color="D1D5DB" w:sz="4"/>
+          <w:bottom w:val="single" w:color="D1D5DB" w:sz="4"/>
+          <w:right w:val="single" w:color="D1D5DB" w:sz="4"/>
+          <w:insideH w:val="single" w:color="D1D5DB" w:sz="4"/>
+          <w:insideV w:val="single" w:color="D1D5DB" w:sz="4"/>
+        </w:tblBorders>
+      </w:tblPr>
+      <w:tblGrid>
+        <w:gridCol w:w="100"/>
+        <w:gridCol w:w="100"/>
+        <w:gridCol w:w="100"/>
+        <w:gridCol w:w="100"/>
+        <w:gridCol w:w="100"/>
+      </w:tblGrid>
+      <w:tr>
+        <w:trPr>
+          <w:tblHeader/>
+        </w:trPr>
+        <w:tc>
+          <w:tcPr>
+            <w:shd w:fill="004898" w:val="clear"/>
+            <w:tcMar>
+              <w:top w:type="dxa" w:w="60"/>
+              <w:left w:type="dxa" w:w="80"/>
+              <w:bottom w:type="dxa" w:w="60"/>
+              <w:right w:type="dxa" w:w="80"/>
+            </w:tcMar>
+          </w:tcPr>
+          <w:p>
+            <w:r>
+              <w:rPr>
+                <w:b/>
+                <w:bCs/>
+                <w:color w:val="FFFFFF"/>
+                <w:sz w:val="20"/>
+                <w:szCs w:val="20"/>
+              </w:rPr>
+              <w:t xml:space="preserve">Item</w:t>
+            </w:r>
+          </w:p>
+        </w:tc>
+        <w:tc>
+          <w:tcPr>
+            <w:shd w:fill="004898" w:val="clear"/>
+            <w:tcMar>
+              <w:top w:type="dxa" w:w="60"/>
+              <w:left w:type="dxa" w:w="80"/>
+              <w:bottom w:type="dxa" w:w="60"/>
+              <w:right w:type="dxa" w:w="80"/>
+            </w:tcMar>
+          </w:tcPr>
+          <w:p>
+            <w:r>
+              <w:rPr>
+                <w:b/>
+                <w:bCs/>
+                <w:color w:val="FFFFFF"/>
+                <w:sz w:val="20"/>
+                <w:szCs w:val="20"/>
+              </w:rPr>
+              <w:t xml:space="preserve">Basis</w:t>
+            </w:r>
+          </w:p>
+        </w:tc>
+        <w:tc>
+          <w:tcPr>
+            <w:shd w:fill="004898" w:val="clear"/>
+            <w:tcMar>
+              <w:top w:type="dxa" w:w="60"/>
+              <w:left w:type="dxa" w:w="80"/>
+              <w:bottom w:type="dxa" w:w="60"/>
+              <w:right w:type="dxa" w:w="80"/>
+            </w:tcMar>
+          </w:tcPr>
+          <w:p>
+            <w:r>
+              <w:rPr>
+                <w:b/>
+                <w:bCs/>
+                <w:color w:val="FFFFFF"/>
+                <w:sz w:val="20"/>
+                <w:szCs w:val="20"/>
+              </w:rPr>
+              <w:t xml:space="preserve">Annual (excl. VAT)</w:t>
+            </w:r>
+          </w:p>
+        </w:tc>
+        <w:tc>
+          <w:tcPr>
+            <w:shd w:fill="004898" w:val="clear"/>
+            <w:tcMar>
+              <w:top w:type="dxa" w:w="60"/>
+              <w:left w:type="dxa" w:w="80"/>
+              <w:bottom w:type="dxa" w:w="60"/>
+              <w:right w:type="dxa" w:w="80"/>
+            </w:tcMar>
+          </w:tcPr>
+          <w:p>
+            <w:r>
+              <w:rPr>
+                <w:b/>
+                <w:bCs/>
+                <w:color w:val="FFFFFF"/>
+                <w:sz w:val="20"/>
+                <w:szCs w:val="20"/>
+              </w:rPr>
+              <w:t xml:space="preserve">Term</w:t>
+            </w:r>
+          </w:p>
+        </w:tc>
+        <w:tc>
+          <w:tcPr>
+            <w:shd w:fill="004898" w:val="clear"/>
+            <w:tcMar>
+              <w:top w:type="dxa" w:w="60"/>
+              <w:left w:type="dxa" w:w="80"/>
+              <w:bottom w:type="dxa" w:w="60"/>
+              <w:right w:type="dxa" w:w="80"/>
+            </w:tcMar>
+          </w:tcPr>
+          <w:p>
+            <w:r>
+              <w:rPr>
+                <w:b/>
+                <w:bCs/>
+                <w:color w:val="FFFFFF"/>
+                <w:sz w:val="20"/>
+                <w:szCs w:val="20"/>
+              </w:rPr>
+              <w:t xml:space="preserve">Total (excl. VAT)</w:t>
+            </w:r>
+          </w:p>
+        </w:tc>
+      </w:tr>
+      <w:tr>
+        <w:tc>
+          <w:tcPr>
+            <w:tcMar>
+              <w:top w:type="dxa" w:w="50"/>
+              <w:left w:type="dxa" w:w="80"/>
+              <w:bottom w:type="dxa" w:w="50"/>
+              <w:right w:type="dxa" w:w="80"/>
+            </w:tcMar>
+          </w:tcPr>
+          <w:p>
+            <w:r>
+              <w:rPr>
+                <w:color w:val="1F2937"/>
+                <w:sz w:val="19"/>
+                <w:szCs w:val="19"/>
+              </w:rPr>
+              <w:t xml:space="preserve">Managed support &amp; maintenance</w:t>
+            </w:r>
+          </w:p>
+        </w:tc>
+        <w:tc>
+          <w:tcPr>
+            <w:tcMar>
+              <w:top w:type="dxa" w:w="50"/>
+              <w:left w:type="dxa" w:w="80"/>
+              <w:bottom w:type="dxa" w:w="50"/>
+              <w:right w:type="dxa" w:w="80"/>
+            </w:tcMar>
+          </w:tcPr>
+          <w:p>
+            <w:r>
+              <w:rPr>
+                <w:color w:val="1F2937"/>
+                <w:sz w:val="19"/>
+                <w:szCs w:val="19"/>
+              </w:rPr>
+              <w:t xml:space="preserve">Blended support team</w:t>
+            </w:r>
+          </w:p>
+        </w:tc>
+        <w:tc>
+          <w:tcPr>
+            <w:tcMar>
+              <w:top w:type="dxa" w:w="50"/>
+              <w:left w:type="dxa" w:w="80"/>
+              <w:bottom w:type="dxa" w:w="50"/>
+              <w:right w:type="dxa" w:w="80"/>
+            </w:tcMar>
+          </w:tcPr>
+          <w:p>
+            <w:r>
+              <w:rPr>
+                <w:color w:val="1F2937"/>
+                <w:sz w:val="19"/>
+                <w:szCs w:val="19"/>
+              </w:rPr>
+              <w:t xml:space="preserve">R 1 948 100</w:t>
+            </w:r>
+          </w:p>
+        </w:tc>
+        <w:tc>
+          <w:tcPr>
+            <w:tcMar>
+              <w:top w:type="dxa" w:w="50"/>
+              <w:left w:type="dxa" w:w="80"/>
+              <w:bottom w:type="dxa" w:w="50"/>
+              <w:right w:type="dxa" w:w="80"/>
+            </w:tcMar>
+          </w:tcPr>
+          <w:p>
+            <w:r>
+              <w:rPr>
+                <w:color w:val="1F2937"/>
+                <w:sz w:val="19"/>
+                <w:szCs w:val="19"/>
+              </w:rPr>
+              <w:t xml:space="preserve">4 yrs (post go-live)</w:t>
+            </w:r>
+          </w:p>
+        </w:tc>
+        <w:tc>
+          <w:tcPr>
+            <w:tcMar>
+              <w:top w:type="dxa" w:w="50"/>
+              <w:left w:type="dxa" w:w="80"/>
+              <w:bottom w:type="dxa" w:w="50"/>
+              <w:right w:type="dxa" w:w="80"/>
+            </w:tcMar>
+          </w:tcPr>
+          <w:p>
+            <w:r>
+              <w:rPr>
+                <w:color w:val="1F2937"/>
+                <w:sz w:val="19"/>
+                <w:szCs w:val="19"/>
+              </w:rPr>
+              <w:t xml:space="preserve">R 7 792 400</w:t>
+            </w:r>
+          </w:p>
+        </w:tc>
+      </w:tr>
+    </w:tbl>
+    <w:p>
+      <w:pPr>
+        <w:spacing w:after="140" w:before="100"/>
       </w:pPr>
       <w:r>
         <w:rPr>
           <w:i/>
           <w:iCs/>
           <w:color w:val="6B7280"/>
-          <w:sz w:val="20"/>
-          <w:szCs w:val="20"/>
-        </w:rPr>
-        <w:t xml:space="preserve">Commercial validity, escalation, travel, disbursements, VAT, payment milestones, retention, performance guarantees and any exchange-rate assumptions must be completed exactly as required by the tender conditions.</w:t>
-      </w:r>
-    </w:p>
+          <w:sz w:val="18"/>
+          <w:szCs w:val="18"/>
+        </w:rPr>
+        <w:t xml:space="preserve">Support covers L2/L3 application support, corrective and adaptive maintenance, platform updates and service management under an agreed SLA. Final SLA tiers and support windows to be confirmed with the Client.</w:t>
+      </w:r>
+    </w:p>
+    <w:p>
+      <w:pPr>
+        <w:spacing w:after="80" w:before="160"/>
+      </w:pPr>
+      <w:r>
+        <w:rPr>
+          <w:b/>
+          <w:bCs/>
+          <w:color w:val="1F2937"/>
+          <w:sz w:val="24"/>
+          <w:szCs w:val="24"/>
+        </w:rPr>
+        <w:t xml:space="preserve">17.6 Five-Year Total Cost of Ownership</w:t>
+      </w:r>
+    </w:p>
+    <w:tbl>
+      <w:tblPr>
+        <w:tblW w:type="pct" w:w="100%"/>
+        <w:tblBorders>
+          <w:top w:val="single" w:color="D1D5DB" w:sz="4"/>
+          <w:left w:val="single" w:color="D1D5DB" w:sz="4"/>
+          <w:bottom w:val="single" w:color="D1D5DB" w:sz="4"/>
+          <w:right w:val="single" w:color="D1D5DB" w:sz="4"/>
+          <w:insideH w:val="single" w:color="D1D5DB" w:sz="4"/>
+          <w:insideV w:val="single" w:color="D1D5DB" w:sz="4"/>
+        </w:tblBorders>
+      </w:tblPr>
+      <w:tblGrid>
+        <w:gridCol w:w="100"/>
+        <w:gridCol w:w="100"/>
+        <w:gridCol w:w="100"/>
+        <w:gridCol w:w="100"/>
+        <w:gridCol w:w="100"/>
+      </w:tblGrid>
+      <w:tr>
+        <w:trPr>
+          <w:tblHeader/>
+        </w:trPr>
+        <w:tc>
+          <w:tcPr>
+            <w:shd w:fill="004898" w:val="clear"/>
+            <w:tcMar>
+              <w:top w:type="dxa" w:w="60"/>
+              <w:left w:type="dxa" w:w="80"/>
+              <w:bottom w:type="dxa" w:w="60"/>
+              <w:right w:type="dxa" w:w="80"/>
+            </w:tcMar>
+          </w:tcPr>
+          <w:p>
+            <w:r>
+              <w:rPr>
+                <w:b/>
+                <w:bCs/>
+                <w:color w:val="FFFFFF"/>
+                <w:sz w:val="20"/>
+                <w:szCs w:val="20"/>
+              </w:rPr>
+              <w:t xml:space="preserve">Year</w:t>
+            </w:r>
+          </w:p>
+        </w:tc>
+        <w:tc>
+          <w:tcPr>
+            <w:shd w:fill="004898" w:val="clear"/>
+            <w:tcMar>
+              <w:top w:type="dxa" w:w="60"/>
+              <w:left w:type="dxa" w:w="80"/>
+              <w:bottom w:type="dxa" w:w="60"/>
+              <w:right w:type="dxa" w:w="80"/>
+            </w:tcMar>
+          </w:tcPr>
+          <w:p>
+            <w:r>
+              <w:rPr>
+                <w:b/>
+                <w:bCs/>
+                <w:color w:val="FFFFFF"/>
+                <w:sz w:val="20"/>
+                <w:szCs w:val="20"/>
+              </w:rPr>
+              <w:t xml:space="preserve">Implementation</w:t>
+            </w:r>
+          </w:p>
+        </w:tc>
+        <w:tc>
+          <w:tcPr>
+            <w:shd w:fill="004898" w:val="clear"/>
+            <w:tcMar>
+              <w:top w:type="dxa" w:w="60"/>
+              <w:left w:type="dxa" w:w="80"/>
+              <w:bottom w:type="dxa" w:w="60"/>
+              <w:right w:type="dxa" w:w="80"/>
+            </w:tcMar>
+          </w:tcPr>
+          <w:p>
+            <w:r>
+              <w:rPr>
+                <w:b/>
+                <w:bCs/>
+                <w:color w:val="FFFFFF"/>
+                <w:sz w:val="20"/>
+                <w:szCs w:val="20"/>
+              </w:rPr>
+              <w:t xml:space="preserve">Licence</w:t>
+            </w:r>
+          </w:p>
+        </w:tc>
+        <w:tc>
+          <w:tcPr>
+            <w:shd w:fill="004898" w:val="clear"/>
+            <w:tcMar>
+              <w:top w:type="dxa" w:w="60"/>
+              <w:left w:type="dxa" w:w="80"/>
+              <w:bottom w:type="dxa" w:w="60"/>
+              <w:right w:type="dxa" w:w="80"/>
+            </w:tcMar>
+          </w:tcPr>
+          <w:p>
+            <w:r>
+              <w:rPr>
+                <w:b/>
+                <w:bCs/>
+                <w:color w:val="FFFFFF"/>
+                <w:sz w:val="20"/>
+                <w:szCs w:val="20"/>
+              </w:rPr>
+              <w:t xml:space="preserve">Support &amp; Maint.</w:t>
+            </w:r>
+          </w:p>
+        </w:tc>
+        <w:tc>
+          <w:tcPr>
+            <w:shd w:fill="004898" w:val="clear"/>
+            <w:tcMar>
+              <w:top w:type="dxa" w:w="60"/>
+              <w:left w:type="dxa" w:w="80"/>
+              <w:bottom w:type="dxa" w:w="60"/>
+              <w:right w:type="dxa" w:w="80"/>
+            </w:tcMar>
+          </w:tcPr>
+          <w:p>
+            <w:r>
+              <w:rPr>
+                <w:b/>
+                <w:bCs/>
+                <w:color w:val="FFFFFF"/>
+                <w:sz w:val="20"/>
+                <w:szCs w:val="20"/>
+              </w:rPr>
+              <w:t xml:space="preserve">Annual Total</w:t>
+            </w:r>
+          </w:p>
+        </w:tc>
+      </w:tr>
+      <w:tr>
+        <w:tc>
+          <w:tcPr>
+            <w:tcMar>
+              <w:top w:type="dxa" w:w="50"/>
+              <w:left w:type="dxa" w:w="80"/>
+              <w:bottom w:type="dxa" w:w="50"/>
+              <w:right w:type="dxa" w:w="80"/>
+            </w:tcMar>
+          </w:tcPr>
+          <w:p>
+            <w:r>
+              <w:rPr>
+                <w:color w:val="1F2937"/>
+                <w:sz w:val="19"/>
+                <w:szCs w:val="19"/>
+              </w:rPr>
+              <w:t xml:space="preserve">Year 1</w:t>
+            </w:r>
+          </w:p>
+        </w:tc>
+        <w:tc>
+          <w:tcPr>
+            <w:tcMar>
+              <w:top w:type="dxa" w:w="50"/>
+              <w:left w:type="dxa" w:w="80"/>
+              <w:bottom w:type="dxa" w:w="50"/>
+              <w:right w:type="dxa" w:w="80"/>
+            </w:tcMar>
+          </w:tcPr>
+          <w:p>
+            <w:r>
+              <w:rPr>
+                <w:color w:val="1F2937"/>
+                <w:sz w:val="19"/>
+                <w:szCs w:val="19"/>
+              </w:rPr>
+              <w:t xml:space="preserve">R 20 743 000</w:t>
+            </w:r>
+          </w:p>
+        </w:tc>
+        <w:tc>
+          <w:tcPr>
+            <w:tcMar>
+              <w:top w:type="dxa" w:w="50"/>
+              <w:left w:type="dxa" w:w="80"/>
+              <w:bottom w:type="dxa" w:w="50"/>
+              <w:right w:type="dxa" w:w="80"/>
+            </w:tcMar>
+          </w:tcPr>
+          <w:p>
+            <w:r>
+              <w:rPr>
+                <w:color w:val="1F2937"/>
+                <w:sz w:val="19"/>
+                <w:szCs w:val="19"/>
+              </w:rPr>
+              <w:t xml:space="preserve">R 720 000</w:t>
+            </w:r>
+          </w:p>
+        </w:tc>
+        <w:tc>
+          <w:tcPr>
+            <w:tcMar>
+              <w:top w:type="dxa" w:w="50"/>
+              <w:left w:type="dxa" w:w="80"/>
+              <w:bottom w:type="dxa" w:w="50"/>
+              <w:right w:type="dxa" w:w="80"/>
+            </w:tcMar>
+          </w:tcPr>
+          <w:p>
+            <w:r>
+              <w:rPr>
+                <w:color w:val="1F2937"/>
+                <w:sz w:val="19"/>
+                <w:szCs w:val="19"/>
+              </w:rPr>
+              <w:t xml:space="preserve">—</w:t>
+            </w:r>
+          </w:p>
+        </w:tc>
+        <w:tc>
+          <w:tcPr>
+            <w:tcMar>
+              <w:top w:type="dxa" w:w="50"/>
+              <w:left w:type="dxa" w:w="80"/>
+              <w:bottom w:type="dxa" w:w="50"/>
+              <w:right w:type="dxa" w:w="80"/>
+            </w:tcMar>
+          </w:tcPr>
+          <w:p>
+            <w:r>
+              <w:rPr>
+                <w:color w:val="1F2937"/>
+                <w:sz w:val="19"/>
+                <w:szCs w:val="19"/>
+              </w:rPr>
+              <w:t xml:space="preserve">R 21 463 000</w:t>
+            </w:r>
+          </w:p>
+        </w:tc>
+      </w:tr>
+      <w:tr>
+        <w:tc>
+          <w:tcPr>
+            <w:shd w:fill="F3F4F6" w:val="clear"/>
+            <w:tcMar>
+              <w:top w:type="dxa" w:w="50"/>
+              <w:left w:type="dxa" w:w="80"/>
+              <w:bottom w:type="dxa" w:w="50"/>
+              <w:right w:type="dxa" w:w="80"/>
+            </w:tcMar>
+          </w:tcPr>
+          <w:p>
+            <w:r>
+              <w:rPr>
+                <w:color w:val="1F2937"/>
+                <w:sz w:val="19"/>
+                <w:szCs w:val="19"/>
+              </w:rPr>
+              <w:t xml:space="preserve">Year 2</w:t>
+            </w:r>
+          </w:p>
+        </w:tc>
+        <w:tc>
+          <w:tcPr>
+            <w:shd w:fill="F3F4F6" w:val="clear"/>
+            <w:tcMar>
+              <w:top w:type="dxa" w:w="50"/>
+              <w:left w:type="dxa" w:w="80"/>
+              <w:bottom w:type="dxa" w:w="50"/>
+              <w:right w:type="dxa" w:w="80"/>
+            </w:tcMar>
+          </w:tcPr>
+          <w:p>
+            <w:r>
+              <w:rPr>
+                <w:color w:val="1F2937"/>
+                <w:sz w:val="19"/>
+                <w:szCs w:val="19"/>
+              </w:rPr>
+              <w:t xml:space="preserve">—</w:t>
+            </w:r>
+          </w:p>
+        </w:tc>
+        <w:tc>
+          <w:tcPr>
+            <w:shd w:fill="F3F4F6" w:val="clear"/>
+            <w:tcMar>
+              <w:top w:type="dxa" w:w="50"/>
+              <w:left w:type="dxa" w:w="80"/>
+              <w:bottom w:type="dxa" w:w="50"/>
+              <w:right w:type="dxa" w:w="80"/>
+            </w:tcMar>
+          </w:tcPr>
+          <w:p>
+            <w:r>
+              <w:rPr>
+                <w:color w:val="1F2937"/>
+                <w:sz w:val="19"/>
+                <w:szCs w:val="19"/>
+              </w:rPr>
+              <w:t xml:space="preserve">R 720 000</w:t>
+            </w:r>
+          </w:p>
+        </w:tc>
+        <w:tc>
+          <w:tcPr>
+            <w:shd w:fill="F3F4F6" w:val="clear"/>
+            <w:tcMar>
+              <w:top w:type="dxa" w:w="50"/>
+              <w:left w:type="dxa" w:w="80"/>
+              <w:bottom w:type="dxa" w:w="50"/>
+              <w:right w:type="dxa" w:w="80"/>
+            </w:tcMar>
+          </w:tcPr>
+          <w:p>
+            <w:r>
+              <w:rPr>
+                <w:color w:val="1F2937"/>
+                <w:sz w:val="19"/>
+                <w:szCs w:val="19"/>
+              </w:rPr>
+              <w:t xml:space="preserve">R 1 948 100</w:t>
+            </w:r>
+          </w:p>
+        </w:tc>
+        <w:tc>
+          <w:tcPr>
+            <w:shd w:fill="F3F4F6" w:val="clear"/>
+            <w:tcMar>
+              <w:top w:type="dxa" w:w="50"/>
+              <w:left w:type="dxa" w:w="80"/>
+              <w:bottom w:type="dxa" w:w="50"/>
+              <w:right w:type="dxa" w:w="80"/>
+            </w:tcMar>
+          </w:tcPr>
+          <w:p>
+            <w:r>
+              <w:rPr>
+                <w:color w:val="1F2937"/>
+                <w:sz w:val="19"/>
+                <w:szCs w:val="19"/>
+              </w:rPr>
+              <w:t xml:space="preserve">R 2 668 100</w:t>
+            </w:r>
+          </w:p>
+        </w:tc>
+      </w:tr>
+      <w:tr>
+        <w:tc>
+          <w:tcPr>
+            <w:tcMar>
+              <w:top w:type="dxa" w:w="50"/>
+              <w:left w:type="dxa" w:w="80"/>
+              <w:bottom w:type="dxa" w:w="50"/>
+              <w:right w:type="dxa" w:w="80"/>
+            </w:tcMar>
+          </w:tcPr>
+          <w:p>
+            <w:r>
+              <w:rPr>
+                <w:color w:val="1F2937"/>
+                <w:sz w:val="19"/>
+                <w:szCs w:val="19"/>
+              </w:rPr>
+              <w:t xml:space="preserve">Year 3</w:t>
+            </w:r>
+          </w:p>
+        </w:tc>
+        <w:tc>
+          <w:tcPr>
+            <w:tcMar>
+              <w:top w:type="dxa" w:w="50"/>
+              <w:left w:type="dxa" w:w="80"/>
+              <w:bottom w:type="dxa" w:w="50"/>
+              <w:right w:type="dxa" w:w="80"/>
+            </w:tcMar>
+          </w:tcPr>
+          <w:p>
+            <w:r>
+              <w:rPr>
+                <w:color w:val="1F2937"/>
+                <w:sz w:val="19"/>
+                <w:szCs w:val="19"/>
+              </w:rPr>
+              <w:t xml:space="preserve">—</w:t>
+            </w:r>
+          </w:p>
+        </w:tc>
+        <w:tc>
+          <w:tcPr>
+            <w:tcMar>
+              <w:top w:type="dxa" w:w="50"/>
+              <w:left w:type="dxa" w:w="80"/>
+              <w:bottom w:type="dxa" w:w="50"/>
+              <w:right w:type="dxa" w:w="80"/>
+            </w:tcMar>
+          </w:tcPr>
+          <w:p>
+            <w:r>
+              <w:rPr>
+                <w:color w:val="1F2937"/>
+                <w:sz w:val="19"/>
+                <w:szCs w:val="19"/>
+              </w:rPr>
+              <w:t xml:space="preserve">R 720 000</w:t>
+            </w:r>
+          </w:p>
+        </w:tc>
+        <w:tc>
+          <w:tcPr>
+            <w:tcMar>
+              <w:top w:type="dxa" w:w="50"/>
+              <w:left w:type="dxa" w:w="80"/>
+              <w:bottom w:type="dxa" w:w="50"/>
+              <w:right w:type="dxa" w:w="80"/>
+            </w:tcMar>
+          </w:tcPr>
+          <w:p>
+            <w:r>
+              <w:rPr>
+                <w:color w:val="1F2937"/>
+                <w:sz w:val="19"/>
+                <w:szCs w:val="19"/>
+              </w:rPr>
+              <w:t xml:space="preserve">R 1 948 100</w:t>
+            </w:r>
+          </w:p>
+        </w:tc>
+        <w:tc>
+          <w:tcPr>
+            <w:tcMar>
+              <w:top w:type="dxa" w:w="50"/>
+              <w:left w:type="dxa" w:w="80"/>
+              <w:bottom w:type="dxa" w:w="50"/>
+              <w:right w:type="dxa" w:w="80"/>
+            </w:tcMar>
+          </w:tcPr>
+          <w:p>
+            <w:r>
+              <w:rPr>
+                <w:color w:val="1F2937"/>
+                <w:sz w:val="19"/>
+                <w:szCs w:val="19"/>
+              </w:rPr>
+              <w:t xml:space="preserve">R 2 668 100</w:t>
+            </w:r>
+          </w:p>
+        </w:tc>
+      </w:tr>
+      <w:tr>
+        <w:tc>
+          <w:tcPr>
+            <w:shd w:fill="F3F4F6" w:val="clear"/>
+            <w:tcMar>
+              <w:top w:type="dxa" w:w="50"/>
+              <w:left w:type="dxa" w:w="80"/>
+              <w:bottom w:type="dxa" w:w="50"/>
+              <w:right w:type="dxa" w:w="80"/>
+            </w:tcMar>
+          </w:tcPr>
+          <w:p>
+            <w:r>
+              <w:rPr>
+                <w:color w:val="1F2937"/>
+                <w:sz w:val="19"/>
+                <w:szCs w:val="19"/>
+              </w:rPr>
+              <w:t xml:space="preserve">Year 4</w:t>
+            </w:r>
+          </w:p>
+        </w:tc>
+        <w:tc>
+          <w:tcPr>
+            <w:shd w:fill="F3F4F6" w:val="clear"/>
+            <w:tcMar>
+              <w:top w:type="dxa" w:w="50"/>
+              <w:left w:type="dxa" w:w="80"/>
+              <w:bottom w:type="dxa" w:w="50"/>
+              <w:right w:type="dxa" w:w="80"/>
+            </w:tcMar>
+          </w:tcPr>
+          <w:p>
+            <w:r>
+              <w:rPr>
+                <w:color w:val="1F2937"/>
+                <w:sz w:val="19"/>
+                <w:szCs w:val="19"/>
+              </w:rPr>
+              <w:t xml:space="preserve">—</w:t>
+            </w:r>
+          </w:p>
+        </w:tc>
+        <w:tc>
+          <w:tcPr>
+            <w:shd w:fill="F3F4F6" w:val="clear"/>
+            <w:tcMar>
+              <w:top w:type="dxa" w:w="50"/>
+              <w:left w:type="dxa" w:w="80"/>
+              <w:bottom w:type="dxa" w:w="50"/>
+              <w:right w:type="dxa" w:w="80"/>
+            </w:tcMar>
+          </w:tcPr>
+          <w:p>
+            <w:r>
+              <w:rPr>
+                <w:color w:val="1F2937"/>
+                <w:sz w:val="19"/>
+                <w:szCs w:val="19"/>
+              </w:rPr>
+              <w:t xml:space="preserve">R 720 000</w:t>
+            </w:r>
+          </w:p>
+        </w:tc>
+        <w:tc>
+          <w:tcPr>
+            <w:shd w:fill="F3F4F6" w:val="clear"/>
+            <w:tcMar>
+              <w:top w:type="dxa" w:w="50"/>
+              <w:left w:type="dxa" w:w="80"/>
+              <w:bottom w:type="dxa" w:w="50"/>
+              <w:right w:type="dxa" w:w="80"/>
+            </w:tcMar>
+          </w:tcPr>
+          <w:p>
+            <w:r>
+              <w:rPr>
+                <w:color w:val="1F2937"/>
+                <w:sz w:val="19"/>
+                <w:szCs w:val="19"/>
+              </w:rPr>
+              <w:t xml:space="preserve">R 1 948 100</w:t>
+            </w:r>
+          </w:p>
+        </w:tc>
+        <w:tc>
+          <w:tcPr>
+            <w:shd w:fill="F3F4F6" w:val="clear"/>
+            <w:tcMar>
+              <w:top w:type="dxa" w:w="50"/>
+              <w:left w:type="dxa" w:w="80"/>
+              <w:bottom w:type="dxa" w:w="50"/>
+              <w:right w:type="dxa" w:w="80"/>
+            </w:tcMar>
+          </w:tcPr>
+          <w:p>
+            <w:r>
+              <w:rPr>
+                <w:color w:val="1F2937"/>
+                <w:sz w:val="19"/>
+                <w:szCs w:val="19"/>
+              </w:rPr>
+              <w:t xml:space="preserve">R 2 668 100</w:t>
+            </w:r>
+          </w:p>
+        </w:tc>
+      </w:tr>
+      <w:tr>
+        <w:tc>
+          <w:tcPr>
+            <w:tcMar>
+              <w:top w:type="dxa" w:w="50"/>
+              <w:left w:type="dxa" w:w="80"/>
+              <w:bottom w:type="dxa" w:w="50"/>
+              <w:right w:type="dxa" w:w="80"/>
+            </w:tcMar>
+          </w:tcPr>
+          <w:p>
+            <w:r>
+              <w:rPr>
+                <w:color w:val="1F2937"/>
+                <w:sz w:val="19"/>
+                <w:szCs w:val="19"/>
+              </w:rPr>
+              <w:t xml:space="preserve">Year 5</w:t>
+            </w:r>
+          </w:p>
+        </w:tc>
+        <w:tc>
+          <w:tcPr>
+            <w:tcMar>
+              <w:top w:type="dxa" w:w="50"/>
+              <w:left w:type="dxa" w:w="80"/>
+              <w:bottom w:type="dxa" w:w="50"/>
+              <w:right w:type="dxa" w:w="80"/>
+            </w:tcMar>
+          </w:tcPr>
+          <w:p>
+            <w:r>
+              <w:rPr>
+                <w:color w:val="1F2937"/>
+                <w:sz w:val="19"/>
+                <w:szCs w:val="19"/>
+              </w:rPr>
+              <w:t xml:space="preserve">—</w:t>
+            </w:r>
+          </w:p>
+        </w:tc>
+        <w:tc>
+          <w:tcPr>
+            <w:tcMar>
+              <w:top w:type="dxa" w:w="50"/>
+              <w:left w:type="dxa" w:w="80"/>
+              <w:bottom w:type="dxa" w:w="50"/>
+              <w:right w:type="dxa" w:w="80"/>
+            </w:tcMar>
+          </w:tcPr>
+          <w:p>
+            <w:r>
+              <w:rPr>
+                <w:color w:val="1F2937"/>
+                <w:sz w:val="19"/>
+                <w:szCs w:val="19"/>
+              </w:rPr>
+              <w:t xml:space="preserve">R 720 000</w:t>
+            </w:r>
+          </w:p>
+        </w:tc>
+        <w:tc>
+          <w:tcPr>
+            <w:tcMar>
+              <w:top w:type="dxa" w:w="50"/>
+              <w:left w:type="dxa" w:w="80"/>
+              <w:bottom w:type="dxa" w:w="50"/>
+              <w:right w:type="dxa" w:w="80"/>
+            </w:tcMar>
+          </w:tcPr>
+          <w:p>
+            <w:r>
+              <w:rPr>
+                <w:color w:val="1F2937"/>
+                <w:sz w:val="19"/>
+                <w:szCs w:val="19"/>
+              </w:rPr>
+              <w:t xml:space="preserve">R 1 948 100</w:t>
+            </w:r>
+          </w:p>
+        </w:tc>
+        <w:tc>
+          <w:tcPr>
+            <w:tcMar>
+              <w:top w:type="dxa" w:w="50"/>
+              <w:left w:type="dxa" w:w="80"/>
+              <w:bottom w:type="dxa" w:w="50"/>
+              <w:right w:type="dxa" w:w="80"/>
+            </w:tcMar>
+          </w:tcPr>
+          <w:p>
+            <w:r>
+              <w:rPr>
+                <w:color w:val="1F2937"/>
+                <w:sz w:val="19"/>
+                <w:szCs w:val="19"/>
+              </w:rPr>
+              <w:t xml:space="preserve">R 2 668 100</w:t>
+            </w:r>
+          </w:p>
+        </w:tc>
+      </w:tr>
+      <w:tr>
+        <w:tc>
+          <w:tcPr>
+            <w:shd w:fill="F3F4F6" w:val="clear"/>
+            <w:tcMar>
+              <w:top w:type="dxa" w:w="50"/>
+              <w:left w:type="dxa" w:w="80"/>
+              <w:bottom w:type="dxa" w:w="50"/>
+              <w:right w:type="dxa" w:w="80"/>
+            </w:tcMar>
+          </w:tcPr>
+          <w:p>
+            <w:r>
+              <w:rPr>
+                <w:color w:val="1F2937"/>
+                <w:sz w:val="19"/>
+                <w:szCs w:val="19"/>
+              </w:rPr>
+              <w:t xml:space="preserve">Total (excl. VAT)</w:t>
+            </w:r>
+          </w:p>
+        </w:tc>
+        <w:tc>
+          <w:tcPr>
+            <w:shd w:fill="F3F4F6" w:val="clear"/>
+            <w:tcMar>
+              <w:top w:type="dxa" w:w="50"/>
+              <w:left w:type="dxa" w:w="80"/>
+              <w:bottom w:type="dxa" w:w="50"/>
+              <w:right w:type="dxa" w:w="80"/>
+            </w:tcMar>
+          </w:tcPr>
+          <w:p>
+            <w:r>
+              <w:rPr>
+                <w:color w:val="1F2937"/>
+                <w:sz w:val="19"/>
+                <w:szCs w:val="19"/>
+              </w:rPr>
+              <w:t xml:space="preserve"/>
+            </w:r>
+          </w:p>
+        </w:tc>
+        <w:tc>
+          <w:tcPr>
+            <w:shd w:fill="F3F4F6" w:val="clear"/>
+            <w:tcMar>
+              <w:top w:type="dxa" w:w="50"/>
+              <w:left w:type="dxa" w:w="80"/>
+              <w:bottom w:type="dxa" w:w="50"/>
+              <w:right w:type="dxa" w:w="80"/>
+            </w:tcMar>
+          </w:tcPr>
+          <w:p>
+            <w:r>
+              <w:rPr>
+                <w:color w:val="1F2937"/>
+                <w:sz w:val="19"/>
+                <w:szCs w:val="19"/>
+              </w:rPr>
+              <w:t xml:space="preserve"/>
+            </w:r>
+          </w:p>
+        </w:tc>
+        <w:tc>
+          <w:tcPr>
+            <w:shd w:fill="F3F4F6" w:val="clear"/>
+            <w:tcMar>
+              <w:top w:type="dxa" w:w="50"/>
+              <w:left w:type="dxa" w:w="80"/>
+              <w:bottom w:type="dxa" w:w="50"/>
+              <w:right w:type="dxa" w:w="80"/>
+            </w:tcMar>
+          </w:tcPr>
+          <w:p>
+            <w:r>
+              <w:rPr>
+                <w:color w:val="1F2937"/>
+                <w:sz w:val="19"/>
+                <w:szCs w:val="19"/>
+              </w:rPr>
+              <w:t xml:space="preserve"/>
+            </w:r>
+          </w:p>
+        </w:tc>
+        <w:tc>
+          <w:tcPr>
+            <w:shd w:fill="F3F4F6" w:val="clear"/>
+            <w:tcMar>
+              <w:top w:type="dxa" w:w="50"/>
+              <w:left w:type="dxa" w:w="80"/>
+              <w:bottom w:type="dxa" w:w="50"/>
+              <w:right w:type="dxa" w:w="80"/>
+            </w:tcMar>
+          </w:tcPr>
+          <w:p>
+            <w:r>
+              <w:rPr>
+                <w:color w:val="1F2937"/>
+                <w:sz w:val="19"/>
+                <w:szCs w:val="19"/>
+              </w:rPr>
+              <w:t xml:space="preserve">R 32 135 400</w:t>
+            </w:r>
+          </w:p>
+        </w:tc>
+      </w:tr>
+      <w:tr>
+        <w:tc>
+          <w:tcPr>
+            <w:tcMar>
+              <w:top w:type="dxa" w:w="50"/>
+              <w:left w:type="dxa" w:w="80"/>
+              <w:bottom w:type="dxa" w:w="50"/>
+              <w:right w:type="dxa" w:w="80"/>
+            </w:tcMar>
+          </w:tcPr>
+          <w:p>
+            <w:r>
+              <w:rPr>
+                <w:color w:val="1F2937"/>
+                <w:sz w:val="19"/>
+                <w:szCs w:val="19"/>
+              </w:rPr>
+              <w:t xml:space="preserve">VAT @ 15%</w:t>
+            </w:r>
+          </w:p>
+        </w:tc>
+        <w:tc>
+          <w:tcPr>
+            <w:tcMar>
+              <w:top w:type="dxa" w:w="50"/>
+              <w:left w:type="dxa" w:w="80"/>
+              <w:bottom w:type="dxa" w:w="50"/>
+              <w:right w:type="dxa" w:w="80"/>
+            </w:tcMar>
+          </w:tcPr>
+          <w:p>
+            <w:r>
+              <w:rPr>
+                <w:color w:val="1F2937"/>
+                <w:sz w:val="19"/>
+                <w:szCs w:val="19"/>
+              </w:rPr>
+              <w:t xml:space="preserve"/>
+            </w:r>
+          </w:p>
+        </w:tc>
+        <w:tc>
+          <w:tcPr>
+            <w:tcMar>
+              <w:top w:type="dxa" w:w="50"/>
+              <w:left w:type="dxa" w:w="80"/>
+              <w:bottom w:type="dxa" w:w="50"/>
+              <w:right w:type="dxa" w:w="80"/>
+            </w:tcMar>
+          </w:tcPr>
+          <w:p>
+            <w:r>
+              <w:rPr>
+                <w:color w:val="1F2937"/>
+                <w:sz w:val="19"/>
+                <w:szCs w:val="19"/>
+              </w:rPr>
+              <w:t xml:space="preserve"/>
+            </w:r>
+          </w:p>
+        </w:tc>
+        <w:tc>
+          <w:tcPr>
+            <w:tcMar>
+              <w:top w:type="dxa" w:w="50"/>
+              <w:left w:type="dxa" w:w="80"/>
+              <w:bottom w:type="dxa" w:w="50"/>
+              <w:right w:type="dxa" w:w="80"/>
+            </w:tcMar>
+          </w:tcPr>
+          <w:p>
+            <w:r>
+              <w:rPr>
+                <w:color w:val="1F2937"/>
+                <w:sz w:val="19"/>
+                <w:szCs w:val="19"/>
+              </w:rPr>
+              <w:t xml:space="preserve"/>
+            </w:r>
+          </w:p>
+        </w:tc>
+        <w:tc>
+          <w:tcPr>
+            <w:tcMar>
+              <w:top w:type="dxa" w:w="50"/>
+              <w:left w:type="dxa" w:w="80"/>
+              <w:bottom w:type="dxa" w:w="50"/>
+              <w:right w:type="dxa" w:w="80"/>
+            </w:tcMar>
+          </w:tcPr>
+          <w:p>
+            <w:r>
+              <w:rPr>
+                <w:color w:val="1F2937"/>
+                <w:sz w:val="19"/>
+                <w:szCs w:val="19"/>
+              </w:rPr>
+              <w:t xml:space="preserve">R 4 820 310</w:t>
+            </w:r>
+          </w:p>
+        </w:tc>
+      </w:tr>
+      <w:tr>
+        <w:tc>
+          <w:tcPr>
+            <w:shd w:fill="F3F4F6" w:val="clear"/>
+            <w:tcMar>
+              <w:top w:type="dxa" w:w="50"/>
+              <w:left w:type="dxa" w:w="80"/>
+              <w:bottom w:type="dxa" w:w="50"/>
+              <w:right w:type="dxa" w:w="80"/>
+            </w:tcMar>
+          </w:tcPr>
+          <w:p>
+            <w:r>
+              <w:rPr>
+                <w:color w:val="1F2937"/>
+                <w:sz w:val="19"/>
+                <w:szCs w:val="19"/>
+              </w:rPr>
+              <w:t xml:space="preserve">Total (incl. VAT)</w:t>
+            </w:r>
+          </w:p>
+        </w:tc>
+        <w:tc>
+          <w:tcPr>
+            <w:shd w:fill="F3F4F6" w:val="clear"/>
+            <w:tcMar>
+              <w:top w:type="dxa" w:w="50"/>
+              <w:left w:type="dxa" w:w="80"/>
+              <w:bottom w:type="dxa" w:w="50"/>
+              <w:right w:type="dxa" w:w="80"/>
+            </w:tcMar>
+          </w:tcPr>
+          <w:p>
+            <w:r>
+              <w:rPr>
+                <w:color w:val="1F2937"/>
+                <w:sz w:val="19"/>
+                <w:szCs w:val="19"/>
+              </w:rPr>
+              <w:t xml:space="preserve"/>
+            </w:r>
+          </w:p>
+        </w:tc>
+        <w:tc>
+          <w:tcPr>
+            <w:shd w:fill="F3F4F6" w:val="clear"/>
+            <w:tcMar>
+              <w:top w:type="dxa" w:w="50"/>
+              <w:left w:type="dxa" w:w="80"/>
+              <w:bottom w:type="dxa" w:w="50"/>
+              <w:right w:type="dxa" w:w="80"/>
+            </w:tcMar>
+          </w:tcPr>
+          <w:p>
+            <w:r>
+              <w:rPr>
+                <w:color w:val="1F2937"/>
+                <w:sz w:val="19"/>
+                <w:szCs w:val="19"/>
+              </w:rPr>
+              <w:t xml:space="preserve"/>
+            </w:r>
+          </w:p>
+        </w:tc>
+        <w:tc>
+          <w:tcPr>
+            <w:shd w:fill="F3F4F6" w:val="clear"/>
+            <w:tcMar>
+              <w:top w:type="dxa" w:w="50"/>
+              <w:left w:type="dxa" w:w="80"/>
+              <w:bottom w:type="dxa" w:w="50"/>
+              <w:right w:type="dxa" w:w="80"/>
+            </w:tcMar>
+          </w:tcPr>
+          <w:p>
+            <w:r>
+              <w:rPr>
+                <w:color w:val="1F2937"/>
+                <w:sz w:val="19"/>
+                <w:szCs w:val="19"/>
+              </w:rPr>
+              <w:t xml:space="preserve"/>
+            </w:r>
+          </w:p>
+        </w:tc>
+        <w:tc>
+          <w:tcPr>
+            <w:shd w:fill="F3F4F6" w:val="clear"/>
+            <w:tcMar>
+              <w:top w:type="dxa" w:w="50"/>
+              <w:left w:type="dxa" w:w="80"/>
+              <w:bottom w:type="dxa" w:w="50"/>
+              <w:right w:type="dxa" w:w="80"/>
+            </w:tcMar>
+          </w:tcPr>
+          <w:p>
+            <w:r>
+              <w:rPr>
+                <w:color w:val="1F2937"/>
+                <w:sz w:val="19"/>
+                <w:szCs w:val="19"/>
+              </w:rPr>
+              <w:t xml:space="preserve">R 36 955 710</w:t>
+            </w:r>
+          </w:p>
+        </w:tc>
+      </w:tr>
+    </w:tbl>
+    <w:p>
+      <w:pPr>
+        <w:spacing w:after="80" w:before="160"/>
+      </w:pPr>
+      <w:r>
+        <w:rPr>
+          <w:b/>
+          <w:bCs/>
+          <w:color w:val="1F2937"/>
+          <w:sz w:val="24"/>
+          <w:szCs w:val="24"/>
+        </w:rPr>
+        <w:t xml:space="preserve">17.7 Payment Milestone Schedule</w:t>
+      </w:r>
+    </w:p>
+    <w:p>
+      <w:pPr>
+        <w:spacing w:after="120"/>
+      </w:pPr>
+      <w:r>
+        <w:rPr>
+          <w:color w:val="1F2937"/>
+          <w:sz w:val="22"/>
+          <w:szCs w:val="22"/>
+        </w:rPr>
+        <w:t xml:space="preserve">Implementation value is invoiced on completion and acceptance of each milestone across the 18-month term.</w:t>
+      </w:r>
+    </w:p>
+    <w:tbl>
+      <w:tblPr>
+        <w:tblW w:type="pct" w:w="100%"/>
+        <w:tblBorders>
+          <w:top w:val="single" w:color="D1D5DB" w:sz="4"/>
+          <w:left w:val="single" w:color="D1D5DB" w:sz="4"/>
+          <w:bottom w:val="single" w:color="D1D5DB" w:sz="4"/>
+          <w:right w:val="single" w:color="D1D5DB" w:sz="4"/>
+          <w:insideH w:val="single" w:color="D1D5DB" w:sz="4"/>
+          <w:insideV w:val="single" w:color="D1D5DB" w:sz="4"/>
+        </w:tblBorders>
+      </w:tblPr>
+      <w:tblGrid>
+        <w:gridCol w:w="100"/>
+        <w:gridCol w:w="100"/>
+        <w:gridCol w:w="100"/>
+      </w:tblGrid>
+      <w:tr>
+        <w:trPr>
+          <w:tblHeader/>
+        </w:trPr>
+        <w:tc>
+          <w:tcPr>
+            <w:shd w:fill="004898" w:val="clear"/>
+            <w:tcMar>
+              <w:top w:type="dxa" w:w="60"/>
+              <w:left w:type="dxa" w:w="80"/>
+              <w:bottom w:type="dxa" w:w="60"/>
+              <w:right w:type="dxa" w:w="80"/>
+            </w:tcMar>
+          </w:tcPr>
+          <w:p>
+            <w:r>
+              <w:rPr>
+                <w:b/>
+                <w:bCs/>
+                <w:color w:val="FFFFFF"/>
+                <w:sz w:val="20"/>
+                <w:szCs w:val="20"/>
+              </w:rPr>
+              <w:t xml:space="preserve">Milestone</w:t>
+            </w:r>
+          </w:p>
+        </w:tc>
+        <w:tc>
+          <w:tcPr>
+            <w:shd w:fill="004898" w:val="clear"/>
+            <w:tcMar>
+              <w:top w:type="dxa" w:w="60"/>
+              <w:left w:type="dxa" w:w="80"/>
+              <w:bottom w:type="dxa" w:w="60"/>
+              <w:right w:type="dxa" w:w="80"/>
+            </w:tcMar>
+          </w:tcPr>
+          <w:p>
+            <w:r>
+              <w:rPr>
+                <w:b/>
+                <w:bCs/>
+                <w:color w:val="FFFFFF"/>
+                <w:sz w:val="20"/>
+                <w:szCs w:val="20"/>
+              </w:rPr>
+              <w:t xml:space="preserve">% of Implementation</w:t>
+            </w:r>
+          </w:p>
+        </w:tc>
+        <w:tc>
+          <w:tcPr>
+            <w:shd w:fill="004898" w:val="clear"/>
+            <w:tcMar>
+              <w:top w:type="dxa" w:w="60"/>
+              <w:left w:type="dxa" w:w="80"/>
+              <w:bottom w:type="dxa" w:w="60"/>
+              <w:right w:type="dxa" w:w="80"/>
+            </w:tcMar>
+          </w:tcPr>
+          <w:p>
+            <w:r>
+              <w:rPr>
+                <w:b/>
+                <w:bCs/>
+                <w:color w:val="FFFFFF"/>
+                <w:sz w:val="20"/>
+                <w:szCs w:val="20"/>
+              </w:rPr>
+              <w:t xml:space="preserve">Value (excl. VAT)</w:t>
+            </w:r>
+          </w:p>
+        </w:tc>
+      </w:tr>
+      <w:tr>
+        <w:tc>
+          <w:tcPr>
+            <w:tcMar>
+              <w:top w:type="dxa" w:w="50"/>
+              <w:left w:type="dxa" w:w="80"/>
+              <w:bottom w:type="dxa" w:w="50"/>
+              <w:right w:type="dxa" w:w="80"/>
+            </w:tcMar>
+          </w:tcPr>
+          <w:p>
+            <w:r>
+              <w:rPr>
+                <w:color w:val="1F2937"/>
+                <w:sz w:val="19"/>
+                <w:szCs w:val="19"/>
+              </w:rPr>
+              <w:t xml:space="preserve">Contract signature &amp; mobilisation</w:t>
+            </w:r>
+          </w:p>
+        </w:tc>
+        <w:tc>
+          <w:tcPr>
+            <w:tcMar>
+              <w:top w:type="dxa" w:w="50"/>
+              <w:left w:type="dxa" w:w="80"/>
+              <w:bottom w:type="dxa" w:w="50"/>
+              <w:right w:type="dxa" w:w="80"/>
+            </w:tcMar>
+          </w:tcPr>
+          <w:p>
+            <w:r>
+              <w:rPr>
+                <w:color w:val="1F2937"/>
+                <w:sz w:val="19"/>
+                <w:szCs w:val="19"/>
+              </w:rPr>
+              <w:t xml:space="preserve">10%</w:t>
+            </w:r>
+          </w:p>
+        </w:tc>
+        <w:tc>
+          <w:tcPr>
+            <w:tcMar>
+              <w:top w:type="dxa" w:w="50"/>
+              <w:left w:type="dxa" w:w="80"/>
+              <w:bottom w:type="dxa" w:w="50"/>
+              <w:right w:type="dxa" w:w="80"/>
+            </w:tcMar>
+          </w:tcPr>
+          <w:p>
+            <w:r>
+              <w:rPr>
+                <w:color w:val="1F2937"/>
+                <w:sz w:val="19"/>
+                <w:szCs w:val="19"/>
+              </w:rPr>
+              <w:t xml:space="preserve">R 2 074 300</w:t>
+            </w:r>
+          </w:p>
+        </w:tc>
+      </w:tr>
+      <w:tr>
+        <w:tc>
+          <w:tcPr>
+            <w:shd w:fill="F3F4F6" w:val="clear"/>
+            <w:tcMar>
+              <w:top w:type="dxa" w:w="50"/>
+              <w:left w:type="dxa" w:w="80"/>
+              <w:bottom w:type="dxa" w:w="50"/>
+              <w:right w:type="dxa" w:w="80"/>
+            </w:tcMar>
+          </w:tcPr>
+          <w:p>
+            <w:r>
+              <w:rPr>
+                <w:color w:val="1F2937"/>
+                <w:sz w:val="19"/>
+                <w:szCs w:val="19"/>
+              </w:rPr>
+              <w:t xml:space="preserve">Business Process Analysis sign-off</w:t>
+            </w:r>
+          </w:p>
+        </w:tc>
+        <w:tc>
+          <w:tcPr>
+            <w:shd w:fill="F3F4F6" w:val="clear"/>
+            <w:tcMar>
+              <w:top w:type="dxa" w:w="50"/>
+              <w:left w:type="dxa" w:w="80"/>
+              <w:bottom w:type="dxa" w:w="50"/>
+              <w:right w:type="dxa" w:w="80"/>
+            </w:tcMar>
+          </w:tcPr>
+          <w:p>
+            <w:r>
+              <w:rPr>
+                <w:color w:val="1F2937"/>
+                <w:sz w:val="19"/>
+                <w:szCs w:val="19"/>
+              </w:rPr>
+              <w:t xml:space="preserve">10%</w:t>
+            </w:r>
+          </w:p>
+        </w:tc>
+        <w:tc>
+          <w:tcPr>
+            <w:shd w:fill="F3F4F6" w:val="clear"/>
+            <w:tcMar>
+              <w:top w:type="dxa" w:w="50"/>
+              <w:left w:type="dxa" w:w="80"/>
+              <w:bottom w:type="dxa" w:w="50"/>
+              <w:right w:type="dxa" w:w="80"/>
+            </w:tcMar>
+          </w:tcPr>
+          <w:p>
+            <w:r>
+              <w:rPr>
+                <w:color w:val="1F2937"/>
+                <w:sz w:val="19"/>
+                <w:szCs w:val="19"/>
+              </w:rPr>
+              <w:t xml:space="preserve">R 2 074 300</w:t>
+            </w:r>
+          </w:p>
+        </w:tc>
+      </w:tr>
+      <w:tr>
+        <w:tc>
+          <w:tcPr>
+            <w:tcMar>
+              <w:top w:type="dxa" w:w="50"/>
+              <w:left w:type="dxa" w:w="80"/>
+              <w:bottom w:type="dxa" w:w="50"/>
+              <w:right w:type="dxa" w:w="80"/>
+            </w:tcMar>
+          </w:tcPr>
+          <w:p>
+            <w:r>
+              <w:rPr>
+                <w:color w:val="1F2937"/>
+                <w:sz w:val="19"/>
+                <w:szCs w:val="19"/>
+              </w:rPr>
+              <w:t xml:space="preserve">Solution design approval</w:t>
+            </w:r>
+          </w:p>
+        </w:tc>
+        <w:tc>
+          <w:tcPr>
+            <w:tcMar>
+              <w:top w:type="dxa" w:w="50"/>
+              <w:left w:type="dxa" w:w="80"/>
+              <w:bottom w:type="dxa" w:w="50"/>
+              <w:right w:type="dxa" w:w="80"/>
+            </w:tcMar>
+          </w:tcPr>
+          <w:p>
+            <w:r>
+              <w:rPr>
+                <w:color w:val="1F2937"/>
+                <w:sz w:val="19"/>
+                <w:szCs w:val="19"/>
+              </w:rPr>
+              <w:t xml:space="preserve">15%</w:t>
+            </w:r>
+          </w:p>
+        </w:tc>
+        <w:tc>
+          <w:tcPr>
+            <w:tcMar>
+              <w:top w:type="dxa" w:w="50"/>
+              <w:left w:type="dxa" w:w="80"/>
+              <w:bottom w:type="dxa" w:w="50"/>
+              <w:right w:type="dxa" w:w="80"/>
+            </w:tcMar>
+          </w:tcPr>
+          <w:p>
+            <w:r>
+              <w:rPr>
+                <w:color w:val="1F2937"/>
+                <w:sz w:val="19"/>
+                <w:szCs w:val="19"/>
+              </w:rPr>
+              <w:t xml:space="preserve">R 3 111 450</w:t>
+            </w:r>
+          </w:p>
+        </w:tc>
+      </w:tr>
+      <w:tr>
+        <w:tc>
+          <w:tcPr>
+            <w:shd w:fill="F3F4F6" w:val="clear"/>
+            <w:tcMar>
+              <w:top w:type="dxa" w:w="50"/>
+              <w:left w:type="dxa" w:w="80"/>
+              <w:bottom w:type="dxa" w:w="50"/>
+              <w:right w:type="dxa" w:w="80"/>
+            </w:tcMar>
+          </w:tcPr>
+          <w:p>
+            <w:r>
+              <w:rPr>
+                <w:color w:val="1F2937"/>
+                <w:sz w:val="19"/>
+                <w:szCs w:val="19"/>
+              </w:rPr>
+              <w:t xml:space="preserve">Build, configure &amp; test complete</w:t>
+            </w:r>
+          </w:p>
+        </w:tc>
+        <w:tc>
+          <w:tcPr>
+            <w:shd w:fill="F3F4F6" w:val="clear"/>
+            <w:tcMar>
+              <w:top w:type="dxa" w:w="50"/>
+              <w:left w:type="dxa" w:w="80"/>
+              <w:bottom w:type="dxa" w:w="50"/>
+              <w:right w:type="dxa" w:w="80"/>
+            </w:tcMar>
+          </w:tcPr>
+          <w:p>
+            <w:r>
+              <w:rPr>
+                <w:color w:val="1F2937"/>
+                <w:sz w:val="19"/>
+                <w:szCs w:val="19"/>
+              </w:rPr>
+              <w:t xml:space="preserve">25%</w:t>
+            </w:r>
+          </w:p>
+        </w:tc>
+        <w:tc>
+          <w:tcPr>
+            <w:shd w:fill="F3F4F6" w:val="clear"/>
+            <w:tcMar>
+              <w:top w:type="dxa" w:w="50"/>
+              <w:left w:type="dxa" w:w="80"/>
+              <w:bottom w:type="dxa" w:w="50"/>
+              <w:right w:type="dxa" w:w="80"/>
+            </w:tcMar>
+          </w:tcPr>
+          <w:p>
+            <w:r>
+              <w:rPr>
+                <w:color w:val="1F2937"/>
+                <w:sz w:val="19"/>
+                <w:szCs w:val="19"/>
+              </w:rPr>
+              <w:t xml:space="preserve">R 5 185 750</w:t>
+            </w:r>
+          </w:p>
+        </w:tc>
+      </w:tr>
+      <w:tr>
+        <w:tc>
+          <w:tcPr>
+            <w:tcMar>
+              <w:top w:type="dxa" w:w="50"/>
+              <w:left w:type="dxa" w:w="80"/>
+              <w:bottom w:type="dxa" w:w="50"/>
+              <w:right w:type="dxa" w:w="80"/>
+            </w:tcMar>
+          </w:tcPr>
+          <w:p>
+            <w:r>
+              <w:rPr>
+                <w:color w:val="1F2937"/>
+                <w:sz w:val="19"/>
+                <w:szCs w:val="19"/>
+              </w:rPr>
+              <w:t xml:space="preserve">Data migration &amp; UAT sign-off</w:t>
+            </w:r>
+          </w:p>
+        </w:tc>
+        <w:tc>
+          <w:tcPr>
+            <w:tcMar>
+              <w:top w:type="dxa" w:w="50"/>
+              <w:left w:type="dxa" w:w="80"/>
+              <w:bottom w:type="dxa" w:w="50"/>
+              <w:right w:type="dxa" w:w="80"/>
+            </w:tcMar>
+          </w:tcPr>
+          <w:p>
+            <w:r>
+              <w:rPr>
+                <w:color w:val="1F2937"/>
+                <w:sz w:val="19"/>
+                <w:szCs w:val="19"/>
+              </w:rPr>
+              <w:t xml:space="preserve">15%</w:t>
+            </w:r>
+          </w:p>
+        </w:tc>
+        <w:tc>
+          <w:tcPr>
+            <w:tcMar>
+              <w:top w:type="dxa" w:w="50"/>
+              <w:left w:type="dxa" w:w="80"/>
+              <w:bottom w:type="dxa" w:w="50"/>
+              <w:right w:type="dxa" w:w="80"/>
+            </w:tcMar>
+          </w:tcPr>
+          <w:p>
+            <w:r>
+              <w:rPr>
+                <w:color w:val="1F2937"/>
+                <w:sz w:val="19"/>
+                <w:szCs w:val="19"/>
+              </w:rPr>
+              <w:t xml:space="preserve">R 3 111 450</w:t>
+            </w:r>
+          </w:p>
+        </w:tc>
+      </w:tr>
+      <w:tr>
+        <w:tc>
+          <w:tcPr>
+            <w:shd w:fill="F3F4F6" w:val="clear"/>
+            <w:tcMar>
+              <w:top w:type="dxa" w:w="50"/>
+              <w:left w:type="dxa" w:w="80"/>
+              <w:bottom w:type="dxa" w:w="50"/>
+              <w:right w:type="dxa" w:w="80"/>
+            </w:tcMar>
+          </w:tcPr>
+          <w:p>
+            <w:r>
+              <w:rPr>
+                <w:color w:val="1F2937"/>
+                <w:sz w:val="19"/>
+                <w:szCs w:val="19"/>
+              </w:rPr>
+              <w:t xml:space="preserve">Production go-live</w:t>
+            </w:r>
+          </w:p>
+        </w:tc>
+        <w:tc>
+          <w:tcPr>
+            <w:shd w:fill="F3F4F6" w:val="clear"/>
+            <w:tcMar>
+              <w:top w:type="dxa" w:w="50"/>
+              <w:left w:type="dxa" w:w="80"/>
+              <w:bottom w:type="dxa" w:w="50"/>
+              <w:right w:type="dxa" w:w="80"/>
+            </w:tcMar>
+          </w:tcPr>
+          <w:p>
+            <w:r>
+              <w:rPr>
+                <w:color w:val="1F2937"/>
+                <w:sz w:val="19"/>
+                <w:szCs w:val="19"/>
+              </w:rPr>
+              <w:t xml:space="preserve">15%</w:t>
+            </w:r>
+          </w:p>
+        </w:tc>
+        <w:tc>
+          <w:tcPr>
+            <w:shd w:fill="F3F4F6" w:val="clear"/>
+            <w:tcMar>
+              <w:top w:type="dxa" w:w="50"/>
+              <w:left w:type="dxa" w:w="80"/>
+              <w:bottom w:type="dxa" w:w="50"/>
+              <w:right w:type="dxa" w:w="80"/>
+            </w:tcMar>
+          </w:tcPr>
+          <w:p>
+            <w:r>
+              <w:rPr>
+                <w:color w:val="1F2937"/>
+                <w:sz w:val="19"/>
+                <w:szCs w:val="19"/>
+              </w:rPr>
+              <w:t xml:space="preserve">R 3 111 450</w:t>
+            </w:r>
+          </w:p>
+        </w:tc>
+      </w:tr>
+      <w:tr>
+        <w:tc>
+          <w:tcPr>
+            <w:tcMar>
+              <w:top w:type="dxa" w:w="50"/>
+              <w:left w:type="dxa" w:w="80"/>
+              <w:bottom w:type="dxa" w:w="50"/>
+              <w:right w:type="dxa" w:w="80"/>
+            </w:tcMar>
+          </w:tcPr>
+          <w:p>
+            <w:r>
+              <w:rPr>
+                <w:color w:val="1F2937"/>
+                <w:sz w:val="19"/>
+                <w:szCs w:val="19"/>
+              </w:rPr>
+              <w:t xml:space="preserve">Stabilisation &amp; final acceptance</w:t>
+            </w:r>
+          </w:p>
+        </w:tc>
+        <w:tc>
+          <w:tcPr>
+            <w:tcMar>
+              <w:top w:type="dxa" w:w="50"/>
+              <w:left w:type="dxa" w:w="80"/>
+              <w:bottom w:type="dxa" w:w="50"/>
+              <w:right w:type="dxa" w:w="80"/>
+            </w:tcMar>
+          </w:tcPr>
+          <w:p>
+            <w:r>
+              <w:rPr>
+                <w:color w:val="1F2937"/>
+                <w:sz w:val="19"/>
+                <w:szCs w:val="19"/>
+              </w:rPr>
+              <w:t xml:space="preserve">10%</w:t>
+            </w:r>
+          </w:p>
+        </w:tc>
+        <w:tc>
+          <w:tcPr>
+            <w:tcMar>
+              <w:top w:type="dxa" w:w="50"/>
+              <w:left w:type="dxa" w:w="80"/>
+              <w:bottom w:type="dxa" w:w="50"/>
+              <w:right w:type="dxa" w:w="80"/>
+            </w:tcMar>
+          </w:tcPr>
+          <w:p>
+            <w:r>
+              <w:rPr>
+                <w:color w:val="1F2937"/>
+                <w:sz w:val="19"/>
+                <w:szCs w:val="19"/>
+              </w:rPr>
+              <w:t xml:space="preserve">R 2 074 300</w:t>
+            </w:r>
+          </w:p>
+        </w:tc>
+      </w:tr>
+      <w:tr>
+        <w:tc>
+          <w:tcPr>
+            <w:shd w:fill="F3F4F6" w:val="clear"/>
+            <w:tcMar>
+              <w:top w:type="dxa" w:w="50"/>
+              <w:left w:type="dxa" w:w="80"/>
+              <w:bottom w:type="dxa" w:w="50"/>
+              <w:right w:type="dxa" w:w="80"/>
+            </w:tcMar>
+          </w:tcPr>
+          <w:p>
+            <w:r>
+              <w:rPr>
+                <w:color w:val="1F2937"/>
+                <w:sz w:val="19"/>
+                <w:szCs w:val="19"/>
+              </w:rPr>
+              <w:t xml:space="preserve">Total</w:t>
+            </w:r>
+          </w:p>
+        </w:tc>
+        <w:tc>
+          <w:tcPr>
+            <w:shd w:fill="F3F4F6" w:val="clear"/>
+            <w:tcMar>
+              <w:top w:type="dxa" w:w="50"/>
+              <w:left w:type="dxa" w:w="80"/>
+              <w:bottom w:type="dxa" w:w="50"/>
+              <w:right w:type="dxa" w:w="80"/>
+            </w:tcMar>
+          </w:tcPr>
+          <w:p>
+            <w:r>
+              <w:rPr>
+                <w:color w:val="1F2937"/>
+                <w:sz w:val="19"/>
+                <w:szCs w:val="19"/>
+              </w:rPr>
+              <w:t xml:space="preserve">100%</w:t>
+            </w:r>
+          </w:p>
+        </w:tc>
+        <w:tc>
+          <w:tcPr>
+            <w:shd w:fill="F3F4F6" w:val="clear"/>
+            <w:tcMar>
+              <w:top w:type="dxa" w:w="50"/>
+              <w:left w:type="dxa" w:w="80"/>
+              <w:bottom w:type="dxa" w:w="50"/>
+              <w:right w:type="dxa" w:w="80"/>
+            </w:tcMar>
+          </w:tcPr>
+          <w:p>
+            <w:r>
+              <w:rPr>
+                <w:color w:val="1F2937"/>
+                <w:sz w:val="19"/>
+                <w:szCs w:val="19"/>
+              </w:rPr>
+              <w:t xml:space="preserve">R 20 743 000</w:t>
+            </w:r>
+          </w:p>
+        </w:tc>
+      </w:tr>
+    </w:tbl>
     <w:sectPr>
       <w:pgSz w:w="11906" w:h="16838" w:orient="portrait"/>
       <w:pgMar w:top="1000" w:right="1000" w:bottom="1000" w:left="1000" w:header="708" w:footer="708" w:gutter="0"/>

</xml_diff>

<commit_message>
Add Security & Compliance (8) and Architecture Deep-Dive (9) sections with diagrams
</commit_message>
<xml_diff>
--- a/public/downloads/T2-Technologies-FBM-Thabiso-Sections.docx
+++ b/public/downloads/T2-Technologies-FBM-Thabiso-Sections.docx
@@ -329,6 +329,133 @@
                 <w:szCs w:val="19"/>
               </w:rPr>
               <w:t xml:space="preserve">Programme Governance and Quality Management</w:t>
+            </w:r>
+          </w:p>
+        </w:tc>
+        <w:tc>
+          <w:tcPr>
+            <w:tcMar>
+              <w:top w:type="dxa" w:w="50"/>
+              <w:left w:type="dxa" w:w="80"/>
+              <w:bottom w:type="dxa" w:w="50"/>
+              <w:right w:type="dxa" w:w="80"/>
+            </w:tcMar>
+          </w:tcPr>
+          <w:p>
+            <w:r>
+              <w:rPr>
+                <w:color w:val="1F2937"/>
+                <w:sz w:val="19"/>
+                <w:szCs w:val="19"/>
+              </w:rPr>
+              <w:t xml:space="preserve">Owned by Thabiso</w:t>
+            </w:r>
+          </w:p>
+        </w:tc>
+      </w:tr>
+      <w:tr>
+        <w:tc>
+          <w:tcPr>
+            <w:shd w:fill="F3F4F6" w:val="clear"/>
+            <w:tcMar>
+              <w:top w:type="dxa" w:w="50"/>
+              <w:left w:type="dxa" w:w="80"/>
+              <w:bottom w:type="dxa" w:w="50"/>
+              <w:right w:type="dxa" w:w="80"/>
+            </w:tcMar>
+          </w:tcPr>
+          <w:p>
+            <w:r>
+              <w:rPr>
+                <w:color w:val="1F2937"/>
+                <w:sz w:val="19"/>
+                <w:szCs w:val="19"/>
+              </w:rPr>
+              <w:t xml:space="preserve">8</w:t>
+            </w:r>
+          </w:p>
+        </w:tc>
+        <w:tc>
+          <w:tcPr>
+            <w:shd w:fill="F3F4F6" w:val="clear"/>
+            <w:tcMar>
+              <w:top w:type="dxa" w:w="50"/>
+              <w:left w:type="dxa" w:w="80"/>
+              <w:bottom w:type="dxa" w:w="50"/>
+              <w:right w:type="dxa" w:w="80"/>
+            </w:tcMar>
+          </w:tcPr>
+          <w:p>
+            <w:r>
+              <w:rPr>
+                <w:color w:val="1F2937"/>
+                <w:sz w:val="19"/>
+                <w:szCs w:val="19"/>
+              </w:rPr>
+              <w:t xml:space="preserve">Security and Compliance</w:t>
+            </w:r>
+          </w:p>
+        </w:tc>
+        <w:tc>
+          <w:tcPr>
+            <w:shd w:fill="F3F4F6" w:val="clear"/>
+            <w:tcMar>
+              <w:top w:type="dxa" w:w="50"/>
+              <w:left w:type="dxa" w:w="80"/>
+              <w:bottom w:type="dxa" w:w="50"/>
+              <w:right w:type="dxa" w:w="80"/>
+            </w:tcMar>
+          </w:tcPr>
+          <w:p>
+            <w:r>
+              <w:rPr>
+                <w:color w:val="1F2937"/>
+                <w:sz w:val="19"/>
+                <w:szCs w:val="19"/>
+              </w:rPr>
+              <w:t xml:space="preserve">Owned by Thabiso</w:t>
+            </w:r>
+          </w:p>
+        </w:tc>
+      </w:tr>
+      <w:tr>
+        <w:tc>
+          <w:tcPr>
+            <w:tcMar>
+              <w:top w:type="dxa" w:w="50"/>
+              <w:left w:type="dxa" w:w="80"/>
+              <w:bottom w:type="dxa" w:w="50"/>
+              <w:right w:type="dxa" w:w="80"/>
+            </w:tcMar>
+          </w:tcPr>
+          <w:p>
+            <w:r>
+              <w:rPr>
+                <w:color w:val="1F2937"/>
+                <w:sz w:val="19"/>
+                <w:szCs w:val="19"/>
+              </w:rPr>
+              <w:t xml:space="preserve">9</w:t>
+            </w:r>
+          </w:p>
+        </w:tc>
+        <w:tc>
+          <w:tcPr>
+            <w:tcMar>
+              <w:top w:type="dxa" w:w="50"/>
+              <w:left w:type="dxa" w:w="80"/>
+              <w:bottom w:type="dxa" w:w="50"/>
+              <w:right w:type="dxa" w:w="80"/>
+            </w:tcMar>
+          </w:tcPr>
+          <w:p>
+            <w:r>
+              <w:rPr>
+                <w:color w:val="1F2937"/>
+                <w:sz w:val="19"/>
+                <w:szCs w:val="19"/>
+              </w:rPr>
+              <w:t xml:space="preserve">Architecture Deep-Dive</w:t>
             </w:r>
           </w:p>
         </w:tc>
@@ -3299,6 +3426,2190 @@
           <w:szCs w:val="22"/>
         </w:rPr>
         <w:t xml:space="preserve">Post-release verification and service health monitoring.</w:t>
+      </w:r>
+    </w:p>
+    <w:p>
+      <w:pPr>
+        <w:pStyle w:val="Heading1"/>
+        <w:pageBreakBefore/>
+        <w:spacing w:after="40" w:before="200"/>
+      </w:pPr>
+      <w:r>
+        <w:rPr>
+          <w:b/>
+          <w:bCs/>
+          <w:color w:val="004898"/>
+          <w:sz w:val="30"/>
+          <w:szCs w:val="30"/>
+        </w:rPr>
+        <w:t xml:space="preserve">8. Security and Compliance</w:t>
+      </w:r>
+    </w:p>
+    <w:p>
+      <w:pPr>
+        <w:spacing w:after="160"/>
+      </w:pPr>
+      <w:r>
+        <w:rPr>
+          <w:b/>
+          <w:bCs/>
+          <w:i/>
+          <w:iCs/>
+          <w:color w:val="A39273"/>
+          <w:sz w:val="20"/>
+          <w:szCs w:val="20"/>
+        </w:rPr>
+        <w:t xml:space="preserve">Owned by Thabiso</w:t>
+      </w:r>
+    </w:p>
+    <w:p>
+      <w:pPr>
+        <w:spacing w:after="140"/>
+      </w:pPr>
+      <w:r>
+        <w:rPr>
+          <w:color w:val="1F2937"/>
+          <w:sz w:val="22"/>
+          <w:szCs w:val="22"/>
+        </w:rPr>
+        <w:t xml:space="preserve">Security is treated as a design property of the FBM solution rather than an afterthought. The architecture applies defence-in-depth: independent, mutually reinforcing controls at the perimeter, network, identity, application and data layers, so that the failure of any single control is contained by the layers around it. This section responds to the non-functional security requirements of the Statement of Work (SoW 5.1) and is designed to align with Eskom's information-security standards, which will be confirmed during discovery.</w:t>
+      </w:r>
+    </w:p>
+    <w:p>
+      <w:pPr>
+        <w:spacing w:after="140"/>
+      </w:pPr>
+      <w:r>
+        <w:rPr>
+          <w:color w:val="1F2937"/>
+          <w:sz w:val="22"/>
+          <w:szCs w:val="22"/>
+        </w:rPr>
+        <w:t xml:space="preserve">The controls below describe the intended security posture for the production service. They are stated as design commitments subject to detailed design, Client security standards and the outcome of a joint threat and risk assessment; specific certification scopes are noted as assumptions where relevant.</w:t>
+      </w:r>
+    </w:p>
+    <w:p>
+      <w:pPr>
+        <w:spacing w:after="40" w:before="160"/>
+        <w:jc w:val="center"/>
+      </w:pPr>
+      <w:r>
+        <w:drawing>
+          <wp:inline distT="0" distB="0" distL="0" distR="0">
+            <wp:extent cx="5715000" cy="3648075"/>
+            <wp:effectExtent t="0" r="0" b="0" l="0"/>
+            <wp:docPr id="1" name="" descr="" title=""/>
+            <wp:cNvGraphicFramePr>
+              <a:graphicFrameLocks xmlns:a="http://schemas.openxmlformats.org/drawingml/2006/main" noChangeAspect="1"/>
+            </wp:cNvGraphicFramePr>
+            <a:graphic xmlns:a="http://schemas.openxmlformats.org/drawingml/2006/main">
+              <a:graphicData uri="http://schemas.openxmlformats.org/drawingml/2006/picture">
+                <pic:pic xmlns:pic="http://schemas.openxmlformats.org/drawingml/2006/picture">
+                  <pic:nvPicPr>
+                    <pic:cNvPr id="0" name="" descr=""/>
+                    <pic:cNvPicPr>
+                      <a:picLocks noChangeAspect="1" noChangeArrowheads="1"/>
+                    </pic:cNvPicPr>
+                  </pic:nvPicPr>
+                  <pic:blipFill>
+                    <a:blip r:embed="rId19" cstate="none"/>
+                    <a:srcRect/>
+                    <a:stretch>
+                      <a:fillRect/>
+                    </a:stretch>
+                  </pic:blipFill>
+                  <pic:spPr bwMode="auto">
+                    <a:xfrm>
+                      <a:off x="0" y="0"/>
+                      <a:ext cx="5715000" cy="3648075"/>
+                    </a:xfrm>
+                    <a:prstGeom prst="rect">
+                      <a:avLst/>
+                    </a:prstGeom>
+                  </pic:spPr>
+                </pic:pic>
+              </a:graphicData>
+            </a:graphic>
+          </wp:inline>
+        </w:drawing>
+      </w:r>
+    </w:p>
+    <w:p>
+      <w:pPr>
+        <w:spacing w:after="200"/>
+        <w:jc w:val="center"/>
+      </w:pPr>
+      <w:r>
+        <w:rPr>
+          <w:i/>
+          <w:iCs/>
+          <w:color w:val="6B7280"/>
+          <w:sz w:val="16"/>
+          <w:szCs w:val="16"/>
+        </w:rPr>
+        <w:t xml:space="preserve">Figure 8.1 — Defence-in-depth security layers</w:t>
+      </w:r>
+    </w:p>
+    <w:p>
+      <w:pPr>
+        <w:spacing w:after="80" w:before="160"/>
+      </w:pPr>
+      <w:r>
+        <w:rPr>
+          <w:b/>
+          <w:bCs/>
+          <w:color w:val="1F2937"/>
+          <w:sz w:val="24"/>
+          <w:szCs w:val="24"/>
+        </w:rPr>
+        <w:t xml:space="preserve">8.1 Security Principles</w:t>
+      </w:r>
+    </w:p>
+    <w:p>
+      <w:pPr>
+        <w:pStyle w:val="ListParagraph"/>
+        <w:numPr>
+          <w:ilvl w:val="0"/>
+          <w:numId w:val="1"/>
+        </w:numPr>
+        <w:spacing w:after="60"/>
+      </w:pPr>
+      <w:r>
+        <w:rPr>
+          <w:color w:val="1F2937"/>
+          <w:sz w:val="22"/>
+          <w:szCs w:val="22"/>
+        </w:rPr>
+        <w:t xml:space="preserve">Secure by design and by default — security requirements are captured in the backlog and verified as part of the Definition of Done.</w:t>
+      </w:r>
+    </w:p>
+    <w:p>
+      <w:pPr>
+        <w:pStyle w:val="ListParagraph"/>
+        <w:numPr>
+          <w:ilvl w:val="0"/>
+          <w:numId w:val="1"/>
+        </w:numPr>
+        <w:spacing w:after="60"/>
+      </w:pPr>
+      <w:r>
+        <w:rPr>
+          <w:color w:val="1F2937"/>
+          <w:sz w:val="22"/>
+          <w:szCs w:val="22"/>
+        </w:rPr>
+        <w:t xml:space="preserve">Least privilege and need-to-know — access is granted against defined roles and reviewed periodically.</w:t>
+      </w:r>
+    </w:p>
+    <w:p>
+      <w:pPr>
+        <w:pStyle w:val="ListParagraph"/>
+        <w:numPr>
+          <w:ilvl w:val="0"/>
+          <w:numId w:val="1"/>
+        </w:numPr>
+        <w:spacing w:after="60"/>
+      </w:pPr>
+      <w:r>
+        <w:rPr>
+          <w:color w:val="1F2937"/>
+          <w:sz w:val="22"/>
+          <w:szCs w:val="22"/>
+        </w:rPr>
+        <w:t xml:space="preserve">Defence-in-depth — no single control is relied upon; controls are layered and independent.</w:t>
+      </w:r>
+    </w:p>
+    <w:p>
+      <w:pPr>
+        <w:pStyle w:val="ListParagraph"/>
+        <w:numPr>
+          <w:ilvl w:val="0"/>
+          <w:numId w:val="1"/>
+        </w:numPr>
+        <w:spacing w:after="60"/>
+      </w:pPr>
+      <w:r>
+        <w:rPr>
+          <w:color w:val="1F2937"/>
+          <w:sz w:val="22"/>
+          <w:szCs w:val="22"/>
+        </w:rPr>
+        <w:t xml:space="preserve">Zero-trust orientation — every request is authenticated, authorised and logged regardless of network location.</w:t>
+      </w:r>
+    </w:p>
+    <w:p>
+      <w:pPr>
+        <w:pStyle w:val="ListParagraph"/>
+        <w:numPr>
+          <w:ilvl w:val="0"/>
+          <w:numId w:val="1"/>
+        </w:numPr>
+        <w:spacing w:after="60"/>
+      </w:pPr>
+      <w:r>
+        <w:rPr>
+          <w:color w:val="1F2937"/>
+          <w:sz w:val="22"/>
+          <w:szCs w:val="22"/>
+        </w:rPr>
+        <w:t xml:space="preserve">Encryption everywhere — data is protected in transit and at rest across all tiers.</w:t>
+      </w:r>
+    </w:p>
+    <w:p>
+      <w:pPr>
+        <w:pStyle w:val="ListParagraph"/>
+        <w:numPr>
+          <w:ilvl w:val="0"/>
+          <w:numId w:val="1"/>
+        </w:numPr>
+        <w:spacing w:after="60"/>
+      </w:pPr>
+      <w:r>
+        <w:rPr>
+          <w:color w:val="1F2937"/>
+          <w:sz w:val="22"/>
+          <w:szCs w:val="22"/>
+        </w:rPr>
+        <w:t xml:space="preserve">Segregation of duties and environments — development, test and production are isolated with controlled promotion.</w:t>
+      </w:r>
+    </w:p>
+    <w:p>
+      <w:pPr>
+        <w:spacing w:after="80" w:before="160"/>
+      </w:pPr>
+      <w:r>
+        <w:rPr>
+          <w:b/>
+          <w:bCs/>
+          <w:color w:val="1F2937"/>
+          <w:sz w:val="24"/>
+          <w:szCs w:val="24"/>
+        </w:rPr>
+        <w:t xml:space="preserve">8.2 Identity and Access Management</w:t>
+      </w:r>
+    </w:p>
+    <w:p>
+      <w:pPr>
+        <w:spacing w:after="120"/>
+      </w:pPr>
+      <w:r>
+        <w:rPr>
+          <w:color w:val="1F2937"/>
+          <w:sz w:val="22"/>
+          <w:szCs w:val="22"/>
+        </w:rPr>
+        <w:t xml:space="preserve">Authentication federates to Eskom's identity provider so that FBM never holds primary credentials. Every request passes identity, edge and authorisation controls before reaching application services, and each decision — grant or deny — is written to the immutable audit trail already demonstrated in the prototype.</w:t>
+      </w:r>
+    </w:p>
+    <w:p>
+      <w:pPr>
+        <w:pStyle w:val="ListParagraph"/>
+        <w:numPr>
+          <w:ilvl w:val="0"/>
+          <w:numId w:val="1"/>
+        </w:numPr>
+        <w:spacing w:after="60"/>
+      </w:pPr>
+      <w:r>
+        <w:rPr>
+          <w:color w:val="1F2937"/>
+          <w:sz w:val="22"/>
+          <w:szCs w:val="22"/>
+        </w:rPr>
+        <w:t xml:space="preserve">Single sign-on via Microsoft Entra ID (Azure AD) with multi-factor authentication enforced for all users.</w:t>
+      </w:r>
+    </w:p>
+    <w:p>
+      <w:pPr>
+        <w:pStyle w:val="ListParagraph"/>
+        <w:numPr>
+          <w:ilvl w:val="0"/>
+          <w:numId w:val="1"/>
+        </w:numPr>
+        <w:spacing w:after="60"/>
+      </w:pPr>
+      <w:r>
+        <w:rPr>
+          <w:color w:val="1F2937"/>
+          <w:sz w:val="22"/>
+          <w:szCs w:val="22"/>
+        </w:rPr>
+        <w:t xml:space="preserve">Role-based access control mapped to the FBM capability model demonstrated in the application (e.g. view, edit network, manage meters, resolve exceptions, initiate audits, export, view audit log).</w:t>
+      </w:r>
+    </w:p>
+    <w:p>
+      <w:pPr>
+        <w:pStyle w:val="ListParagraph"/>
+        <w:numPr>
+          <w:ilvl w:val="0"/>
+          <w:numId w:val="1"/>
+        </w:numPr>
+        <w:spacing w:after="60"/>
+      </w:pPr>
+      <w:r>
+        <w:rPr>
+          <w:color w:val="1F2937"/>
+          <w:sz w:val="22"/>
+          <w:szCs w:val="22"/>
+        </w:rPr>
+        <w:t xml:space="preserve">Privileged Identity Management with just-in-time elevation and approval for administrative roles.</w:t>
+      </w:r>
+    </w:p>
+    <w:p>
+      <w:pPr>
+        <w:pStyle w:val="ListParagraph"/>
+        <w:numPr>
+          <w:ilvl w:val="0"/>
+          <w:numId w:val="1"/>
+        </w:numPr>
+        <w:spacing w:after="60"/>
+      </w:pPr>
+      <w:r>
+        <w:rPr>
+          <w:color w:val="1F2937"/>
+          <w:sz w:val="22"/>
+          <w:szCs w:val="22"/>
+        </w:rPr>
+        <w:t xml:space="preserve">Joiner-Mover-Leaver process integration so access follows the user lifecycle.</w:t>
+      </w:r>
+    </w:p>
+    <w:p>
+      <w:pPr>
+        <w:pStyle w:val="ListParagraph"/>
+        <w:numPr>
+          <w:ilvl w:val="0"/>
+          <w:numId w:val="1"/>
+        </w:numPr>
+        <w:spacing w:after="60"/>
+      </w:pPr>
+      <w:r>
+        <w:rPr>
+          <w:color w:val="1F2937"/>
+          <w:sz w:val="22"/>
+          <w:szCs w:val="22"/>
+        </w:rPr>
+        <w:t xml:space="preserve">Periodic access recertification and automatic session expiry.</w:t>
+      </w:r>
+    </w:p>
+    <w:p>
+      <w:pPr>
+        <w:spacing w:after="40" w:before="160"/>
+        <w:jc w:val="center"/>
+      </w:pPr>
+      <w:r>
+        <w:drawing>
+          <wp:inline distT="0" distB="0" distL="0" distR="0">
+            <wp:extent cx="5715000" cy="2266950"/>
+            <wp:effectExtent t="0" r="0" b="0" l="0"/>
+            <wp:docPr id="1" name="" descr="" title=""/>
+            <wp:cNvGraphicFramePr>
+              <a:graphicFrameLocks xmlns:a="http://schemas.openxmlformats.org/drawingml/2006/main" noChangeAspect="1"/>
+            </wp:cNvGraphicFramePr>
+            <a:graphic xmlns:a="http://schemas.openxmlformats.org/drawingml/2006/main">
+              <a:graphicData uri="http://schemas.openxmlformats.org/drawingml/2006/picture">
+                <pic:pic xmlns:pic="http://schemas.openxmlformats.org/drawingml/2006/picture">
+                  <pic:nvPicPr>
+                    <pic:cNvPr id="0" name="" descr=""/>
+                    <pic:cNvPicPr>
+                      <a:picLocks noChangeAspect="1" noChangeArrowheads="1"/>
+                    </pic:cNvPicPr>
+                  </pic:nvPicPr>
+                  <pic:blipFill>
+                    <a:blip r:embed="rId20" cstate="none"/>
+                    <a:srcRect/>
+                    <a:stretch>
+                      <a:fillRect/>
+                    </a:stretch>
+                  </pic:blipFill>
+                  <pic:spPr bwMode="auto">
+                    <a:xfrm>
+                      <a:off x="0" y="0"/>
+                      <a:ext cx="5715000" cy="2266950"/>
+                    </a:xfrm>
+                    <a:prstGeom prst="rect">
+                      <a:avLst/>
+                    </a:prstGeom>
+                  </pic:spPr>
+                </pic:pic>
+              </a:graphicData>
+            </a:graphic>
+          </wp:inline>
+        </w:drawing>
+      </w:r>
+    </w:p>
+    <w:p>
+      <w:pPr>
+        <w:spacing w:after="200"/>
+        <w:jc w:val="center"/>
+      </w:pPr>
+      <w:r>
+        <w:rPr>
+          <w:i/>
+          <w:iCs/>
+          <w:color w:val="6B7280"/>
+          <w:sz w:val="16"/>
+          <w:szCs w:val="16"/>
+        </w:rPr>
+        <w:t xml:space="preserve">Figure 8.2 — Authenticated request &amp; access-control flow</w:t>
+      </w:r>
+    </w:p>
+    <w:p>
+      <w:pPr>
+        <w:spacing w:after="80" w:before="160"/>
+      </w:pPr>
+      <w:r>
+        <w:rPr>
+          <w:b/>
+          <w:bCs/>
+          <w:color w:val="1F2937"/>
+          <w:sz w:val="24"/>
+          <w:szCs w:val="24"/>
+        </w:rPr>
+        <w:t xml:space="preserve">8.3 Data Protection and Privacy</w:t>
+      </w:r>
+    </w:p>
+    <w:p>
+      <w:pPr>
+        <w:pStyle w:val="ListParagraph"/>
+        <w:numPr>
+          <w:ilvl w:val="0"/>
+          <w:numId w:val="1"/>
+        </w:numPr>
+        <w:spacing w:after="60"/>
+      </w:pPr>
+      <w:r>
+        <w:rPr>
+          <w:color w:val="1F2937"/>
+          <w:sz w:val="22"/>
+          <w:szCs w:val="22"/>
+        </w:rPr>
+        <w:t xml:space="preserve">Encryption at rest using AES-256 (Transparent Data Encryption for Azure SQL; server-side encryption for storage).</w:t>
+      </w:r>
+    </w:p>
+    <w:p>
+      <w:pPr>
+        <w:pStyle w:val="ListParagraph"/>
+        <w:numPr>
+          <w:ilvl w:val="0"/>
+          <w:numId w:val="1"/>
+        </w:numPr>
+        <w:spacing w:after="60"/>
+      </w:pPr>
+      <w:r>
+        <w:rPr>
+          <w:color w:val="1F2937"/>
+          <w:sz w:val="22"/>
+          <w:szCs w:val="22"/>
+        </w:rPr>
+        <w:t xml:space="preserve">Encryption in transit using TLS 1.3 for all external and service-to-service traffic.</w:t>
+      </w:r>
+    </w:p>
+    <w:p>
+      <w:pPr>
+        <w:pStyle w:val="ListParagraph"/>
+        <w:numPr>
+          <w:ilvl w:val="0"/>
+          <w:numId w:val="1"/>
+        </w:numPr>
+        <w:spacing w:after="60"/>
+      </w:pPr>
+      <w:r>
+        <w:rPr>
+          <w:color w:val="1F2937"/>
+          <w:sz w:val="22"/>
+          <w:szCs w:val="22"/>
+        </w:rPr>
+        <w:t xml:space="preserve">Data residency within the Republic of South Africa (Azure South Africa North), addressing data-sovereignty requirements.</w:t>
+      </w:r>
+    </w:p>
+    <w:p>
+      <w:pPr>
+        <w:pStyle w:val="ListParagraph"/>
+        <w:numPr>
+          <w:ilvl w:val="0"/>
+          <w:numId w:val="1"/>
+        </w:numPr>
+        <w:spacing w:after="60"/>
+      </w:pPr>
+      <w:r>
+        <w:rPr>
+          <w:color w:val="1F2937"/>
+          <w:sz w:val="22"/>
+          <w:szCs w:val="22"/>
+        </w:rPr>
+        <w:t xml:space="preserve">Personally identifiable information masked or de-identified in non-production environments.</w:t>
+      </w:r>
+    </w:p>
+    <w:p>
+      <w:pPr>
+        <w:pStyle w:val="ListParagraph"/>
+        <w:numPr>
+          <w:ilvl w:val="0"/>
+          <w:numId w:val="1"/>
+        </w:numPr>
+        <w:spacing w:after="60"/>
+      </w:pPr>
+      <w:r>
+        <w:rPr>
+          <w:color w:val="1F2937"/>
+          <w:sz w:val="22"/>
+          <w:szCs w:val="22"/>
+        </w:rPr>
+        <w:t xml:space="preserve">Defined data-classification, retention and secure-disposal policies.</w:t>
+      </w:r>
+    </w:p>
+    <w:p>
+      <w:pPr>
+        <w:pStyle w:val="ListParagraph"/>
+        <w:numPr>
+          <w:ilvl w:val="0"/>
+          <w:numId w:val="1"/>
+        </w:numPr>
+        <w:spacing w:after="60"/>
+      </w:pPr>
+      <w:r>
+        <w:rPr>
+          <w:color w:val="1F2937"/>
+          <w:sz w:val="22"/>
+          <w:szCs w:val="22"/>
+        </w:rPr>
+        <w:t xml:space="preserve">POPIA-aligned processing, including lawful basis, data-subject rights handling and records of processing.</w:t>
+      </w:r>
+    </w:p>
+    <w:p>
+      <w:pPr>
+        <w:spacing w:after="80" w:before="160"/>
+      </w:pPr>
+      <w:r>
+        <w:rPr>
+          <w:b/>
+          <w:bCs/>
+          <w:color w:val="1F2937"/>
+          <w:sz w:val="24"/>
+          <w:szCs w:val="24"/>
+        </w:rPr>
+        <w:t xml:space="preserve">8.4 Application and Platform Security</w:t>
+      </w:r>
+    </w:p>
+    <w:p>
+      <w:pPr>
+        <w:pStyle w:val="ListParagraph"/>
+        <w:numPr>
+          <w:ilvl w:val="0"/>
+          <w:numId w:val="1"/>
+        </w:numPr>
+        <w:spacing w:after="60"/>
+      </w:pPr>
+      <w:r>
+        <w:rPr>
+          <w:color w:val="1F2937"/>
+          <w:sz w:val="22"/>
+          <w:szCs w:val="22"/>
+        </w:rPr>
+        <w:t xml:space="preserve">Secure SDLC with threat modelling, secure-coding standards and mandatory peer review.</w:t>
+      </w:r>
+    </w:p>
+    <w:p>
+      <w:pPr>
+        <w:pStyle w:val="ListParagraph"/>
+        <w:numPr>
+          <w:ilvl w:val="0"/>
+          <w:numId w:val="1"/>
+        </w:numPr>
+        <w:spacing w:after="60"/>
+      </w:pPr>
+      <w:r>
+        <w:rPr>
+          <w:color w:val="1F2937"/>
+          <w:sz w:val="22"/>
+          <w:szCs w:val="22"/>
+        </w:rPr>
+        <w:t xml:space="preserve">Static and dynamic application security testing (SAST/DAST) and software-composition analysis in the CI/CD pipeline.</w:t>
+      </w:r>
+    </w:p>
+    <w:p>
+      <w:pPr>
+        <w:pStyle w:val="ListParagraph"/>
+        <w:numPr>
+          <w:ilvl w:val="0"/>
+          <w:numId w:val="1"/>
+        </w:numPr>
+        <w:spacing w:after="60"/>
+      </w:pPr>
+      <w:r>
+        <w:rPr>
+          <w:color w:val="1F2937"/>
+          <w:sz w:val="22"/>
+          <w:szCs w:val="22"/>
+        </w:rPr>
+        <w:t xml:space="preserve">Container image scanning and hardened, patched base images.</w:t>
+      </w:r>
+    </w:p>
+    <w:p>
+      <w:pPr>
+        <w:pStyle w:val="ListParagraph"/>
+        <w:numPr>
+          <w:ilvl w:val="0"/>
+          <w:numId w:val="1"/>
+        </w:numPr>
+        <w:spacing w:after="60"/>
+      </w:pPr>
+      <w:r>
+        <w:rPr>
+          <w:color w:val="1F2937"/>
+          <w:sz w:val="22"/>
+          <w:szCs w:val="22"/>
+        </w:rPr>
+        <w:t xml:space="preserve">Secrets and keys held in Azure Key Vault — never in source control or configuration files.</w:t>
+      </w:r>
+    </w:p>
+    <w:p>
+      <w:pPr>
+        <w:pStyle w:val="ListParagraph"/>
+        <w:numPr>
+          <w:ilvl w:val="0"/>
+          <w:numId w:val="1"/>
+        </w:numPr>
+        <w:spacing w:after="60"/>
+      </w:pPr>
+      <w:r>
+        <w:rPr>
+          <w:color w:val="1F2937"/>
+          <w:sz w:val="22"/>
+          <w:szCs w:val="22"/>
+        </w:rPr>
+        <w:t xml:space="preserve">Web Application Firewall, DDoS protection and rate limiting at the edge.</w:t>
+      </w:r>
+    </w:p>
+    <w:p>
+      <w:pPr>
+        <w:pStyle w:val="ListParagraph"/>
+        <w:numPr>
+          <w:ilvl w:val="0"/>
+          <w:numId w:val="1"/>
+        </w:numPr>
+        <w:spacing w:after="60"/>
+      </w:pPr>
+      <w:r>
+        <w:rPr>
+          <w:color w:val="1F2937"/>
+          <w:sz w:val="22"/>
+          <w:szCs w:val="22"/>
+        </w:rPr>
+        <w:t xml:space="preserve">Independent penetration testing before every major production release and periodically thereafter.</w:t>
+      </w:r>
+    </w:p>
+    <w:p>
+      <w:pPr>
+        <w:spacing w:after="80" w:before="160"/>
+      </w:pPr>
+      <w:r>
+        <w:rPr>
+          <w:b/>
+          <w:bCs/>
+          <w:color w:val="1F2937"/>
+          <w:sz w:val="24"/>
+          <w:szCs w:val="24"/>
+        </w:rPr>
+        <w:t xml:space="preserve">8.5 Monitoring, Audit and Incident Response</w:t>
+      </w:r>
+    </w:p>
+    <w:p>
+      <w:pPr>
+        <w:pStyle w:val="ListParagraph"/>
+        <w:numPr>
+          <w:ilvl w:val="0"/>
+          <w:numId w:val="1"/>
+        </w:numPr>
+        <w:spacing w:after="60"/>
+      </w:pPr>
+      <w:r>
+        <w:rPr>
+          <w:color w:val="1F2937"/>
+          <w:sz w:val="22"/>
+          <w:szCs w:val="22"/>
+        </w:rPr>
+        <w:t xml:space="preserve">Centralised logging and SIEM via Azure Monitor, Log Analytics and Microsoft Sentinel.</w:t>
+      </w:r>
+    </w:p>
+    <w:p>
+      <w:pPr>
+        <w:pStyle w:val="ListParagraph"/>
+        <w:numPr>
+          <w:ilvl w:val="0"/>
+          <w:numId w:val="1"/>
+        </w:numPr>
+        <w:spacing w:after="60"/>
+      </w:pPr>
+      <w:r>
+        <w:rPr>
+          <w:color w:val="1F2937"/>
+          <w:sz w:val="22"/>
+          <w:szCs w:val="22"/>
+        </w:rPr>
+        <w:t xml:space="preserve">Immutable, tamper-evident audit trail of security-relevant events (demonstrated in the prototype's Access &amp; Audit module).</w:t>
+      </w:r>
+    </w:p>
+    <w:p>
+      <w:pPr>
+        <w:pStyle w:val="ListParagraph"/>
+        <w:numPr>
+          <w:ilvl w:val="0"/>
+          <w:numId w:val="1"/>
+        </w:numPr>
+        <w:spacing w:after="60"/>
+      </w:pPr>
+      <w:r>
+        <w:rPr>
+          <w:color w:val="1F2937"/>
+          <w:sz w:val="22"/>
+          <w:szCs w:val="22"/>
+        </w:rPr>
+        <w:t xml:space="preserve">Real-time alerting on anomalous authentication, authorisation and data-access events.</w:t>
+      </w:r>
+    </w:p>
+    <w:p>
+      <w:pPr>
+        <w:pStyle w:val="ListParagraph"/>
+        <w:numPr>
+          <w:ilvl w:val="0"/>
+          <w:numId w:val="1"/>
+        </w:numPr>
+        <w:spacing w:after="60"/>
+      </w:pPr>
+      <w:r>
+        <w:rPr>
+          <w:color w:val="1F2937"/>
+          <w:sz w:val="22"/>
+          <w:szCs w:val="22"/>
+        </w:rPr>
+        <w:t xml:space="preserve">Documented incident-response runbooks with defined severities and escalation paths.</w:t>
+      </w:r>
+    </w:p>
+    <w:p>
+      <w:pPr>
+        <w:pStyle w:val="ListParagraph"/>
+        <w:numPr>
+          <w:ilvl w:val="0"/>
+          <w:numId w:val="1"/>
+        </w:numPr>
+        <w:spacing w:after="60"/>
+      </w:pPr>
+      <w:r>
+        <w:rPr>
+          <w:color w:val="1F2937"/>
+          <w:sz w:val="22"/>
+          <w:szCs w:val="22"/>
+        </w:rPr>
+        <w:t xml:space="preserve">POPIA breach-notification handling within the regulated timeframe, with e-discovery support.</w:t>
+      </w:r>
+    </w:p>
+    <w:p>
+      <w:pPr>
+        <w:pStyle w:val="ListParagraph"/>
+        <w:numPr>
+          <w:ilvl w:val="0"/>
+          <w:numId w:val="1"/>
+        </w:numPr>
+        <w:spacing w:after="60"/>
+      </w:pPr>
+      <w:r>
+        <w:rPr>
+          <w:color w:val="1F2937"/>
+          <w:sz w:val="22"/>
+          <w:szCs w:val="22"/>
+        </w:rPr>
+        <w:t xml:space="preserve">Regular control testing, log review and continuous-improvement feedback into the backlog.</w:t>
+      </w:r>
+    </w:p>
+    <w:p>
+      <w:pPr>
+        <w:spacing w:after="80" w:before="160"/>
+      </w:pPr>
+      <w:r>
+        <w:rPr>
+          <w:b/>
+          <w:bCs/>
+          <w:color w:val="1F2937"/>
+          <w:sz w:val="24"/>
+          <w:szCs w:val="24"/>
+        </w:rPr>
+        <w:t xml:space="preserve">8.6 Compliance and Standards Alignment</w:t>
+      </w:r>
+    </w:p>
+    <w:p>
+      <w:pPr>
+        <w:spacing w:after="120"/>
+      </w:pPr>
+      <w:r>
+        <w:rPr>
+          <w:color w:val="1F2937"/>
+          <w:sz w:val="22"/>
+          <w:szCs w:val="22"/>
+        </w:rPr>
+        <w:t xml:space="preserve">The solution is designed to support the following frameworks. The matrix shows which control domains each framework informs; certification scope and supporting evidence are to be confirmed with T2 Technologies and the Client.</w:t>
+      </w:r>
+    </w:p>
+    <w:tbl>
+      <w:tblPr>
+        <w:tblW w:type="pct" w:w="100%"/>
+        <w:tblBorders>
+          <w:top w:val="single" w:color="D1D5DB" w:sz="4"/>
+          <w:left w:val="single" w:color="D1D5DB" w:sz="4"/>
+          <w:bottom w:val="single" w:color="D1D5DB" w:sz="4"/>
+          <w:right w:val="single" w:color="D1D5DB" w:sz="4"/>
+          <w:insideH w:val="single" w:color="D1D5DB" w:sz="4"/>
+          <w:insideV w:val="single" w:color="D1D5DB" w:sz="4"/>
+        </w:tblBorders>
+      </w:tblPr>
+      <w:tblGrid>
+        <w:gridCol w:w="100"/>
+        <w:gridCol w:w="100"/>
+      </w:tblGrid>
+      <w:tr>
+        <w:trPr>
+          <w:tblHeader/>
+        </w:trPr>
+        <w:tc>
+          <w:tcPr>
+            <w:shd w:fill="004898" w:val="clear"/>
+            <w:tcMar>
+              <w:top w:type="dxa" w:w="60"/>
+              <w:left w:type="dxa" w:w="80"/>
+              <w:bottom w:type="dxa" w:w="60"/>
+              <w:right w:type="dxa" w:w="80"/>
+            </w:tcMar>
+          </w:tcPr>
+          <w:p>
+            <w:r>
+              <w:rPr>
+                <w:b/>
+                <w:bCs/>
+                <w:color w:val="FFFFFF"/>
+                <w:sz w:val="20"/>
+                <w:szCs w:val="20"/>
+              </w:rPr>
+              <w:t xml:space="preserve">Framework</w:t>
+            </w:r>
+          </w:p>
+        </w:tc>
+        <w:tc>
+          <w:tcPr>
+            <w:shd w:fill="004898" w:val="clear"/>
+            <w:tcMar>
+              <w:top w:type="dxa" w:w="60"/>
+              <w:left w:type="dxa" w:w="80"/>
+              <w:bottom w:type="dxa" w:w="60"/>
+              <w:right w:type="dxa" w:w="80"/>
+            </w:tcMar>
+          </w:tcPr>
+          <w:p>
+            <w:r>
+              <w:rPr>
+                <w:b/>
+                <w:bCs/>
+                <w:color w:val="FFFFFF"/>
+                <w:sz w:val="20"/>
+                <w:szCs w:val="20"/>
+              </w:rPr>
+              <w:t xml:space="preserve">Relevance to FBM</w:t>
+            </w:r>
+          </w:p>
+        </w:tc>
+      </w:tr>
+      <w:tr>
+        <w:tc>
+          <w:tcPr>
+            <w:tcMar>
+              <w:top w:type="dxa" w:w="50"/>
+              <w:left w:type="dxa" w:w="80"/>
+              <w:bottom w:type="dxa" w:w="50"/>
+              <w:right w:type="dxa" w:w="80"/>
+            </w:tcMar>
+          </w:tcPr>
+          <w:p>
+            <w:r>
+              <w:rPr>
+                <w:color w:val="1F2937"/>
+                <w:sz w:val="19"/>
+                <w:szCs w:val="19"/>
+              </w:rPr>
+              <w:t xml:space="preserve">POPIA (South Africa)</w:t>
+            </w:r>
+          </w:p>
+        </w:tc>
+        <w:tc>
+          <w:tcPr>
+            <w:tcMar>
+              <w:top w:type="dxa" w:w="50"/>
+              <w:left w:type="dxa" w:w="80"/>
+              <w:bottom w:type="dxa" w:w="50"/>
+              <w:right w:type="dxa" w:w="80"/>
+            </w:tcMar>
+          </w:tcPr>
+          <w:p>
+            <w:r>
+              <w:rPr>
+                <w:color w:val="1F2937"/>
+                <w:sz w:val="19"/>
+                <w:szCs w:val="19"/>
+              </w:rPr>
+              <w:t xml:space="preserve">Primary data-protection law governing processing of personal information.</w:t>
+            </w:r>
+          </w:p>
+        </w:tc>
+      </w:tr>
+      <w:tr>
+        <w:tc>
+          <w:tcPr>
+            <w:shd w:fill="F3F4F6" w:val="clear"/>
+            <w:tcMar>
+              <w:top w:type="dxa" w:w="50"/>
+              <w:left w:type="dxa" w:w="80"/>
+              <w:bottom w:type="dxa" w:w="50"/>
+              <w:right w:type="dxa" w:w="80"/>
+            </w:tcMar>
+          </w:tcPr>
+          <w:p>
+            <w:r>
+              <w:rPr>
+                <w:color w:val="1F2937"/>
+                <w:sz w:val="19"/>
+                <w:szCs w:val="19"/>
+              </w:rPr>
+              <w:t xml:space="preserve">ISO/IEC 27001</w:t>
+            </w:r>
+          </w:p>
+        </w:tc>
+        <w:tc>
+          <w:tcPr>
+            <w:shd w:fill="F3F4F6" w:val="clear"/>
+            <w:tcMar>
+              <w:top w:type="dxa" w:w="50"/>
+              <w:left w:type="dxa" w:w="80"/>
+              <w:bottom w:type="dxa" w:w="50"/>
+              <w:right w:type="dxa" w:w="80"/>
+            </w:tcMar>
+          </w:tcPr>
+          <w:p>
+            <w:r>
+              <w:rPr>
+                <w:color w:val="1F2937"/>
+                <w:sz w:val="19"/>
+                <w:szCs w:val="19"/>
+              </w:rPr>
+              <w:t xml:space="preserve">Information Security Management System baseline for controls and governance.</w:t>
+            </w:r>
+          </w:p>
+        </w:tc>
+      </w:tr>
+      <w:tr>
+        <w:tc>
+          <w:tcPr>
+            <w:tcMar>
+              <w:top w:type="dxa" w:w="50"/>
+              <w:left w:type="dxa" w:w="80"/>
+              <w:bottom w:type="dxa" w:w="50"/>
+              <w:right w:type="dxa" w:w="80"/>
+            </w:tcMar>
+          </w:tcPr>
+          <w:p>
+            <w:r>
+              <w:rPr>
+                <w:color w:val="1F2937"/>
+                <w:sz w:val="19"/>
+                <w:szCs w:val="19"/>
+              </w:rPr>
+              <w:t xml:space="preserve">ISO/IEC 27017 &amp; 27018</w:t>
+            </w:r>
+          </w:p>
+        </w:tc>
+        <w:tc>
+          <w:tcPr>
+            <w:tcMar>
+              <w:top w:type="dxa" w:w="50"/>
+              <w:left w:type="dxa" w:w="80"/>
+              <w:bottom w:type="dxa" w:w="50"/>
+              <w:right w:type="dxa" w:w="80"/>
+            </w:tcMar>
+          </w:tcPr>
+          <w:p>
+            <w:r>
+              <w:rPr>
+                <w:color w:val="1F2937"/>
+                <w:sz w:val="19"/>
+                <w:szCs w:val="19"/>
+              </w:rPr>
+              <w:t xml:space="preserve">Cloud-specific security controls and protection of PII in the cloud.</w:t>
+            </w:r>
+          </w:p>
+        </w:tc>
+      </w:tr>
+      <w:tr>
+        <w:tc>
+          <w:tcPr>
+            <w:shd w:fill="F3F4F6" w:val="clear"/>
+            <w:tcMar>
+              <w:top w:type="dxa" w:w="50"/>
+              <w:left w:type="dxa" w:w="80"/>
+              <w:bottom w:type="dxa" w:w="50"/>
+              <w:right w:type="dxa" w:w="80"/>
+            </w:tcMar>
+          </w:tcPr>
+          <w:p>
+            <w:r>
+              <w:rPr>
+                <w:color w:val="1F2937"/>
+                <w:sz w:val="19"/>
+                <w:szCs w:val="19"/>
+              </w:rPr>
+              <w:t xml:space="preserve">SOC 2 Type II</w:t>
+            </w:r>
+          </w:p>
+        </w:tc>
+        <w:tc>
+          <w:tcPr>
+            <w:shd w:fill="F3F4F6" w:val="clear"/>
+            <w:tcMar>
+              <w:top w:type="dxa" w:w="50"/>
+              <w:left w:type="dxa" w:w="80"/>
+              <w:bottom w:type="dxa" w:w="50"/>
+              <w:right w:type="dxa" w:w="80"/>
+            </w:tcMar>
+          </w:tcPr>
+          <w:p>
+            <w:r>
+              <w:rPr>
+                <w:color w:val="1F2937"/>
+                <w:sz w:val="19"/>
+                <w:szCs w:val="19"/>
+              </w:rPr>
+              <w:t xml:space="preserve">Independent attestation of security, availability and confidentiality controls.</w:t>
+            </w:r>
+          </w:p>
+        </w:tc>
+      </w:tr>
+      <w:tr>
+        <w:tc>
+          <w:tcPr>
+            <w:tcMar>
+              <w:top w:type="dxa" w:w="50"/>
+              <w:left w:type="dxa" w:w="80"/>
+              <w:bottom w:type="dxa" w:w="50"/>
+              <w:right w:type="dxa" w:w="80"/>
+            </w:tcMar>
+          </w:tcPr>
+          <w:p>
+            <w:r>
+              <w:rPr>
+                <w:color w:val="1F2937"/>
+                <w:sz w:val="19"/>
+                <w:szCs w:val="19"/>
+              </w:rPr>
+              <w:t xml:space="preserve">GDPR</w:t>
+            </w:r>
+          </w:p>
+        </w:tc>
+        <w:tc>
+          <w:tcPr>
+            <w:tcMar>
+              <w:top w:type="dxa" w:w="50"/>
+              <w:left w:type="dxa" w:w="80"/>
+              <w:bottom w:type="dxa" w:w="50"/>
+              <w:right w:type="dxa" w:w="80"/>
+            </w:tcMar>
+          </w:tcPr>
+          <w:p>
+            <w:r>
+              <w:rPr>
+                <w:color w:val="1F2937"/>
+                <w:sz w:val="19"/>
+                <w:szCs w:val="19"/>
+              </w:rPr>
+              <w:t xml:space="preserve">Applied as good practice for privacy-by-design and data-subject rights.</w:t>
+            </w:r>
+          </w:p>
+        </w:tc>
+      </w:tr>
+      <w:tr>
+        <w:tc>
+          <w:tcPr>
+            <w:shd w:fill="F3F4F6" w:val="clear"/>
+            <w:tcMar>
+              <w:top w:type="dxa" w:w="50"/>
+              <w:left w:type="dxa" w:w="80"/>
+              <w:bottom w:type="dxa" w:w="50"/>
+              <w:right w:type="dxa" w:w="80"/>
+            </w:tcMar>
+          </w:tcPr>
+          <w:p>
+            <w:r>
+              <w:rPr>
+                <w:color w:val="1F2937"/>
+                <w:sz w:val="19"/>
+                <w:szCs w:val="19"/>
+              </w:rPr>
+              <w:t xml:space="preserve">NIST Cybersecurity Framework</w:t>
+            </w:r>
+          </w:p>
+        </w:tc>
+        <w:tc>
+          <w:tcPr>
+            <w:shd w:fill="F3F4F6" w:val="clear"/>
+            <w:tcMar>
+              <w:top w:type="dxa" w:w="50"/>
+              <w:left w:type="dxa" w:w="80"/>
+              <w:bottom w:type="dxa" w:w="50"/>
+              <w:right w:type="dxa" w:w="80"/>
+            </w:tcMar>
+          </w:tcPr>
+          <w:p>
+            <w:r>
+              <w:rPr>
+                <w:color w:val="1F2937"/>
+                <w:sz w:val="19"/>
+                <w:szCs w:val="19"/>
+              </w:rPr>
+              <w:t xml:space="preserve">Structures the overall posture: Identify, Protect, Detect, Respond, Recover.</w:t>
+            </w:r>
+          </w:p>
+        </w:tc>
+      </w:tr>
+      <w:tr>
+        <w:tc>
+          <w:tcPr>
+            <w:tcMar>
+              <w:top w:type="dxa" w:w="50"/>
+              <w:left w:type="dxa" w:w="80"/>
+              <w:bottom w:type="dxa" w:w="50"/>
+              <w:right w:type="dxa" w:w="80"/>
+            </w:tcMar>
+          </w:tcPr>
+          <w:p>
+            <w:r>
+              <w:rPr>
+                <w:color w:val="1F2937"/>
+                <w:sz w:val="19"/>
+                <w:szCs w:val="19"/>
+              </w:rPr>
+              <w:t xml:space="preserve">Cybercrimes Act &amp; King IV</w:t>
+            </w:r>
+          </w:p>
+        </w:tc>
+        <w:tc>
+          <w:tcPr>
+            <w:tcMar>
+              <w:top w:type="dxa" w:w="50"/>
+              <w:left w:type="dxa" w:w="80"/>
+              <w:bottom w:type="dxa" w:w="50"/>
+              <w:right w:type="dxa" w:w="80"/>
+            </w:tcMar>
+          </w:tcPr>
+          <w:p>
+            <w:r>
+              <w:rPr>
+                <w:color w:val="1F2937"/>
+                <w:sz w:val="19"/>
+                <w:szCs w:val="19"/>
+              </w:rPr>
+              <w:t xml:space="preserve">South African statutory and governance context for security and oversight.</w:t>
+            </w:r>
+          </w:p>
+        </w:tc>
+      </w:tr>
+    </w:tbl>
+    <w:p>
+      <w:pPr>
+        <w:spacing w:after="140" w:before="100"/>
+      </w:pPr>
+      <w:r>
+        <w:rPr>
+          <w:i/>
+          <w:iCs/>
+          <w:color w:val="6B7280"/>
+          <w:sz w:val="18"/>
+          <w:szCs w:val="18"/>
+        </w:rPr>
+        <w:t xml:space="preserve">Where T2 Technologies does not currently hold a specific certification, the commitment is to operate in alignment with the standard and to pursue certification within a timeframe agreed with the Client. All items are subject to confirmation during discovery.</w:t>
+      </w:r>
+    </w:p>
+    <w:p>
+      <w:pPr>
+        <w:spacing w:after="40" w:before="160"/>
+        <w:jc w:val="center"/>
+      </w:pPr>
+      <w:r>
+        <w:drawing>
+          <wp:inline distT="0" distB="0" distL="0" distR="0">
+            <wp:extent cx="5715000" cy="2800350"/>
+            <wp:effectExtent t="0" r="0" b="0" l="0"/>
+            <wp:docPr id="1" name="" descr="" title=""/>
+            <wp:cNvGraphicFramePr>
+              <a:graphicFrameLocks xmlns:a="http://schemas.openxmlformats.org/drawingml/2006/main" noChangeAspect="1"/>
+            </wp:cNvGraphicFramePr>
+            <a:graphic xmlns:a="http://schemas.openxmlformats.org/drawingml/2006/main">
+              <a:graphicData uri="http://schemas.openxmlformats.org/drawingml/2006/picture">
+                <pic:pic xmlns:pic="http://schemas.openxmlformats.org/drawingml/2006/picture">
+                  <pic:nvPicPr>
+                    <pic:cNvPr id="0" name="" descr=""/>
+                    <pic:cNvPicPr>
+                      <a:picLocks noChangeAspect="1" noChangeArrowheads="1"/>
+                    </pic:cNvPicPr>
+                  </pic:nvPicPr>
+                  <pic:blipFill>
+                    <a:blip r:embed="rId21" cstate="none"/>
+                    <a:srcRect/>
+                    <a:stretch>
+                      <a:fillRect/>
+                    </a:stretch>
+                  </pic:blipFill>
+                  <pic:spPr bwMode="auto">
+                    <a:xfrm>
+                      <a:off x="0" y="0"/>
+                      <a:ext cx="5715000" cy="2800350"/>
+                    </a:xfrm>
+                    <a:prstGeom prst="rect">
+                      <a:avLst/>
+                    </a:prstGeom>
+                  </pic:spPr>
+                </pic:pic>
+              </a:graphicData>
+            </a:graphic>
+          </wp:inline>
+        </w:drawing>
+      </w:r>
+    </w:p>
+    <w:p>
+      <w:pPr>
+        <w:spacing w:after="200"/>
+        <w:jc w:val="center"/>
+      </w:pPr>
+      <w:r>
+        <w:rPr>
+          <w:i/>
+          <w:iCs/>
+          <w:color w:val="6B7280"/>
+          <w:sz w:val="16"/>
+          <w:szCs w:val="16"/>
+        </w:rPr>
+        <w:t xml:space="preserve">Figure 8.3 — Compliance framework mapping</w:t>
+      </w:r>
+    </w:p>
+    <w:p>
+      <w:pPr>
+        <w:pStyle w:val="Heading1"/>
+        <w:pageBreakBefore/>
+        <w:spacing w:after="40" w:before="200"/>
+      </w:pPr>
+      <w:r>
+        <w:rPr>
+          <w:b/>
+          <w:bCs/>
+          <w:color w:val="004898"/>
+          <w:sz w:val="30"/>
+          <w:szCs w:val="30"/>
+        </w:rPr>
+        <w:t xml:space="preserve">9. Architecture Deep-Dive</w:t>
+      </w:r>
+    </w:p>
+    <w:p>
+      <w:pPr>
+        <w:spacing w:after="160"/>
+      </w:pPr>
+      <w:r>
+        <w:rPr>
+          <w:b/>
+          <w:bCs/>
+          <w:i/>
+          <w:iCs/>
+          <w:color w:val="A39273"/>
+          <w:sz w:val="20"/>
+          <w:szCs w:val="20"/>
+        </w:rPr>
+        <w:t xml:space="preserve">Owned by Thabiso</w:t>
+      </w:r>
+    </w:p>
+    <w:p>
+      <w:pPr>
+        <w:spacing w:after="140"/>
+      </w:pPr>
+      <w:r>
+        <w:rPr>
+          <w:color w:val="1F2937"/>
+          <w:sz w:val="22"/>
+          <w:szCs w:val="22"/>
+        </w:rPr>
+        <w:t xml:space="preserve">This section expands the solution architecture in Section 5 into an implementable, cloud-native target for deployment into Eskom's Microsoft Azure tenant, with all data resident in South Africa. The design favours composable, containerised microservices, an API-first integration model and elastic scaling, so the platform can grow from the demonstrated prototype to a national roll-out without re-architecture.</w:t>
+      </w:r>
+    </w:p>
+    <w:p>
+      <w:pPr>
+        <w:spacing w:after="140"/>
+      </w:pPr>
+      <w:r>
+        <w:rPr>
+          <w:color w:val="1F2937"/>
+          <w:sz w:val="22"/>
+          <w:szCs w:val="22"/>
+        </w:rPr>
+        <w:t xml:space="preserve">The specific Azure services named below are a reference design. Final service selection, sizing, region pairing and landing-zone configuration will be confirmed with Eskom's cloud and security teams during discovery.</w:t>
+      </w:r>
+    </w:p>
+    <w:p>
+      <w:pPr>
+        <w:spacing w:after="140" w:before="140"/>
+      </w:pPr>
+      <w:r>
+        <w:rPr>
+          <w:i/>
+          <w:iCs/>
+          <w:color w:val="6B7280"/>
+          <w:sz w:val="20"/>
+          <w:szCs w:val="20"/>
+        </w:rPr>
+        <w:t xml:space="preserve">Architecture is presented as a reference design aligned to the SoW's cloud, security and scalability requirements. Target tenant configuration, service selection and non-functional targets (availability, RPO/RTO, performance) must be confirmed with Eskom during discovery.</w:t>
+      </w:r>
+    </w:p>
+    <w:p>
+      <w:pPr>
+        <w:spacing w:after="40" w:before="160"/>
+        <w:jc w:val="center"/>
+      </w:pPr>
+      <w:r>
+        <w:drawing>
+          <wp:inline distT="0" distB="0" distL="0" distR="0">
+            <wp:extent cx="5715000" cy="3733800"/>
+            <wp:effectExtent t="0" r="0" b="0" l="0"/>
+            <wp:docPr id="1" name="" descr="" title=""/>
+            <wp:cNvGraphicFramePr>
+              <a:graphicFrameLocks xmlns:a="http://schemas.openxmlformats.org/drawingml/2006/main" noChangeAspect="1"/>
+            </wp:cNvGraphicFramePr>
+            <a:graphic xmlns:a="http://schemas.openxmlformats.org/drawingml/2006/main">
+              <a:graphicData uri="http://schemas.openxmlformats.org/drawingml/2006/picture">
+                <pic:pic xmlns:pic="http://schemas.openxmlformats.org/drawingml/2006/picture">
+                  <pic:nvPicPr>
+                    <pic:cNvPr id="0" name="" descr=""/>
+                    <pic:cNvPicPr>
+                      <a:picLocks noChangeAspect="1" noChangeArrowheads="1"/>
+                    </pic:cNvPicPr>
+                  </pic:nvPicPr>
+                  <pic:blipFill>
+                    <a:blip r:embed="rId22" cstate="none"/>
+                    <a:srcRect/>
+                    <a:stretch>
+                      <a:fillRect/>
+                    </a:stretch>
+                  </pic:blipFill>
+                  <pic:spPr bwMode="auto">
+                    <a:xfrm>
+                      <a:off x="0" y="0"/>
+                      <a:ext cx="5715000" cy="3733800"/>
+                    </a:xfrm>
+                    <a:prstGeom prst="rect">
+                      <a:avLst/>
+                    </a:prstGeom>
+                  </pic:spPr>
+                </pic:pic>
+              </a:graphicData>
+            </a:graphic>
+          </wp:inline>
+        </w:drawing>
+      </w:r>
+    </w:p>
+    <w:p>
+      <w:pPr>
+        <w:spacing w:after="200"/>
+        <w:jc w:val="center"/>
+      </w:pPr>
+      <w:r>
+        <w:rPr>
+          <w:i/>
+          <w:iCs/>
+          <w:color w:val="6B7280"/>
+          <w:sz w:val="16"/>
+          <w:szCs w:val="16"/>
+        </w:rPr>
+        <w:t xml:space="preserve">Figure 9.1 — Azure deployment architecture</w:t>
+      </w:r>
+    </w:p>
+    <w:p>
+      <w:pPr>
+        <w:spacing w:after="80" w:before="160"/>
+      </w:pPr>
+      <w:r>
+        <w:rPr>
+          <w:b/>
+          <w:bCs/>
+          <w:color w:val="1F2937"/>
+          <w:sz w:val="24"/>
+          <w:szCs w:val="24"/>
+        </w:rPr>
+        <w:t xml:space="preserve">9.1 Azure Landing Zone and Hosting</w:t>
+      </w:r>
+    </w:p>
+    <w:p>
+      <w:pPr>
+        <w:pStyle w:val="ListParagraph"/>
+        <w:numPr>
+          <w:ilvl w:val="0"/>
+          <w:numId w:val="1"/>
+        </w:numPr>
+        <w:spacing w:after="60"/>
+      </w:pPr>
+      <w:r>
+        <w:rPr>
+          <w:color w:val="1F2937"/>
+          <w:sz w:val="22"/>
+          <w:szCs w:val="22"/>
+        </w:rPr>
+        <w:t xml:space="preserve">Deployment into an Eskom-governed Azure landing zone with policy, RBAC and cost guardrails.</w:t>
+      </w:r>
+    </w:p>
+    <w:p>
+      <w:pPr>
+        <w:pStyle w:val="ListParagraph"/>
+        <w:numPr>
+          <w:ilvl w:val="0"/>
+          <w:numId w:val="1"/>
+        </w:numPr>
+        <w:spacing w:after="60"/>
+      </w:pPr>
+      <w:r>
+        <w:rPr>
+          <w:color w:val="1F2937"/>
+          <w:sz w:val="22"/>
+          <w:szCs w:val="22"/>
+        </w:rPr>
+        <w:t xml:space="preserve">Primary region Azure South Africa North (Johannesburg) for data sovereignty.</w:t>
+      </w:r>
+    </w:p>
+    <w:p>
+      <w:pPr>
+        <w:pStyle w:val="ListParagraph"/>
+        <w:numPr>
+          <w:ilvl w:val="0"/>
+          <w:numId w:val="1"/>
+        </w:numPr>
+        <w:spacing w:after="60"/>
+      </w:pPr>
+      <w:r>
+        <w:rPr>
+          <w:color w:val="1F2937"/>
+          <w:sz w:val="22"/>
+          <w:szCs w:val="22"/>
+        </w:rPr>
+        <w:t xml:space="preserve">Resource segregation by environment and workload using subscriptions and resource groups.</w:t>
+      </w:r>
+    </w:p>
+    <w:p>
+      <w:pPr>
+        <w:pStyle w:val="ListParagraph"/>
+        <w:numPr>
+          <w:ilvl w:val="0"/>
+          <w:numId w:val="1"/>
+        </w:numPr>
+        <w:spacing w:after="60"/>
+      </w:pPr>
+      <w:r>
+        <w:rPr>
+          <w:color w:val="1F2937"/>
+          <w:sz w:val="22"/>
+          <w:szCs w:val="22"/>
+        </w:rPr>
+        <w:t xml:space="preserve">Infrastructure as Code (Bicep or Terraform) for repeatable, auditable provisioning.</w:t>
+      </w:r>
+    </w:p>
+    <w:p>
+      <w:pPr>
+        <w:pStyle w:val="ListParagraph"/>
+        <w:numPr>
+          <w:ilvl w:val="0"/>
+          <w:numId w:val="1"/>
+        </w:numPr>
+        <w:spacing w:after="60"/>
+      </w:pPr>
+      <w:r>
+        <w:rPr>
+          <w:color w:val="1F2937"/>
+          <w:sz w:val="22"/>
+          <w:szCs w:val="22"/>
+        </w:rPr>
+        <w:t xml:space="preserve">Private networking by default — virtual networks, network security groups, Azure Firewall and private endpoints.</w:t>
+      </w:r>
+    </w:p>
+    <w:p>
+      <w:pPr>
+        <w:spacing w:after="80" w:before="160"/>
+      </w:pPr>
+      <w:r>
+        <w:rPr>
+          <w:b/>
+          <w:bCs/>
+          <w:color w:val="1F2937"/>
+          <w:sz w:val="24"/>
+          <w:szCs w:val="24"/>
+        </w:rPr>
+        <w:t xml:space="preserve">9.2 Application Architecture</w:t>
+      </w:r>
+    </w:p>
+    <w:p>
+      <w:pPr>
+        <w:pStyle w:val="ListParagraph"/>
+        <w:numPr>
+          <w:ilvl w:val="0"/>
+          <w:numId w:val="1"/>
+        </w:numPr>
+        <w:spacing w:after="60"/>
+      </w:pPr>
+      <w:r>
+        <w:rPr>
+          <w:color w:val="1F2937"/>
+          <w:sz w:val="22"/>
+          <w:szCs w:val="22"/>
+        </w:rPr>
+        <w:t xml:space="preserve">Composable microservices packaged as containers on AKS or Azure App Service.</w:t>
+      </w:r>
+    </w:p>
+    <w:p>
+      <w:pPr>
+        <w:pStyle w:val="ListParagraph"/>
+        <w:numPr>
+          <w:ilvl w:val="0"/>
+          <w:numId w:val="1"/>
+        </w:numPr>
+        <w:spacing w:after="60"/>
+      </w:pPr>
+      <w:r>
+        <w:rPr>
+          <w:color w:val="1F2937"/>
+          <w:sz w:val="22"/>
+          <w:szCs w:val="22"/>
+        </w:rPr>
+        <w:t xml:space="preserve">Stateless services that scale horizontally behind Azure Front Door and API Management.</w:t>
+      </w:r>
+    </w:p>
+    <w:p>
+      <w:pPr>
+        <w:pStyle w:val="ListParagraph"/>
+        <w:numPr>
+          <w:ilvl w:val="0"/>
+          <w:numId w:val="1"/>
+        </w:numPr>
+        <w:spacing w:after="60"/>
+      </w:pPr>
+      <w:r>
+        <w:rPr>
+          <w:color w:val="1F2937"/>
+          <w:sz w:val="22"/>
+          <w:szCs w:val="22"/>
+        </w:rPr>
+        <w:t xml:space="preserve">API-first design with versioned, documented contracts between services and channels.</w:t>
+      </w:r>
+    </w:p>
+    <w:p>
+      <w:pPr>
+        <w:pStyle w:val="ListParagraph"/>
+        <w:numPr>
+          <w:ilvl w:val="0"/>
+          <w:numId w:val="1"/>
+        </w:numPr>
+        <w:spacing w:after="60"/>
+      </w:pPr>
+      <w:r>
+        <w:rPr>
+          <w:color w:val="1F2937"/>
+          <w:sz w:val="22"/>
+          <w:szCs w:val="22"/>
+        </w:rPr>
+        <w:t xml:space="preserve">Event-driven ingestion for MV90 and other feeds, decoupled via queues for resilience.</w:t>
+      </w:r>
+    </w:p>
+    <w:p>
+      <w:pPr>
+        <w:pStyle w:val="ListParagraph"/>
+        <w:numPr>
+          <w:ilvl w:val="0"/>
+          <w:numId w:val="1"/>
+        </w:numPr>
+        <w:spacing w:after="60"/>
+      </w:pPr>
+      <w:r>
+        <w:rPr>
+          <w:color w:val="1F2937"/>
+          <w:sz w:val="22"/>
+          <w:szCs w:val="22"/>
+        </w:rPr>
+        <w:t xml:space="preserve">Autoscaling driven by demand, with graceful degradation under load.</w:t>
+      </w:r>
+    </w:p>
+    <w:p>
+      <w:pPr>
+        <w:spacing w:after="80" w:before="160"/>
+      </w:pPr>
+      <w:r>
+        <w:rPr>
+          <w:b/>
+          <w:bCs/>
+          <w:color w:val="1F2937"/>
+          <w:sz w:val="24"/>
+          <w:szCs w:val="24"/>
+        </w:rPr>
+        <w:t xml:space="preserve">9.3 Data Architecture</w:t>
+      </w:r>
+    </w:p>
+    <w:p>
+      <w:pPr>
+        <w:pStyle w:val="ListParagraph"/>
+        <w:numPr>
+          <w:ilvl w:val="0"/>
+          <w:numId w:val="1"/>
+        </w:numPr>
+        <w:spacing w:after="60"/>
+      </w:pPr>
+      <w:r>
+        <w:rPr>
+          <w:color w:val="1F2937"/>
+          <w:sz w:val="22"/>
+          <w:szCs w:val="22"/>
+        </w:rPr>
+        <w:t xml:space="preserve">Azure SQL (Business Critical, zone-redundant) as the operational store with Transparent Data Encryption.</w:t>
+      </w:r>
+    </w:p>
+    <w:p>
+      <w:pPr>
+        <w:pStyle w:val="ListParagraph"/>
+        <w:numPr>
+          <w:ilvl w:val="0"/>
+          <w:numId w:val="1"/>
+        </w:numPr>
+        <w:spacing w:after="60"/>
+      </w:pPr>
+      <w:r>
+        <w:rPr>
+          <w:color w:val="1F2937"/>
+          <w:sz w:val="22"/>
+          <w:szCs w:val="22"/>
+        </w:rPr>
+        <w:t xml:space="preserve">Separation of operational data from reporting/analytics data to protect transactional performance.</w:t>
+      </w:r>
+    </w:p>
+    <w:p>
+      <w:pPr>
+        <w:pStyle w:val="ListParagraph"/>
+        <w:numPr>
+          <w:ilvl w:val="0"/>
+          <w:numId w:val="1"/>
+        </w:numPr>
+        <w:spacing w:after="60"/>
+      </w:pPr>
+      <w:r>
+        <w:rPr>
+          <w:color w:val="1F2937"/>
+          <w:sz w:val="22"/>
+          <w:szCs w:val="22"/>
+        </w:rPr>
+        <w:t xml:space="preserve">Azure Storage/Blob for the integration store, imported files and generated report extracts.</w:t>
+      </w:r>
+    </w:p>
+    <w:p>
+      <w:pPr>
+        <w:pStyle w:val="ListParagraph"/>
+        <w:numPr>
+          <w:ilvl w:val="0"/>
+          <w:numId w:val="1"/>
+        </w:numPr>
+        <w:spacing w:after="60"/>
+      </w:pPr>
+      <w:r>
+        <w:rPr>
+          <w:color w:val="1F2937"/>
+          <w:sz w:val="22"/>
+          <w:szCs w:val="22"/>
+        </w:rPr>
+        <w:t xml:space="preserve">Azure Cache for sessions, rate-limiting state and hot lookups.</w:t>
+      </w:r>
+    </w:p>
+    <w:p>
+      <w:pPr>
+        <w:pStyle w:val="ListParagraph"/>
+        <w:numPr>
+          <w:ilvl w:val="0"/>
+          <w:numId w:val="1"/>
+        </w:numPr>
+        <w:spacing w:after="60"/>
+      </w:pPr>
+      <w:r>
+        <w:rPr>
+          <w:color w:val="1F2937"/>
+          <w:sz w:val="22"/>
+          <w:szCs w:val="22"/>
+        </w:rPr>
+        <w:t xml:space="preserve">Defined retention, archiving and point-in-time restore aligned to Client policy.</w:t>
+      </w:r>
+    </w:p>
+    <w:p>
+      <w:pPr>
+        <w:spacing w:after="80" w:before="160"/>
+      </w:pPr>
+      <w:r>
+        <w:rPr>
+          <w:b/>
+          <w:bCs/>
+          <w:color w:val="1F2937"/>
+          <w:sz w:val="24"/>
+          <w:szCs w:val="24"/>
+        </w:rPr>
+        <w:t xml:space="preserve">9.4 Integration Architecture</w:t>
+      </w:r>
+    </w:p>
+    <w:p>
+      <w:pPr>
+        <w:spacing w:after="120"/>
+      </w:pPr>
+      <w:r>
+        <w:rPr>
+          <w:color w:val="1F2937"/>
+          <w:sz w:val="22"/>
+          <w:szCs w:val="22"/>
+        </w:rPr>
+        <w:t xml:space="preserve">FBM integrates with upstream systems of record through a managed integration layer using a canonical data model, so that source-system change is absorbed by adapters rather than propagated into the core.</w:t>
+      </w:r>
+    </w:p>
+    <w:p>
+      <w:pPr>
+        <w:pStyle w:val="ListParagraph"/>
+        <w:numPr>
+          <w:ilvl w:val="0"/>
+          <w:numId w:val="1"/>
+        </w:numPr>
+        <w:spacing w:after="60"/>
+      </w:pPr>
+      <w:r>
+        <w:rPr>
+          <w:color w:val="1F2937"/>
+          <w:sz w:val="22"/>
+          <w:szCs w:val="22"/>
+        </w:rPr>
+        <w:t xml:space="preserve">API Management / Enterprise Service Bus (iPaaS) mediates all inbound and outbound integration.</w:t>
+      </w:r>
+    </w:p>
+    <w:p>
+      <w:pPr>
+        <w:pStyle w:val="ListParagraph"/>
+        <w:numPr>
+          <w:ilvl w:val="0"/>
+          <w:numId w:val="1"/>
+        </w:numPr>
+        <w:spacing w:after="60"/>
+      </w:pPr>
+      <w:r>
+        <w:rPr>
+          <w:color w:val="1F2937"/>
+          <w:sz w:val="22"/>
+          <w:szCs w:val="22"/>
+        </w:rPr>
+        <w:t xml:space="preserve">Source adapters for MV90 stats meters, CC&amp;B billing, Works Management (e.g. MAXIMO) and CNL/GIS.</w:t>
+      </w:r>
+    </w:p>
+    <w:p>
+      <w:pPr>
+        <w:pStyle w:val="ListParagraph"/>
+        <w:numPr>
+          <w:ilvl w:val="0"/>
+          <w:numId w:val="1"/>
+        </w:numPr>
+        <w:spacing w:after="60"/>
+      </w:pPr>
+      <w:r>
+        <w:rPr>
+          <w:color w:val="1F2937"/>
+          <w:sz w:val="22"/>
+          <w:szCs w:val="22"/>
+        </w:rPr>
+        <w:t xml:space="preserve">Batch and near-real-time patterns with idempotent processing and dead-letter queues.</w:t>
+      </w:r>
+    </w:p>
+    <w:p>
+      <w:pPr>
+        <w:pStyle w:val="ListParagraph"/>
+        <w:numPr>
+          <w:ilvl w:val="0"/>
+          <w:numId w:val="1"/>
+        </w:numPr>
+        <w:spacing w:after="60"/>
+      </w:pPr>
+      <w:r>
+        <w:rPr>
+          <w:color w:val="1F2937"/>
+          <w:sz w:val="22"/>
+          <w:szCs w:val="22"/>
+        </w:rPr>
+        <w:t xml:space="preserve">Outbound publication to BI/corporate reporting and the Losses Reduction Potential tool.</w:t>
+      </w:r>
+    </w:p>
+    <w:p>
+      <w:pPr>
+        <w:pStyle w:val="ListParagraph"/>
+        <w:numPr>
+          <w:ilvl w:val="0"/>
+          <w:numId w:val="1"/>
+        </w:numPr>
+        <w:spacing w:after="60"/>
+      </w:pPr>
+      <w:r>
+        <w:rPr>
+          <w:color w:val="1F2937"/>
+          <w:sz w:val="22"/>
+          <w:szCs w:val="22"/>
+        </w:rPr>
+        <w:t xml:space="preserve">Correlation identifiers propagated across every hop for end-to-end traceability.</w:t>
+      </w:r>
+    </w:p>
+    <w:p>
+      <w:pPr>
+        <w:spacing w:after="40" w:before="160"/>
+        <w:jc w:val="center"/>
+      </w:pPr>
+      <w:r>
+        <w:drawing>
+          <wp:inline distT="0" distB="0" distL="0" distR="0">
+            <wp:extent cx="5715000" cy="2743200"/>
+            <wp:effectExtent t="0" r="0" b="0" l="0"/>
+            <wp:docPr id="1" name="" descr="" title=""/>
+            <wp:cNvGraphicFramePr>
+              <a:graphicFrameLocks xmlns:a="http://schemas.openxmlformats.org/drawingml/2006/main" noChangeAspect="1"/>
+            </wp:cNvGraphicFramePr>
+            <a:graphic xmlns:a="http://schemas.openxmlformats.org/drawingml/2006/main">
+              <a:graphicData uri="http://schemas.openxmlformats.org/drawingml/2006/picture">
+                <pic:pic xmlns:pic="http://schemas.openxmlformats.org/drawingml/2006/picture">
+                  <pic:nvPicPr>
+                    <pic:cNvPr id="0" name="" descr=""/>
+                    <pic:cNvPicPr>
+                      <a:picLocks noChangeAspect="1" noChangeArrowheads="1"/>
+                    </pic:cNvPicPr>
+                  </pic:nvPicPr>
+                  <pic:blipFill>
+                    <a:blip r:embed="rId23" cstate="none"/>
+                    <a:srcRect/>
+                    <a:stretch>
+                      <a:fillRect/>
+                    </a:stretch>
+                  </pic:blipFill>
+                  <pic:spPr bwMode="auto">
+                    <a:xfrm>
+                      <a:off x="0" y="0"/>
+                      <a:ext cx="5715000" cy="2743200"/>
+                    </a:xfrm>
+                    <a:prstGeom prst="rect">
+                      <a:avLst/>
+                    </a:prstGeom>
+                  </pic:spPr>
+                </pic:pic>
+              </a:graphicData>
+            </a:graphic>
+          </wp:inline>
+        </w:drawing>
+      </w:r>
+    </w:p>
+    <w:p>
+      <w:pPr>
+        <w:spacing w:after="200"/>
+        <w:jc w:val="center"/>
+      </w:pPr>
+      <w:r>
+        <w:rPr>
+          <w:i/>
+          <w:iCs/>
+          <w:color w:val="6B7280"/>
+          <w:sz w:val="16"/>
+          <w:szCs w:val="16"/>
+        </w:rPr>
+        <w:t xml:space="preserve">Figure 9.2 — Integration architecture</w:t>
+      </w:r>
+    </w:p>
+    <w:p>
+      <w:pPr>
+        <w:spacing w:after="80" w:before="160"/>
+      </w:pPr>
+      <w:r>
+        <w:rPr>
+          <w:b/>
+          <w:bCs/>
+          <w:color w:val="1F2937"/>
+          <w:sz w:val="24"/>
+          <w:szCs w:val="24"/>
+        </w:rPr>
+        <w:t xml:space="preserve">9.5 Scalability, Availability and Disaster Recovery</w:t>
+      </w:r>
+    </w:p>
+    <w:p>
+      <w:pPr>
+        <w:pStyle w:val="ListParagraph"/>
+        <w:numPr>
+          <w:ilvl w:val="0"/>
+          <w:numId w:val="1"/>
+        </w:numPr>
+        <w:spacing w:after="60"/>
+      </w:pPr>
+      <w:r>
+        <w:rPr>
+          <w:color w:val="1F2937"/>
+          <w:sz w:val="22"/>
+          <w:szCs w:val="22"/>
+        </w:rPr>
+        <w:t xml:space="preserve">Horizontal autoscaling of stateless services and zone-redundant data services for high availability.</w:t>
+      </w:r>
+    </w:p>
+    <w:p>
+      <w:pPr>
+        <w:pStyle w:val="ListParagraph"/>
+        <w:numPr>
+          <w:ilvl w:val="0"/>
+          <w:numId w:val="1"/>
+        </w:numPr>
+        <w:spacing w:after="60"/>
+      </w:pPr>
+      <w:r>
+        <w:rPr>
+          <w:color w:val="1F2937"/>
+          <w:sz w:val="22"/>
+          <w:szCs w:val="22"/>
+        </w:rPr>
+        <w:t xml:space="preserve">Target availability, RPO and RTO to be agreed and underpinned by the SLA.</w:t>
+      </w:r>
+    </w:p>
+    <w:p>
+      <w:pPr>
+        <w:pStyle w:val="ListParagraph"/>
+        <w:numPr>
+          <w:ilvl w:val="0"/>
+          <w:numId w:val="1"/>
+        </w:numPr>
+        <w:spacing w:after="60"/>
+      </w:pPr>
+      <w:r>
+        <w:rPr>
+          <w:color w:val="1F2937"/>
+          <w:sz w:val="22"/>
+          <w:szCs w:val="22"/>
+        </w:rPr>
+        <w:t xml:space="preserve">Geo-replication to the paired region (Azure South Africa West) for disaster recovery.</w:t>
+      </w:r>
+    </w:p>
+    <w:p>
+      <w:pPr>
+        <w:pStyle w:val="ListParagraph"/>
+        <w:numPr>
+          <w:ilvl w:val="0"/>
+          <w:numId w:val="1"/>
+        </w:numPr>
+        <w:spacing w:after="60"/>
+      </w:pPr>
+      <w:r>
+        <w:rPr>
+          <w:color w:val="1F2937"/>
+          <w:sz w:val="22"/>
+          <w:szCs w:val="22"/>
+        </w:rPr>
+        <w:t xml:space="preserve">Automated, encrypted backups with regular restore testing.</w:t>
+      </w:r>
+    </w:p>
+    <w:p>
+      <w:pPr>
+        <w:pStyle w:val="ListParagraph"/>
+        <w:numPr>
+          <w:ilvl w:val="0"/>
+          <w:numId w:val="1"/>
+        </w:numPr>
+        <w:spacing w:after="60"/>
+      </w:pPr>
+      <w:r>
+        <w:rPr>
+          <w:color w:val="1F2937"/>
+          <w:sz w:val="22"/>
+          <w:szCs w:val="22"/>
+        </w:rPr>
+        <w:t xml:space="preserve">A documented, regularly tested Disaster Recovery Plan (DRP).</w:t>
+      </w:r>
+    </w:p>
+    <w:p>
+      <w:pPr>
+        <w:spacing w:after="80" w:before="160"/>
+      </w:pPr>
+      <w:r>
+        <w:rPr>
+          <w:b/>
+          <w:bCs/>
+          <w:color w:val="1F2937"/>
+          <w:sz w:val="24"/>
+          <w:szCs w:val="24"/>
+        </w:rPr>
+        <w:t xml:space="preserve">9.6 Environments and DevOps</w:t>
+      </w:r>
+    </w:p>
+    <w:p>
+      <w:pPr>
+        <w:spacing w:after="120"/>
+      </w:pPr>
+      <w:r>
+        <w:rPr>
+          <w:color w:val="1F2937"/>
+          <w:sz w:val="22"/>
+          <w:szCs w:val="22"/>
+        </w:rPr>
+        <w:t xml:space="preserve">Identical, isolated environments are promoted through an automated pipeline with quality and security gates, giving predictable, auditable releases.</w:t>
+      </w:r>
+    </w:p>
+    <w:p>
+      <w:pPr>
+        <w:pStyle w:val="ListParagraph"/>
+        <w:numPr>
+          <w:ilvl w:val="0"/>
+          <w:numId w:val="1"/>
+        </w:numPr>
+        <w:spacing w:after="60"/>
+      </w:pPr>
+      <w:r>
+        <w:rPr>
+          <w:color w:val="1F2937"/>
+          <w:sz w:val="22"/>
+          <w:szCs w:val="22"/>
+        </w:rPr>
+        <w:t xml:space="preserve">Separate DEV, TEST/UAT, staging and PROD environments provisioned from the same IaC.</w:t>
+      </w:r>
+    </w:p>
+    <w:p>
+      <w:pPr>
+        <w:pStyle w:val="ListParagraph"/>
+        <w:numPr>
+          <w:ilvl w:val="0"/>
+          <w:numId w:val="1"/>
+        </w:numPr>
+        <w:spacing w:after="60"/>
+      </w:pPr>
+      <w:r>
+        <w:rPr>
+          <w:color w:val="1F2937"/>
+          <w:sz w:val="22"/>
+          <w:szCs w:val="22"/>
+        </w:rPr>
+        <w:t xml:space="preserve">CI/CD via Azure DevOps or GitHub Actions with build, automated test, SAST/DAST and release gates.</w:t>
+      </w:r>
+    </w:p>
+    <w:p>
+      <w:pPr>
+        <w:pStyle w:val="ListParagraph"/>
+        <w:numPr>
+          <w:ilvl w:val="0"/>
+          <w:numId w:val="1"/>
+        </w:numPr>
+        <w:spacing w:after="60"/>
+      </w:pPr>
+      <w:r>
+        <w:rPr>
+          <w:color w:val="1F2937"/>
+          <w:sz w:val="22"/>
+          <w:szCs w:val="22"/>
+        </w:rPr>
+        <w:t xml:space="preserve">Manual approval gate before production promotion, with full release evidence.</w:t>
+      </w:r>
+    </w:p>
+    <w:p>
+      <w:pPr>
+        <w:pStyle w:val="ListParagraph"/>
+        <w:numPr>
+          <w:ilvl w:val="0"/>
+          <w:numId w:val="1"/>
+        </w:numPr>
+        <w:spacing w:after="60"/>
+      </w:pPr>
+      <w:r>
+        <w:rPr>
+          <w:color w:val="1F2937"/>
+          <w:sz w:val="22"/>
+          <w:szCs w:val="22"/>
+        </w:rPr>
+        <w:t xml:space="preserve">Blue-green or canary release strategy to minimise deployment risk.</w:t>
+      </w:r>
+    </w:p>
+    <w:p>
+      <w:pPr>
+        <w:pStyle w:val="ListParagraph"/>
+        <w:numPr>
+          <w:ilvl w:val="0"/>
+          <w:numId w:val="1"/>
+        </w:numPr>
+        <w:spacing w:after="60"/>
+      </w:pPr>
+      <w:r>
+        <w:rPr>
+          <w:color w:val="1F2937"/>
+          <w:sz w:val="22"/>
+          <w:szCs w:val="22"/>
+        </w:rPr>
+        <w:t xml:space="preserve">Observability (metrics, logs, traces) wired in from day one.</w:t>
+      </w:r>
+    </w:p>
+    <w:p>
+      <w:pPr>
+        <w:spacing w:after="40" w:before="160"/>
+        <w:jc w:val="center"/>
+      </w:pPr>
+      <w:r>
+        <w:drawing>
+          <wp:inline distT="0" distB="0" distL="0" distR="0">
+            <wp:extent cx="5715000" cy="2219325"/>
+            <wp:effectExtent t="0" r="0" b="0" l="0"/>
+            <wp:docPr id="1" name="" descr="" title=""/>
+            <wp:cNvGraphicFramePr>
+              <a:graphicFrameLocks xmlns:a="http://schemas.openxmlformats.org/drawingml/2006/main" noChangeAspect="1"/>
+            </wp:cNvGraphicFramePr>
+            <a:graphic xmlns:a="http://schemas.openxmlformats.org/drawingml/2006/main">
+              <a:graphicData uri="http://schemas.openxmlformats.org/drawingml/2006/picture">
+                <pic:pic xmlns:pic="http://schemas.openxmlformats.org/drawingml/2006/picture">
+                  <pic:nvPicPr>
+                    <pic:cNvPr id="0" name="" descr=""/>
+                    <pic:cNvPicPr>
+                      <a:picLocks noChangeAspect="1" noChangeArrowheads="1"/>
+                    </pic:cNvPicPr>
+                  </pic:nvPicPr>
+                  <pic:blipFill>
+                    <a:blip r:embed="rId24" cstate="none"/>
+                    <a:srcRect/>
+                    <a:stretch>
+                      <a:fillRect/>
+                    </a:stretch>
+                  </pic:blipFill>
+                  <pic:spPr bwMode="auto">
+                    <a:xfrm>
+                      <a:off x="0" y="0"/>
+                      <a:ext cx="5715000" cy="2219325"/>
+                    </a:xfrm>
+                    <a:prstGeom prst="rect">
+                      <a:avLst/>
+                    </a:prstGeom>
+                  </pic:spPr>
+                </pic:pic>
+              </a:graphicData>
+            </a:graphic>
+          </wp:inline>
+        </w:drawing>
+      </w:r>
+    </w:p>
+    <w:p>
+      <w:pPr>
+        <w:spacing w:after="200"/>
+        <w:jc w:val="center"/>
+      </w:pPr>
+      <w:r>
+        <w:rPr>
+          <w:i/>
+          <w:iCs/>
+          <w:color w:val="6B7280"/>
+          <w:sz w:val="16"/>
+          <w:szCs w:val="16"/>
+        </w:rPr>
+        <w:t xml:space="preserve">Figure 9.3 — Environments, CI/CD &amp; DR</w:t>
       </w:r>
     </w:p>
     <w:p>

</xml_diff>

<commit_message>
Apply top-of-band rate card (hourly + daily) to Section 17 cost model
</commit_message>
<xml_diff>
--- a/public/downloads/T2-Technologies-FBM-Thabiso-Sections.docx
+++ b/public/downloads/T2-Technologies-FBM-Thabiso-Sections.docx
@@ -5717,7 +5717,7 @@
           <w:sz w:val="22"/>
           <w:szCs w:val="22"/>
         </w:rPr>
-        <w:t xml:space="preserve">All rates are South African enterprise-IT benchmark day-rates (2026) and must be confirmed against T2 Technologies' actual rate card before submission.</w:t>
+        <w:t xml:space="preserve">All rates are South African enterprise-IT top-of-band (upper-quartile) benchmark rates (2026), quoted per hour and per day, and must be confirmed against T2 Technologies' actual rate card before submission.</w:t>
       </w:r>
     </w:p>
     <w:p>
@@ -6092,7 +6092,7 @@
           <w:sz w:val="22"/>
           <w:szCs w:val="22"/>
         </w:rPr>
-        <w:t xml:space="preserve">The following blended day-rates underpin the implementation and support pricing.</w:t>
+        <w:t xml:space="preserve">The following top-of-band (upper-quartile) South African benchmark rates underpin the implementation and support pricing. Day-rates are calculated at an 8-hour billable day.</w:t>
       </w:r>
     </w:p>
     <w:tbl>
@@ -6110,6 +6110,7 @@
       <w:tblGrid>
         <w:gridCol w:w="100"/>
         <w:gridCol w:w="100"/>
+        <w:gridCol w:w="100"/>
       </w:tblGrid>
       <w:tr>
         <w:trPr>
@@ -6157,6 +6158,29 @@
                 <w:sz w:val="20"/>
                 <w:szCs w:val="20"/>
               </w:rPr>
+              <w:t xml:space="preserve">Hourly (excl. VAT)</w:t>
+            </w:r>
+          </w:p>
+        </w:tc>
+        <w:tc>
+          <w:tcPr>
+            <w:shd w:fill="004898" w:val="clear"/>
+            <w:tcMar>
+              <w:top w:type="dxa" w:w="60"/>
+              <w:left w:type="dxa" w:w="80"/>
+              <w:bottom w:type="dxa" w:w="60"/>
+              <w:right w:type="dxa" w:w="80"/>
+            </w:tcMar>
+          </w:tcPr>
+          <w:p>
+            <w:r>
+              <w:rPr>
+                <w:b/>
+                <w:bCs/>
+                <w:color w:val="FFFFFF"/>
+                <w:sz w:val="20"/>
+                <w:szCs w:val="20"/>
+              </w:rPr>
               <w:t xml:space="preserve">Day Rate (excl. VAT)</w:t>
             </w:r>
           </w:p>
@@ -6199,7 +6223,27 @@
                 <w:sz w:val="19"/>
                 <w:szCs w:val="19"/>
               </w:rPr>
-              <w:t xml:space="preserve">R 9 800</w:t>
+              <w:t xml:space="preserve">R 1 500</w:t>
+            </w:r>
+          </w:p>
+        </w:tc>
+        <w:tc>
+          <w:tcPr>
+            <w:tcMar>
+              <w:top w:type="dxa" w:w="50"/>
+              <w:left w:type="dxa" w:w="80"/>
+              <w:bottom w:type="dxa" w:w="50"/>
+              <w:right w:type="dxa" w:w="80"/>
+            </w:tcMar>
+          </w:tcPr>
+          <w:p>
+            <w:r>
+              <w:rPr>
+                <w:color w:val="1F2937"/>
+                <w:sz w:val="19"/>
+                <w:szCs w:val="19"/>
+              </w:rPr>
+              <w:t xml:space="preserve">R 12 000</w:t>
             </w:r>
           </w:p>
         </w:tc>
@@ -6243,7 +6287,28 @@
                 <w:sz w:val="19"/>
                 <w:szCs w:val="19"/>
               </w:rPr>
-              <w:t xml:space="preserve">R 12 500</w:t>
+              <w:t xml:space="preserve">R 1 850</w:t>
+            </w:r>
+          </w:p>
+        </w:tc>
+        <w:tc>
+          <w:tcPr>
+            <w:shd w:fill="F3F4F6" w:val="clear"/>
+            <w:tcMar>
+              <w:top w:type="dxa" w:w="50"/>
+              <w:left w:type="dxa" w:w="80"/>
+              <w:bottom w:type="dxa" w:w="50"/>
+              <w:right w:type="dxa" w:w="80"/>
+            </w:tcMar>
+          </w:tcPr>
+          <w:p>
+            <w:r>
+              <w:rPr>
+                <w:color w:val="1F2937"/>
+                <w:sz w:val="19"/>
+                <w:szCs w:val="19"/>
+              </w:rPr>
+              <w:t xml:space="preserve">R 14 800</w:t>
             </w:r>
           </w:p>
         </w:tc>
@@ -6285,7 +6350,27 @@
                 <w:sz w:val="19"/>
                 <w:szCs w:val="19"/>
               </w:rPr>
-              <w:t xml:space="preserve">R 8 200</w:t>
+              <w:t xml:space="preserve">R 1 250</w:t>
+            </w:r>
+          </w:p>
+        </w:tc>
+        <w:tc>
+          <w:tcPr>
+            <w:tcMar>
+              <w:top w:type="dxa" w:w="50"/>
+              <w:left w:type="dxa" w:w="80"/>
+              <w:bottom w:type="dxa" w:w="50"/>
+              <w:right w:type="dxa" w:w="80"/>
+            </w:tcMar>
+          </w:tcPr>
+          <w:p>
+            <w:r>
+              <w:rPr>
+                <w:color w:val="1F2937"/>
+                <w:sz w:val="19"/>
+                <w:szCs w:val="19"/>
+              </w:rPr>
+              <w:t xml:space="preserve">R 10 000</w:t>
             </w:r>
           </w:p>
         </w:tc>
@@ -6329,7 +6414,28 @@
                 <w:sz w:val="19"/>
                 <w:szCs w:val="19"/>
               </w:rPr>
-              <w:t xml:space="preserve">R 9 500</w:t>
+              <w:t xml:space="preserve">R 1 400</w:t>
+            </w:r>
+          </w:p>
+        </w:tc>
+        <w:tc>
+          <w:tcPr>
+            <w:shd w:fill="F3F4F6" w:val="clear"/>
+            <w:tcMar>
+              <w:top w:type="dxa" w:w="50"/>
+              <w:left w:type="dxa" w:w="80"/>
+              <w:bottom w:type="dxa" w:w="50"/>
+              <w:right w:type="dxa" w:w="80"/>
+            </w:tcMar>
+          </w:tcPr>
+          <w:p>
+            <w:r>
+              <w:rPr>
+                <w:color w:val="1F2937"/>
+                <w:sz w:val="19"/>
+                <w:szCs w:val="19"/>
+              </w:rPr>
+              <w:t xml:space="preserve">R 11 200</w:t>
             </w:r>
           </w:p>
         </w:tc>
@@ -6371,7 +6477,27 @@
                 <w:sz w:val="19"/>
                 <w:szCs w:val="19"/>
               </w:rPr>
-              <w:t xml:space="preserve">R 6 800</w:t>
+              <w:t xml:space="preserve">R 1 000</w:t>
+            </w:r>
+          </w:p>
+        </w:tc>
+        <w:tc>
+          <w:tcPr>
+            <w:tcMar>
+              <w:top w:type="dxa" w:w="50"/>
+              <w:left w:type="dxa" w:w="80"/>
+              <w:bottom w:type="dxa" w:w="50"/>
+              <w:right w:type="dxa" w:w="80"/>
+            </w:tcMar>
+          </w:tcPr>
+          <w:p>
+            <w:r>
+              <w:rPr>
+                <w:color w:val="1F2937"/>
+                <w:sz w:val="19"/>
+                <w:szCs w:val="19"/>
+              </w:rPr>
+              <w:t xml:space="preserve">R 8 000</w:t>
             </w:r>
           </w:p>
         </w:tc>
@@ -6415,7 +6541,28 @@
                 <w:sz w:val="19"/>
                 <w:szCs w:val="19"/>
               </w:rPr>
-              <w:t xml:space="preserve">R 6 200</w:t>
+              <w:t xml:space="preserve">R 950</w:t>
+            </w:r>
+          </w:p>
+        </w:tc>
+        <w:tc>
+          <w:tcPr>
+            <w:shd w:fill="F3F4F6" w:val="clear"/>
+            <w:tcMar>
+              <w:top w:type="dxa" w:w="50"/>
+              <w:left w:type="dxa" w:w="80"/>
+              <w:bottom w:type="dxa" w:w="50"/>
+              <w:right w:type="dxa" w:w="80"/>
+            </w:tcMar>
+          </w:tcPr>
+          <w:p>
+            <w:r>
+              <w:rPr>
+                <w:color w:val="1F2937"/>
+                <w:sz w:val="19"/>
+                <w:szCs w:val="19"/>
+              </w:rPr>
+              <w:t xml:space="preserve">R 7 600</w:t>
             </w:r>
           </w:p>
         </w:tc>
@@ -6457,7 +6604,27 @@
                 <w:sz w:val="19"/>
                 <w:szCs w:val="19"/>
               </w:rPr>
-              <w:t xml:space="preserve">R 8 500</w:t>
+              <w:t xml:space="preserve">R 1 300</w:t>
+            </w:r>
+          </w:p>
+        </w:tc>
+        <w:tc>
+          <w:tcPr>
+            <w:tcMar>
+              <w:top w:type="dxa" w:w="50"/>
+              <w:left w:type="dxa" w:w="80"/>
+              <w:bottom w:type="dxa" w:w="50"/>
+              <w:right w:type="dxa" w:w="80"/>
+            </w:tcMar>
+          </w:tcPr>
+          <w:p>
+            <w:r>
+              <w:rPr>
+                <w:color w:val="1F2937"/>
+                <w:sz w:val="19"/>
+                <w:szCs w:val="19"/>
+              </w:rPr>
+              <w:t xml:space="preserve">R 10 400</w:t>
             </w:r>
           </w:p>
         </w:tc>
@@ -6501,7 +6668,28 @@
                 <w:sz w:val="19"/>
                 <w:szCs w:val="19"/>
               </w:rPr>
-              <w:t xml:space="preserve">R 9 200</w:t>
+              <w:t xml:space="preserve">R 1 400</w:t>
+            </w:r>
+          </w:p>
+        </w:tc>
+        <w:tc>
+          <w:tcPr>
+            <w:shd w:fill="F3F4F6" w:val="clear"/>
+            <w:tcMar>
+              <w:top w:type="dxa" w:w="50"/>
+              <w:left w:type="dxa" w:w="80"/>
+              <w:bottom w:type="dxa" w:w="50"/>
+              <w:right w:type="dxa" w:w="80"/>
+            </w:tcMar>
+          </w:tcPr>
+          <w:p>
+            <w:r>
+              <w:rPr>
+                <w:color w:val="1F2937"/>
+                <w:sz w:val="19"/>
+                <w:szCs w:val="19"/>
+              </w:rPr>
+              <w:t xml:space="preserve">R 11 200</w:t>
             </w:r>
           </w:p>
         </w:tc>
@@ -6543,7 +6731,27 @@
                 <w:sz w:val="19"/>
                 <w:szCs w:val="19"/>
               </w:rPr>
-              <w:t xml:space="preserve">R 6 800</w:t>
+              <w:t xml:space="preserve">R 1 050</w:t>
+            </w:r>
+          </w:p>
+        </w:tc>
+        <w:tc>
+          <w:tcPr>
+            <w:tcMar>
+              <w:top w:type="dxa" w:w="50"/>
+              <w:left w:type="dxa" w:w="80"/>
+              <w:bottom w:type="dxa" w:w="50"/>
+              <w:right w:type="dxa" w:w="80"/>
+            </w:tcMar>
+          </w:tcPr>
+          <w:p>
+            <w:r>
+              <w:rPr>
+                <w:color w:val="1F2937"/>
+                <w:sz w:val="19"/>
+                <w:szCs w:val="19"/>
+              </w:rPr>
+              <w:t xml:space="preserve">R 8 400</w:t>
             </w:r>
           </w:p>
         </w:tc>
@@ -6769,7 +6977,7 @@
                 <w:sz w:val="19"/>
                 <w:szCs w:val="19"/>
               </w:rPr>
-              <w:t xml:space="preserve">R 1 555 000</w:t>
+              <w:t xml:space="preserve">R 1 884 000</w:t>
             </w:r>
           </w:p>
         </w:tc>
@@ -6855,7 +7063,7 @@
                 <w:sz w:val="19"/>
                 <w:szCs w:val="19"/>
               </w:rPr>
-              <w:t xml:space="preserve">R 2 481 000</w:t>
+              <w:t xml:space="preserve">R 2 952 000</w:t>
             </w:r>
           </w:p>
         </w:tc>
@@ -6937,7 +7145,7 @@
                 <w:sz w:val="19"/>
                 <w:szCs w:val="19"/>
               </w:rPr>
-              <w:t xml:space="preserve">R 6 238 000</w:t>
+              <w:t xml:space="preserve">R 7 416 000</w:t>
             </w:r>
           </w:p>
         </w:tc>
@@ -7023,7 +7231,7 @@
                 <w:sz w:val="19"/>
                 <w:szCs w:val="19"/>
               </w:rPr>
-              <w:t xml:space="preserve">R 2 016 000</w:t>
+              <w:t xml:space="preserve">R 2 448 000</w:t>
             </w:r>
           </w:p>
         </w:tc>
@@ -7105,7 +7313,7 @@
                 <w:sz w:val="19"/>
                 <w:szCs w:val="19"/>
               </w:rPr>
-              <w:t xml:space="preserve">R 1 363 000</w:t>
+              <w:t xml:space="preserve">R 1 646 000</w:t>
             </w:r>
           </w:p>
         </w:tc>
@@ -7191,7 +7399,7 @@
                 <w:sz w:val="19"/>
                 <w:szCs w:val="19"/>
               </w:rPr>
-              <w:t xml:space="preserve">R 1 634 000</w:t>
+              <w:t xml:space="preserve">R 1 958 000</w:t>
             </w:r>
           </w:p>
         </w:tc>
@@ -7273,7 +7481,7 @@
                 <w:sz w:val="19"/>
                 <w:szCs w:val="19"/>
               </w:rPr>
-              <w:t xml:space="preserve">R 994 000</w:t>
+              <w:t xml:space="preserve">R 1 216 000</w:t>
             </w:r>
           </w:p>
         </w:tc>
@@ -7359,7 +7567,7 @@
                 <w:sz w:val="19"/>
                 <w:szCs w:val="19"/>
               </w:rPr>
-              <w:t xml:space="preserve">R 1 272 000</w:t>
+              <w:t xml:space="preserve">R 1 564 000</w:t>
             </w:r>
           </w:p>
         </w:tc>
@@ -7441,7 +7649,7 @@
                 <w:sz w:val="19"/>
                 <w:szCs w:val="19"/>
               </w:rPr>
-              <w:t xml:space="preserve">R 3 190 000</w:t>
+              <w:t xml:space="preserve">R 3 896 000</w:t>
             </w:r>
           </w:p>
         </w:tc>
@@ -7527,7 +7735,7 @@
                 <w:sz w:val="19"/>
                 <w:szCs w:val="19"/>
               </w:rPr>
-              <w:t xml:space="preserve">R 20 743 000</w:t>
+              <w:t xml:space="preserve">R 24 980 000</w:t>
             </w:r>
           </w:p>
         </w:tc>
@@ -7744,7 +7952,7 @@
                 <w:sz w:val="19"/>
                 <w:szCs w:val="19"/>
               </w:rPr>
-              <w:t xml:space="preserve">R 1 948 100</w:t>
+              <w:t xml:space="preserve">R 2 318 400</w:t>
             </w:r>
           </w:p>
         </w:tc>
@@ -7784,7 +7992,7 @@
                 <w:sz w:val="19"/>
                 <w:szCs w:val="19"/>
               </w:rPr>
-              <w:t xml:space="preserve">R 7 792 400</w:t>
+              <w:t xml:space="preserve">R 9 273 600</w:t>
             </w:r>
           </w:p>
         </w:tc>
@@ -7996,7 +8204,7 @@
                 <w:sz w:val="19"/>
                 <w:szCs w:val="19"/>
               </w:rPr>
-              <w:t xml:space="preserve">R 20 743 000</w:t>
+              <w:t xml:space="preserve">R 24 980 000</w:t>
             </w:r>
           </w:p>
         </w:tc>
@@ -8056,7 +8264,7 @@
                 <w:sz w:val="19"/>
                 <w:szCs w:val="19"/>
               </w:rPr>
-              <w:t xml:space="preserve">R 21 463 000</w:t>
+              <w:t xml:space="preserve">R 25 700 000</w:t>
             </w:r>
           </w:p>
         </w:tc>
@@ -8142,28 +8350,28 @@
                 <w:sz w:val="19"/>
                 <w:szCs w:val="19"/>
               </w:rPr>
-              <w:t xml:space="preserve">R 1 948 100</w:t>
-            </w:r>
-          </w:p>
-        </w:tc>
-        <w:tc>
-          <w:tcPr>
-            <w:shd w:fill="F3F4F6" w:val="clear"/>
-            <w:tcMar>
-              <w:top w:type="dxa" w:w="50"/>
-              <w:left w:type="dxa" w:w="80"/>
-              <w:bottom w:type="dxa" w:w="50"/>
-              <w:right w:type="dxa" w:w="80"/>
-            </w:tcMar>
-          </w:tcPr>
-          <w:p>
-            <w:r>
-              <w:rPr>
-                <w:color w:val="1F2937"/>
-                <w:sz w:val="19"/>
-                <w:szCs w:val="19"/>
-              </w:rPr>
-              <w:t xml:space="preserve">R 2 668 100</w:t>
+              <w:t xml:space="preserve">R 2 318 400</w:t>
+            </w:r>
+          </w:p>
+        </w:tc>
+        <w:tc>
+          <w:tcPr>
+            <w:shd w:fill="F3F4F6" w:val="clear"/>
+            <w:tcMar>
+              <w:top w:type="dxa" w:w="50"/>
+              <w:left w:type="dxa" w:w="80"/>
+              <w:bottom w:type="dxa" w:w="50"/>
+              <w:right w:type="dxa" w:w="80"/>
+            </w:tcMar>
+          </w:tcPr>
+          <w:p>
+            <w:r>
+              <w:rPr>
+                <w:color w:val="1F2937"/>
+                <w:sz w:val="19"/>
+                <w:szCs w:val="19"/>
+              </w:rPr>
+              <w:t xml:space="preserve">R 3 038 400</w:t>
             </w:r>
           </w:p>
         </w:tc>
@@ -8245,27 +8453,27 @@
                 <w:sz w:val="19"/>
                 <w:szCs w:val="19"/>
               </w:rPr>
-              <w:t xml:space="preserve">R 1 948 100</w:t>
-            </w:r>
-          </w:p>
-        </w:tc>
-        <w:tc>
-          <w:tcPr>
-            <w:tcMar>
-              <w:top w:type="dxa" w:w="50"/>
-              <w:left w:type="dxa" w:w="80"/>
-              <w:bottom w:type="dxa" w:w="50"/>
-              <w:right w:type="dxa" w:w="80"/>
-            </w:tcMar>
-          </w:tcPr>
-          <w:p>
-            <w:r>
-              <w:rPr>
-                <w:color w:val="1F2937"/>
-                <w:sz w:val="19"/>
-                <w:szCs w:val="19"/>
-              </w:rPr>
-              <w:t xml:space="preserve">R 2 668 100</w:t>
+              <w:t xml:space="preserve">R 2 318 400</w:t>
+            </w:r>
+          </w:p>
+        </w:tc>
+        <w:tc>
+          <w:tcPr>
+            <w:tcMar>
+              <w:top w:type="dxa" w:w="50"/>
+              <w:left w:type="dxa" w:w="80"/>
+              <w:bottom w:type="dxa" w:w="50"/>
+              <w:right w:type="dxa" w:w="80"/>
+            </w:tcMar>
+          </w:tcPr>
+          <w:p>
+            <w:r>
+              <w:rPr>
+                <w:color w:val="1F2937"/>
+                <w:sz w:val="19"/>
+                <w:szCs w:val="19"/>
+              </w:rPr>
+              <w:t xml:space="preserve">R 3 038 400</w:t>
             </w:r>
           </w:p>
         </w:tc>
@@ -8351,28 +8559,28 @@
                 <w:sz w:val="19"/>
                 <w:szCs w:val="19"/>
               </w:rPr>
-              <w:t xml:space="preserve">R 1 948 100</w:t>
-            </w:r>
-          </w:p>
-        </w:tc>
-        <w:tc>
-          <w:tcPr>
-            <w:shd w:fill="F3F4F6" w:val="clear"/>
-            <w:tcMar>
-              <w:top w:type="dxa" w:w="50"/>
-              <w:left w:type="dxa" w:w="80"/>
-              <w:bottom w:type="dxa" w:w="50"/>
-              <w:right w:type="dxa" w:w="80"/>
-            </w:tcMar>
-          </w:tcPr>
-          <w:p>
-            <w:r>
-              <w:rPr>
-                <w:color w:val="1F2937"/>
-                <w:sz w:val="19"/>
-                <w:szCs w:val="19"/>
-              </w:rPr>
-              <w:t xml:space="preserve">R 2 668 100</w:t>
+              <w:t xml:space="preserve">R 2 318 400</w:t>
+            </w:r>
+          </w:p>
+        </w:tc>
+        <w:tc>
+          <w:tcPr>
+            <w:shd w:fill="F3F4F6" w:val="clear"/>
+            <w:tcMar>
+              <w:top w:type="dxa" w:w="50"/>
+              <w:left w:type="dxa" w:w="80"/>
+              <w:bottom w:type="dxa" w:w="50"/>
+              <w:right w:type="dxa" w:w="80"/>
+            </w:tcMar>
+          </w:tcPr>
+          <w:p>
+            <w:r>
+              <w:rPr>
+                <w:color w:val="1F2937"/>
+                <w:sz w:val="19"/>
+                <w:szCs w:val="19"/>
+              </w:rPr>
+              <w:t xml:space="preserve">R 3 038 400</w:t>
             </w:r>
           </w:p>
         </w:tc>
@@ -8454,27 +8662,27 @@
                 <w:sz w:val="19"/>
                 <w:szCs w:val="19"/>
               </w:rPr>
-              <w:t xml:space="preserve">R 1 948 100</w:t>
-            </w:r>
-          </w:p>
-        </w:tc>
-        <w:tc>
-          <w:tcPr>
-            <w:tcMar>
-              <w:top w:type="dxa" w:w="50"/>
-              <w:left w:type="dxa" w:w="80"/>
-              <w:bottom w:type="dxa" w:w="50"/>
-              <w:right w:type="dxa" w:w="80"/>
-            </w:tcMar>
-          </w:tcPr>
-          <w:p>
-            <w:r>
-              <w:rPr>
-                <w:color w:val="1F2937"/>
-                <w:sz w:val="19"/>
-                <w:szCs w:val="19"/>
-              </w:rPr>
-              <w:t xml:space="preserve">R 2 668 100</w:t>
+              <w:t xml:space="preserve">R 2 318 400</w:t>
+            </w:r>
+          </w:p>
+        </w:tc>
+        <w:tc>
+          <w:tcPr>
+            <w:tcMar>
+              <w:top w:type="dxa" w:w="50"/>
+              <w:left w:type="dxa" w:w="80"/>
+              <w:bottom w:type="dxa" w:w="50"/>
+              <w:right w:type="dxa" w:w="80"/>
+            </w:tcMar>
+          </w:tcPr>
+          <w:p>
+            <w:r>
+              <w:rPr>
+                <w:color w:val="1F2937"/>
+                <w:sz w:val="19"/>
+                <w:szCs w:val="19"/>
+              </w:rPr>
+              <w:t xml:space="preserve">R 3 038 400</w:t>
             </w:r>
           </w:p>
         </w:tc>
@@ -8581,7 +8789,7 @@
                 <w:sz w:val="19"/>
                 <w:szCs w:val="19"/>
               </w:rPr>
-              <w:t xml:space="preserve">R 32 135 400</w:t>
+              <w:t xml:space="preserve">R 37 853 600</w:t>
             </w:r>
           </w:p>
         </w:tc>
@@ -8683,7 +8891,7 @@
                 <w:sz w:val="19"/>
                 <w:szCs w:val="19"/>
               </w:rPr>
-              <w:t xml:space="preserve">R 4 820 310</w:t>
+              <w:t xml:space="preserve">R 5 678 040</w:t>
             </w:r>
           </w:p>
         </w:tc>
@@ -8790,7 +8998,7 @@
                 <w:sz w:val="19"/>
                 <w:szCs w:val="19"/>
               </w:rPr>
-              <w:t xml:space="preserve">R 36 955 710</w:t>
+              <w:t xml:space="preserve">R 43 531 640</w:t>
             </w:r>
           </w:p>
         </w:tc>
@@ -8972,7 +9180,7 @@
                 <w:sz w:val="19"/>
                 <w:szCs w:val="19"/>
               </w:rPr>
-              <w:t xml:space="preserve">R 2 074 300</w:t>
+              <w:t xml:space="preserve">R 2 498 000</w:t>
             </w:r>
           </w:p>
         </w:tc>
@@ -9037,7 +9245,7 @@
                 <w:sz w:val="19"/>
                 <w:szCs w:val="19"/>
               </w:rPr>
-              <w:t xml:space="preserve">R 2 074 300</w:t>
+              <w:t xml:space="preserve">R 2 498 000</w:t>
             </w:r>
           </w:p>
         </w:tc>
@@ -9099,7 +9307,7 @@
                 <w:sz w:val="19"/>
                 <w:szCs w:val="19"/>
               </w:rPr>
-              <w:t xml:space="preserve">R 3 111 450</w:t>
+              <w:t xml:space="preserve">R 3 747 000</w:t>
             </w:r>
           </w:p>
         </w:tc>
@@ -9164,7 +9372,7 @@
                 <w:sz w:val="19"/>
                 <w:szCs w:val="19"/>
               </w:rPr>
-              <w:t xml:space="preserve">R 5 185 750</w:t>
+              <w:t xml:space="preserve">R 6 245 000</w:t>
             </w:r>
           </w:p>
         </w:tc>
@@ -9226,7 +9434,7 @@
                 <w:sz w:val="19"/>
                 <w:szCs w:val="19"/>
               </w:rPr>
-              <w:t xml:space="preserve">R 3 111 450</w:t>
+              <w:t xml:space="preserve">R 3 747 000</w:t>
             </w:r>
           </w:p>
         </w:tc>
@@ -9291,7 +9499,7 @@
                 <w:sz w:val="19"/>
                 <w:szCs w:val="19"/>
               </w:rPr>
-              <w:t xml:space="preserve">R 3 111 450</w:t>
+              <w:t xml:space="preserve">R 3 747 000</w:t>
             </w:r>
           </w:p>
         </w:tc>
@@ -9353,7 +9561,7 @@
                 <w:sz w:val="19"/>
                 <w:szCs w:val="19"/>
               </w:rPr>
-              <w:t xml:space="preserve">R 2 074 300</w:t>
+              <w:t xml:space="preserve">R 2 498 000</w:t>
             </w:r>
           </w:p>
         </w:tc>
@@ -9418,7 +9626,7 @@
                 <w:sz w:val="19"/>
                 <w:szCs w:val="19"/>
               </w:rPr>
-              <w:t xml:space="preserve">R 20 743 000</w:t>
+              <w:t xml:space="preserve">R 24 980 000</w:t>
             </w:r>
           </w:p>
         </w:tc>

</xml_diff>

<commit_message>
Set licence at R3600/user/month and land 5-year TCO in the R40-65m band
</commit_message>
<xml_diff>
--- a/public/downloads/T2-Technologies-FBM-Thabiso-Sections.docx
+++ b/public/downloads/T2-Technologies-FBM-Thabiso-Sections.docx
@@ -5753,7 +5753,7 @@
           <w:sz w:val="22"/>
           <w:szCs w:val="22"/>
         </w:rPr>
-        <w:t xml:space="preserve">Software is licensed as T2's proprietary SaaS platform on a named-user basis: 20 users at R 3 000 per user per month.</w:t>
+        <w:t xml:space="preserve">Software is licensed as T2's proprietary SaaS platform on a named-user basis: 20 users at R 3 600 per user per month.</w:t>
       </w:r>
     </w:p>
     <w:p>
@@ -6021,47 +6021,47 @@
                 <w:sz w:val="19"/>
                 <w:szCs w:val="19"/>
               </w:rPr>
-              <w:t xml:space="preserve">R 3 000 / user / month</w:t>
-            </w:r>
-          </w:p>
-        </w:tc>
-        <w:tc>
-          <w:tcPr>
-            <w:tcMar>
-              <w:top w:type="dxa" w:w="50"/>
-              <w:left w:type="dxa" w:w="80"/>
-              <w:bottom w:type="dxa" w:w="50"/>
-              <w:right w:type="dxa" w:w="80"/>
-            </w:tcMar>
-          </w:tcPr>
-          <w:p>
-            <w:r>
-              <w:rPr>
-                <w:color w:val="1F2937"/>
-                <w:sz w:val="19"/>
-                <w:szCs w:val="19"/>
-              </w:rPr>
-              <w:t xml:space="preserve">R 720 000</w:t>
-            </w:r>
-          </w:p>
-        </w:tc>
-        <w:tc>
-          <w:tcPr>
-            <w:tcMar>
-              <w:top w:type="dxa" w:w="50"/>
-              <w:left w:type="dxa" w:w="80"/>
-              <w:bottom w:type="dxa" w:w="50"/>
-              <w:right w:type="dxa" w:w="80"/>
-            </w:tcMar>
-          </w:tcPr>
-          <w:p>
-            <w:r>
-              <w:rPr>
-                <w:color w:val="1F2937"/>
-                <w:sz w:val="19"/>
-                <w:szCs w:val="19"/>
-              </w:rPr>
-              <w:t xml:space="preserve">R 3 600 000</w:t>
+              <w:t xml:space="preserve">R 3 600 / user / month</w:t>
+            </w:r>
+          </w:p>
+        </w:tc>
+        <w:tc>
+          <w:tcPr>
+            <w:tcMar>
+              <w:top w:type="dxa" w:w="50"/>
+              <w:left w:type="dxa" w:w="80"/>
+              <w:bottom w:type="dxa" w:w="50"/>
+              <w:right w:type="dxa" w:w="80"/>
+            </w:tcMar>
+          </w:tcPr>
+          <w:p>
+            <w:r>
+              <w:rPr>
+                <w:color w:val="1F2937"/>
+                <w:sz w:val="19"/>
+                <w:szCs w:val="19"/>
+              </w:rPr>
+              <w:t xml:space="preserve">R 864 000</w:t>
+            </w:r>
+          </w:p>
+        </w:tc>
+        <w:tc>
+          <w:tcPr>
+            <w:tcMar>
+              <w:top w:type="dxa" w:w="50"/>
+              <w:left w:type="dxa" w:w="80"/>
+              <w:bottom w:type="dxa" w:w="50"/>
+              <w:right w:type="dxa" w:w="80"/>
+            </w:tcMar>
+          </w:tcPr>
+          <w:p>
+            <w:r>
+              <w:rPr>
+                <w:color w:val="1F2937"/>
+                <w:sz w:val="19"/>
+                <w:szCs w:val="19"/>
+              </w:rPr>
+              <w:t xml:space="preserve">R 4 320 000</w:t>
             </w:r>
           </w:p>
         </w:tc>
@@ -7952,7 +7952,7 @@
                 <w:sz w:val="19"/>
                 <w:szCs w:val="19"/>
               </w:rPr>
-              <w:t xml:space="preserve">R 2 318 400</w:t>
+              <w:t xml:space="preserve">R 3 330 400</w:t>
             </w:r>
           </w:p>
         </w:tc>
@@ -7992,7 +7992,7 @@
                 <w:sz w:val="19"/>
                 <w:szCs w:val="19"/>
               </w:rPr>
-              <w:t xml:space="preserve">R 9 273 600</w:t>
+              <w:t xml:space="preserve">R 13 321 600</w:t>
             </w:r>
           </w:p>
         </w:tc>
@@ -8224,7 +8224,7 @@
                 <w:sz w:val="19"/>
                 <w:szCs w:val="19"/>
               </w:rPr>
-              <w:t xml:space="preserve">R 720 000</w:t>
+              <w:t xml:space="preserve">R 864 000</w:t>
             </w:r>
           </w:p>
         </w:tc>
@@ -8264,7 +8264,7 @@
                 <w:sz w:val="19"/>
                 <w:szCs w:val="19"/>
               </w:rPr>
-              <w:t xml:space="preserve">R 25 700 000</w:t>
+              <w:t xml:space="preserve">R 25 844 000</w:t>
             </w:r>
           </w:p>
         </w:tc>
@@ -8329,49 +8329,49 @@
                 <w:sz w:val="19"/>
                 <w:szCs w:val="19"/>
               </w:rPr>
-              <w:t xml:space="preserve">R 720 000</w:t>
-            </w:r>
-          </w:p>
-        </w:tc>
-        <w:tc>
-          <w:tcPr>
-            <w:shd w:fill="F3F4F6" w:val="clear"/>
-            <w:tcMar>
-              <w:top w:type="dxa" w:w="50"/>
-              <w:left w:type="dxa" w:w="80"/>
-              <w:bottom w:type="dxa" w:w="50"/>
-              <w:right w:type="dxa" w:w="80"/>
-            </w:tcMar>
-          </w:tcPr>
-          <w:p>
-            <w:r>
-              <w:rPr>
-                <w:color w:val="1F2937"/>
-                <w:sz w:val="19"/>
-                <w:szCs w:val="19"/>
-              </w:rPr>
-              <w:t xml:space="preserve">R 2 318 400</w:t>
-            </w:r>
-          </w:p>
-        </w:tc>
-        <w:tc>
-          <w:tcPr>
-            <w:shd w:fill="F3F4F6" w:val="clear"/>
-            <w:tcMar>
-              <w:top w:type="dxa" w:w="50"/>
-              <w:left w:type="dxa" w:w="80"/>
-              <w:bottom w:type="dxa" w:w="50"/>
-              <w:right w:type="dxa" w:w="80"/>
-            </w:tcMar>
-          </w:tcPr>
-          <w:p>
-            <w:r>
-              <w:rPr>
-                <w:color w:val="1F2937"/>
-                <w:sz w:val="19"/>
-                <w:szCs w:val="19"/>
-              </w:rPr>
-              <w:t xml:space="preserve">R 3 038 400</w:t>
+              <w:t xml:space="preserve">R 864 000</w:t>
+            </w:r>
+          </w:p>
+        </w:tc>
+        <w:tc>
+          <w:tcPr>
+            <w:shd w:fill="F3F4F6" w:val="clear"/>
+            <w:tcMar>
+              <w:top w:type="dxa" w:w="50"/>
+              <w:left w:type="dxa" w:w="80"/>
+              <w:bottom w:type="dxa" w:w="50"/>
+              <w:right w:type="dxa" w:w="80"/>
+            </w:tcMar>
+          </w:tcPr>
+          <w:p>
+            <w:r>
+              <w:rPr>
+                <w:color w:val="1F2937"/>
+                <w:sz w:val="19"/>
+                <w:szCs w:val="19"/>
+              </w:rPr>
+              <w:t xml:space="preserve">R 3 330 400</w:t>
+            </w:r>
+          </w:p>
+        </w:tc>
+        <w:tc>
+          <w:tcPr>
+            <w:shd w:fill="F3F4F6" w:val="clear"/>
+            <w:tcMar>
+              <w:top w:type="dxa" w:w="50"/>
+              <w:left w:type="dxa" w:w="80"/>
+              <w:bottom w:type="dxa" w:w="50"/>
+              <w:right w:type="dxa" w:w="80"/>
+            </w:tcMar>
+          </w:tcPr>
+          <w:p>
+            <w:r>
+              <w:rPr>
+                <w:color w:val="1F2937"/>
+                <w:sz w:val="19"/>
+                <w:szCs w:val="19"/>
+              </w:rPr>
+              <w:t xml:space="preserve">R 4 194 400</w:t>
             </w:r>
           </w:p>
         </w:tc>
@@ -8433,47 +8433,47 @@
                 <w:sz w:val="19"/>
                 <w:szCs w:val="19"/>
               </w:rPr>
-              <w:t xml:space="preserve">R 720 000</w:t>
-            </w:r>
-          </w:p>
-        </w:tc>
-        <w:tc>
-          <w:tcPr>
-            <w:tcMar>
-              <w:top w:type="dxa" w:w="50"/>
-              <w:left w:type="dxa" w:w="80"/>
-              <w:bottom w:type="dxa" w:w="50"/>
-              <w:right w:type="dxa" w:w="80"/>
-            </w:tcMar>
-          </w:tcPr>
-          <w:p>
-            <w:r>
-              <w:rPr>
-                <w:color w:val="1F2937"/>
-                <w:sz w:val="19"/>
-                <w:szCs w:val="19"/>
-              </w:rPr>
-              <w:t xml:space="preserve">R 2 318 400</w:t>
-            </w:r>
-          </w:p>
-        </w:tc>
-        <w:tc>
-          <w:tcPr>
-            <w:tcMar>
-              <w:top w:type="dxa" w:w="50"/>
-              <w:left w:type="dxa" w:w="80"/>
-              <w:bottom w:type="dxa" w:w="50"/>
-              <w:right w:type="dxa" w:w="80"/>
-            </w:tcMar>
-          </w:tcPr>
-          <w:p>
-            <w:r>
-              <w:rPr>
-                <w:color w:val="1F2937"/>
-                <w:sz w:val="19"/>
-                <w:szCs w:val="19"/>
-              </w:rPr>
-              <w:t xml:space="preserve">R 3 038 400</w:t>
+              <w:t xml:space="preserve">R 864 000</w:t>
+            </w:r>
+          </w:p>
+        </w:tc>
+        <w:tc>
+          <w:tcPr>
+            <w:tcMar>
+              <w:top w:type="dxa" w:w="50"/>
+              <w:left w:type="dxa" w:w="80"/>
+              <w:bottom w:type="dxa" w:w="50"/>
+              <w:right w:type="dxa" w:w="80"/>
+            </w:tcMar>
+          </w:tcPr>
+          <w:p>
+            <w:r>
+              <w:rPr>
+                <w:color w:val="1F2937"/>
+                <w:sz w:val="19"/>
+                <w:szCs w:val="19"/>
+              </w:rPr>
+              <w:t xml:space="preserve">R 3 330 400</w:t>
+            </w:r>
+          </w:p>
+        </w:tc>
+        <w:tc>
+          <w:tcPr>
+            <w:tcMar>
+              <w:top w:type="dxa" w:w="50"/>
+              <w:left w:type="dxa" w:w="80"/>
+              <w:bottom w:type="dxa" w:w="50"/>
+              <w:right w:type="dxa" w:w="80"/>
+            </w:tcMar>
+          </w:tcPr>
+          <w:p>
+            <w:r>
+              <w:rPr>
+                <w:color w:val="1F2937"/>
+                <w:sz w:val="19"/>
+                <w:szCs w:val="19"/>
+              </w:rPr>
+              <w:t xml:space="preserve">R 4 194 400</w:t>
             </w:r>
           </w:p>
         </w:tc>
@@ -8538,49 +8538,49 @@
                 <w:sz w:val="19"/>
                 <w:szCs w:val="19"/>
               </w:rPr>
-              <w:t xml:space="preserve">R 720 000</w:t>
-            </w:r>
-          </w:p>
-        </w:tc>
-        <w:tc>
-          <w:tcPr>
-            <w:shd w:fill="F3F4F6" w:val="clear"/>
-            <w:tcMar>
-              <w:top w:type="dxa" w:w="50"/>
-              <w:left w:type="dxa" w:w="80"/>
-              <w:bottom w:type="dxa" w:w="50"/>
-              <w:right w:type="dxa" w:w="80"/>
-            </w:tcMar>
-          </w:tcPr>
-          <w:p>
-            <w:r>
-              <w:rPr>
-                <w:color w:val="1F2937"/>
-                <w:sz w:val="19"/>
-                <w:szCs w:val="19"/>
-              </w:rPr>
-              <w:t xml:space="preserve">R 2 318 400</w:t>
-            </w:r>
-          </w:p>
-        </w:tc>
-        <w:tc>
-          <w:tcPr>
-            <w:shd w:fill="F3F4F6" w:val="clear"/>
-            <w:tcMar>
-              <w:top w:type="dxa" w:w="50"/>
-              <w:left w:type="dxa" w:w="80"/>
-              <w:bottom w:type="dxa" w:w="50"/>
-              <w:right w:type="dxa" w:w="80"/>
-            </w:tcMar>
-          </w:tcPr>
-          <w:p>
-            <w:r>
-              <w:rPr>
-                <w:color w:val="1F2937"/>
-                <w:sz w:val="19"/>
-                <w:szCs w:val="19"/>
-              </w:rPr>
-              <w:t xml:space="preserve">R 3 038 400</w:t>
+              <w:t xml:space="preserve">R 864 000</w:t>
+            </w:r>
+          </w:p>
+        </w:tc>
+        <w:tc>
+          <w:tcPr>
+            <w:shd w:fill="F3F4F6" w:val="clear"/>
+            <w:tcMar>
+              <w:top w:type="dxa" w:w="50"/>
+              <w:left w:type="dxa" w:w="80"/>
+              <w:bottom w:type="dxa" w:w="50"/>
+              <w:right w:type="dxa" w:w="80"/>
+            </w:tcMar>
+          </w:tcPr>
+          <w:p>
+            <w:r>
+              <w:rPr>
+                <w:color w:val="1F2937"/>
+                <w:sz w:val="19"/>
+                <w:szCs w:val="19"/>
+              </w:rPr>
+              <w:t xml:space="preserve">R 3 330 400</w:t>
+            </w:r>
+          </w:p>
+        </w:tc>
+        <w:tc>
+          <w:tcPr>
+            <w:shd w:fill="F3F4F6" w:val="clear"/>
+            <w:tcMar>
+              <w:top w:type="dxa" w:w="50"/>
+              <w:left w:type="dxa" w:w="80"/>
+              <w:bottom w:type="dxa" w:w="50"/>
+              <w:right w:type="dxa" w:w="80"/>
+            </w:tcMar>
+          </w:tcPr>
+          <w:p>
+            <w:r>
+              <w:rPr>
+                <w:color w:val="1F2937"/>
+                <w:sz w:val="19"/>
+                <w:szCs w:val="19"/>
+              </w:rPr>
+              <w:t xml:space="preserve">R 4 194 400</w:t>
             </w:r>
           </w:p>
         </w:tc>
@@ -8642,47 +8642,47 @@
                 <w:sz w:val="19"/>
                 <w:szCs w:val="19"/>
               </w:rPr>
-              <w:t xml:space="preserve">R 720 000</w:t>
-            </w:r>
-          </w:p>
-        </w:tc>
-        <w:tc>
-          <w:tcPr>
-            <w:tcMar>
-              <w:top w:type="dxa" w:w="50"/>
-              <w:left w:type="dxa" w:w="80"/>
-              <w:bottom w:type="dxa" w:w="50"/>
-              <w:right w:type="dxa" w:w="80"/>
-            </w:tcMar>
-          </w:tcPr>
-          <w:p>
-            <w:r>
-              <w:rPr>
-                <w:color w:val="1F2937"/>
-                <w:sz w:val="19"/>
-                <w:szCs w:val="19"/>
-              </w:rPr>
-              <w:t xml:space="preserve">R 2 318 400</w:t>
-            </w:r>
-          </w:p>
-        </w:tc>
-        <w:tc>
-          <w:tcPr>
-            <w:tcMar>
-              <w:top w:type="dxa" w:w="50"/>
-              <w:left w:type="dxa" w:w="80"/>
-              <w:bottom w:type="dxa" w:w="50"/>
-              <w:right w:type="dxa" w:w="80"/>
-            </w:tcMar>
-          </w:tcPr>
-          <w:p>
-            <w:r>
-              <w:rPr>
-                <w:color w:val="1F2937"/>
-                <w:sz w:val="19"/>
-                <w:szCs w:val="19"/>
-              </w:rPr>
-              <w:t xml:space="preserve">R 3 038 400</w:t>
+              <w:t xml:space="preserve">R 864 000</w:t>
+            </w:r>
+          </w:p>
+        </w:tc>
+        <w:tc>
+          <w:tcPr>
+            <w:tcMar>
+              <w:top w:type="dxa" w:w="50"/>
+              <w:left w:type="dxa" w:w="80"/>
+              <w:bottom w:type="dxa" w:w="50"/>
+              <w:right w:type="dxa" w:w="80"/>
+            </w:tcMar>
+          </w:tcPr>
+          <w:p>
+            <w:r>
+              <w:rPr>
+                <w:color w:val="1F2937"/>
+                <w:sz w:val="19"/>
+                <w:szCs w:val="19"/>
+              </w:rPr>
+              <w:t xml:space="preserve">R 3 330 400</w:t>
+            </w:r>
+          </w:p>
+        </w:tc>
+        <w:tc>
+          <w:tcPr>
+            <w:tcMar>
+              <w:top w:type="dxa" w:w="50"/>
+              <w:left w:type="dxa" w:w="80"/>
+              <w:bottom w:type="dxa" w:w="50"/>
+              <w:right w:type="dxa" w:w="80"/>
+            </w:tcMar>
+          </w:tcPr>
+          <w:p>
+            <w:r>
+              <w:rPr>
+                <w:color w:val="1F2937"/>
+                <w:sz w:val="19"/>
+                <w:szCs w:val="19"/>
+              </w:rPr>
+              <w:t xml:space="preserve">R 4 194 400</w:t>
             </w:r>
           </w:p>
         </w:tc>
@@ -8789,7 +8789,7 @@
                 <w:sz w:val="19"/>
                 <w:szCs w:val="19"/>
               </w:rPr>
-              <w:t xml:space="preserve">R 37 853 600</w:t>
+              <w:t xml:space="preserve">R 42 621 600</w:t>
             </w:r>
           </w:p>
         </w:tc>
@@ -8891,7 +8891,7 @@
                 <w:sz w:val="19"/>
                 <w:szCs w:val="19"/>
               </w:rPr>
-              <w:t xml:space="preserve">R 5 678 040</w:t>
+              <w:t xml:space="preserve">R 6 393 240</w:t>
             </w:r>
           </w:p>
         </w:tc>
@@ -8998,7 +8998,7 @@
                 <w:sz w:val="19"/>
                 <w:szCs w:val="19"/>
               </w:rPr>
-              <w:t xml:space="preserve">R 43 531 640</w:t>
+              <w:t xml:space="preserve">R 49 014 840</w:t>
             </w:r>
           </w:p>
         </w:tc>

</xml_diff>

<commit_message>
Align licence to SoW sliding scale + 5-yr S&M; add missing scope subsections (mobile offline, substation balancing, WAF, EA gates, data migration, DBS)
</commit_message>
<xml_diff>
--- a/public/downloads/T2-Technologies-FBM-Thabiso-Sections.docx
+++ b/public/downloads/T2-Technologies-FBM-Thabiso-Sections.docx
@@ -1843,6 +1843,324 @@
     </w:p>
     <w:p>
       <w:pPr>
+        <w:spacing w:after="80" w:before="160"/>
+      </w:pPr>
+      <w:r>
+        <w:rPr>
+          <w:b/>
+          <w:bCs/>
+          <w:color w:val="1F2937"/>
+          <w:sz w:val="24"/>
+          <w:szCs w:val="24"/>
+        </w:rPr>
+        <w:t xml:space="preserve">5.4 Mobile Offline Field Audit</w:t>
+      </w:r>
+    </w:p>
+    <w:p>
+      <w:pPr>
+        <w:spacing w:after="120"/>
+      </w:pPr>
+      <w:r>
+        <w:rPr>
+          <w:color w:val="1F2937"/>
+          <w:sz w:val="22"/>
+          <w:szCs w:val="22"/>
+        </w:rPr>
+        <w:t xml:space="preserve">The SoW requires that the worst-performing feeders can be taken into the field for physical audit and that findings are captured and returned to the source systems. The solution supports an offline-capable mobile workflow so that audits proceed in areas with poor or no connectivity.</w:t>
+      </w:r>
+    </w:p>
+    <w:p>
+      <w:pPr>
+        <w:pStyle w:val="ListParagraph"/>
+        <w:numPr>
+          <w:ilvl w:val="0"/>
+          <w:numId w:val="1"/>
+        </w:numPr>
+        <w:spacing w:after="60"/>
+      </w:pPr>
+      <w:r>
+        <w:rPr>
+          <w:color w:val="1F2937"/>
+          <w:sz w:val="22"/>
+          <w:szCs w:val="22"/>
+        </w:rPr>
+        <w:t xml:space="preserve">Export a prioritised worklist of the worst-performing feeders/meters to a mobile device for field audit.</w:t>
+      </w:r>
+    </w:p>
+    <w:p>
+      <w:pPr>
+        <w:pStyle w:val="ListParagraph"/>
+        <w:numPr>
+          <w:ilvl w:val="0"/>
+          <w:numId w:val="1"/>
+        </w:numPr>
+        <w:spacing w:after="60"/>
+      </w:pPr>
+      <w:r>
+        <w:rPr>
+          <w:color w:val="1F2937"/>
+          <w:sz w:val="22"/>
+          <w:szCs w:val="22"/>
+        </w:rPr>
+        <w:t xml:space="preserve">Capture audit findings, meter conditions, photographs and GPS location while offline.</w:t>
+      </w:r>
+    </w:p>
+    <w:p>
+      <w:pPr>
+        <w:pStyle w:val="ListParagraph"/>
+        <w:numPr>
+          <w:ilvl w:val="0"/>
+          <w:numId w:val="1"/>
+        </w:numPr>
+        <w:spacing w:after="60"/>
+      </w:pPr>
+      <w:r>
+        <w:rPr>
+          <w:color w:val="1F2937"/>
+          <w:sz w:val="22"/>
+          <w:szCs w:val="22"/>
+        </w:rPr>
+        <w:t xml:space="preserve">On-device data validation to enforce completeness and correctness before submission.</w:t>
+      </w:r>
+    </w:p>
+    <w:p>
+      <w:pPr>
+        <w:pStyle w:val="ListParagraph"/>
+        <w:numPr>
+          <w:ilvl w:val="0"/>
+          <w:numId w:val="1"/>
+        </w:numPr>
+        <w:spacing w:after="60"/>
+      </w:pPr>
+      <w:r>
+        <w:rPr>
+          <w:color w:val="1F2937"/>
+          <w:sz w:val="22"/>
+          <w:szCs w:val="22"/>
+        </w:rPr>
+        <w:t xml:space="preserve">Automatic, conflict-aware synchronisation and write-back to the source systems once connectivity is restored.</w:t>
+      </w:r>
+    </w:p>
+    <w:p>
+      <w:pPr>
+        <w:pStyle w:val="ListParagraph"/>
+        <w:numPr>
+          <w:ilvl w:val="0"/>
+          <w:numId w:val="1"/>
+        </w:numPr>
+        <w:spacing w:after="60"/>
+      </w:pPr>
+      <w:r>
+        <w:rPr>
+          <w:color w:val="1F2937"/>
+          <w:sz w:val="22"/>
+          <w:szCs w:val="22"/>
+        </w:rPr>
+        <w:t xml:space="preserve">Full audit trail linking each field finding to the originating feeder, auditor and work order.</w:t>
+      </w:r>
+    </w:p>
+    <w:p>
+      <w:pPr>
+        <w:spacing w:after="80" w:before="160"/>
+      </w:pPr>
+      <w:r>
+        <w:rPr>
+          <w:b/>
+          <w:bCs/>
+          <w:color w:val="1F2937"/>
+          <w:sz w:val="24"/>
+          <w:szCs w:val="24"/>
+        </w:rPr>
+        <w:t xml:space="preserve">5.5 Substation-Level Balancing and Reporting</w:t>
+      </w:r>
+    </w:p>
+    <w:p>
+      <w:pPr>
+        <w:spacing w:after="120"/>
+      </w:pPr>
+      <w:r>
+        <w:rPr>
+          <w:color w:val="1F2937"/>
+          <w:sz w:val="22"/>
+          <w:szCs w:val="22"/>
+        </w:rPr>
+        <w:t xml:space="preserve">In addition to feeder-level analysis, the solution provides energy balancing and reporting at substation level, including substations shared across business units, so that losses can be located and attributed accurately across the hierarchy.</w:t>
+      </w:r>
+    </w:p>
+    <w:p>
+      <w:pPr>
+        <w:pStyle w:val="ListParagraph"/>
+        <w:numPr>
+          <w:ilvl w:val="0"/>
+          <w:numId w:val="1"/>
+        </w:numPr>
+        <w:spacing w:after="60"/>
+      </w:pPr>
+      <w:r>
+        <w:rPr>
+          <w:color w:val="1F2937"/>
+          <w:sz w:val="22"/>
+          <w:szCs w:val="22"/>
+        </w:rPr>
+        <w:t xml:space="preserve">Energy balancing computed and visualised at substation level as well as feeder level.</w:t>
+      </w:r>
+    </w:p>
+    <w:p>
+      <w:pPr>
+        <w:pStyle w:val="ListParagraph"/>
+        <w:numPr>
+          <w:ilvl w:val="0"/>
+          <w:numId w:val="1"/>
+        </w:numPr>
+        <w:spacing w:after="60"/>
+      </w:pPr>
+      <w:r>
+        <w:rPr>
+          <w:color w:val="1F2937"/>
+          <w:sz w:val="22"/>
+          <w:szCs w:val="22"/>
+        </w:rPr>
+        <w:t xml:space="preserve">Correct handling of shared substations and feeder-based (rather than substation-based) business boundaries.</w:t>
+      </w:r>
+    </w:p>
+    <w:p>
+      <w:pPr>
+        <w:pStyle w:val="ListParagraph"/>
+        <w:numPr>
+          <w:ilvl w:val="0"/>
+          <w:numId w:val="1"/>
+        </w:numPr>
+        <w:spacing w:after="60"/>
+      </w:pPr>
+      <w:r>
+        <w:rPr>
+          <w:color w:val="1F2937"/>
+          <w:sz w:val="22"/>
+          <w:szCs w:val="22"/>
+        </w:rPr>
+        <w:t xml:space="preserve">Bulk, reticulation and consolidated views produced as separate, reconcilable reports.</w:t>
+      </w:r>
+    </w:p>
+    <w:p>
+      <w:pPr>
+        <w:pStyle w:val="ListParagraph"/>
+        <w:numPr>
+          <w:ilvl w:val="0"/>
+          <w:numId w:val="1"/>
+        </w:numPr>
+        <w:spacing w:after="60"/>
+      </w:pPr>
+      <w:r>
+        <w:rPr>
+          <w:color w:val="1F2937"/>
+          <w:sz w:val="22"/>
+          <w:szCs w:val="22"/>
+        </w:rPr>
+        <w:t xml:space="preserve">Substation results published to the BI/corporate reporting layer for downstream consumption.</w:t>
+      </w:r>
+    </w:p>
+    <w:p>
+      <w:pPr>
+        <w:spacing w:after="80" w:before="160"/>
+      </w:pPr>
+      <w:r>
+        <w:rPr>
+          <w:b/>
+          <w:bCs/>
+          <w:color w:val="1F2937"/>
+          <w:sz w:val="24"/>
+          <w:szCs w:val="24"/>
+        </w:rPr>
+        <w:t xml:space="preserve">5.6 Losses Reduction Potential and National KPI Drill-Down</w:t>
+      </w:r>
+    </w:p>
+    <w:p>
+      <w:pPr>
+        <w:spacing w:after="120"/>
+      </w:pPr>
+      <w:r>
+        <w:rPr>
+          <w:color w:val="1F2937"/>
+          <w:sz w:val="22"/>
+          <w:szCs w:val="22"/>
+        </w:rPr>
+        <w:t xml:space="preserve">The solution surfaces where intervention will yield the greatest return and lets users navigate results across the full national hierarchy.</w:t>
+      </w:r>
+    </w:p>
+    <w:p>
+      <w:pPr>
+        <w:pStyle w:val="ListParagraph"/>
+        <w:numPr>
+          <w:ilvl w:val="0"/>
+          <w:numId w:val="1"/>
+        </w:numPr>
+        <w:spacing w:after="60"/>
+      </w:pPr>
+      <w:r>
+        <w:rPr>
+          <w:color w:val="1F2937"/>
+          <w:sz w:val="22"/>
+          <w:szCs w:val="22"/>
+        </w:rPr>
+        <w:t xml:space="preserve">Losses Reduction Potential tool that ranks networks by the recoverable-loss opportunity to direct field effort.</w:t>
+      </w:r>
+    </w:p>
+    <w:p>
+      <w:pPr>
+        <w:pStyle w:val="ListParagraph"/>
+        <w:numPr>
+          <w:ilvl w:val="0"/>
+          <w:numId w:val="1"/>
+        </w:numPr>
+        <w:spacing w:after="60"/>
+      </w:pPr>
+      <w:r>
+        <w:rPr>
+          <w:color w:val="1F2937"/>
+          <w:sz w:val="22"/>
+          <w:szCs w:val="22"/>
+        </w:rPr>
+        <w:t xml:space="preserve">National KPI drill-down across the eight levels — Cluster, Operating Unit, Zone, Sector, CNC, and down to feeder and meter.</w:t>
+      </w:r>
+    </w:p>
+    <w:p>
+      <w:pPr>
+        <w:pStyle w:val="ListParagraph"/>
+        <w:numPr>
+          <w:ilvl w:val="0"/>
+          <w:numId w:val="1"/>
+        </w:numPr>
+        <w:spacing w:after="60"/>
+      </w:pPr>
+      <w:r>
+        <w:rPr>
+          <w:color w:val="1F2937"/>
+          <w:sz w:val="22"/>
+          <w:szCs w:val="22"/>
+        </w:rPr>
+        <w:t xml:space="preserve">Comparison of current versus historical performance over selectable durations, with bar and line visualisations.</w:t>
+      </w:r>
+    </w:p>
+    <w:p>
+      <w:pPr>
+        <w:pStyle w:val="ListParagraph"/>
+        <w:numPr>
+          <w:ilvl w:val="0"/>
+          <w:numId w:val="1"/>
+        </w:numPr>
+        <w:spacing w:after="60"/>
+      </w:pPr>
+      <w:r>
+        <w:rPr>
+          <w:color w:val="1F2937"/>
+          <w:sz w:val="22"/>
+          <w:szCs w:val="22"/>
+        </w:rPr>
+        <w:t xml:space="preserve">Publication of KPI results to corporate BI and the Losses Reduction Potential tool.</w:t>
+      </w:r>
+    </w:p>
+    <w:p>
+      <w:pPr>
         <w:pStyle w:val="Heading1"/>
         <w:pageBreakBefore/>
         <w:spacing w:after="40" w:before="200"/>
@@ -2754,6 +3072,224 @@
     </w:p>
     <w:p>
       <w:pPr>
+        <w:spacing w:after="80" w:before="160"/>
+      </w:pPr>
+      <w:r>
+        <w:rPr>
+          <w:b/>
+          <w:bCs/>
+          <w:color w:val="1F2937"/>
+          <w:sz w:val="24"/>
+          <w:szCs w:val="24"/>
+        </w:rPr>
+        <w:t xml:space="preserve">6.2 Data Migration and Take-On Approach</w:t>
+      </w:r>
+    </w:p>
+    <w:p>
+      <w:pPr>
+        <w:spacing w:after="120"/>
+      </w:pPr>
+      <w:r>
+        <w:rPr>
+          <w:color w:val="1F2937"/>
+          <w:sz w:val="22"/>
+          <w:szCs w:val="22"/>
+        </w:rPr>
+        <w:t xml:space="preserve">The SoW provides for data take-on as and when required. T2 Technologies applies a controlled, repeatable migration method so that data quality is proven before go-live and each run is auditable.</w:t>
+      </w:r>
+    </w:p>
+    <w:p>
+      <w:pPr>
+        <w:pStyle w:val="ListParagraph"/>
+        <w:numPr>
+          <w:ilvl w:val="0"/>
+          <w:numId w:val="1"/>
+        </w:numPr>
+        <w:spacing w:after="60"/>
+      </w:pPr>
+      <w:r>
+        <w:rPr>
+          <w:color w:val="1F2937"/>
+          <w:sz w:val="22"/>
+          <w:szCs w:val="22"/>
+        </w:rPr>
+        <w:t xml:space="preserve">Source profiling and data-quality assessment to size and de-risk the migration.</w:t>
+      </w:r>
+    </w:p>
+    <w:p>
+      <w:pPr>
+        <w:pStyle w:val="ListParagraph"/>
+        <w:numPr>
+          <w:ilvl w:val="0"/>
+          <w:numId w:val="1"/>
+        </w:numPr>
+        <w:spacing w:after="60"/>
+      </w:pPr>
+      <w:r>
+        <w:rPr>
+          <w:color w:val="1F2937"/>
+          <w:sz w:val="22"/>
+          <w:szCs w:val="22"/>
+        </w:rPr>
+        <w:t xml:space="preserve">Documented mapping from source systems to the FBM canonical model, with transformation rules.</w:t>
+      </w:r>
+    </w:p>
+    <w:p>
+      <w:pPr>
+        <w:pStyle w:val="ListParagraph"/>
+        <w:numPr>
+          <w:ilvl w:val="0"/>
+          <w:numId w:val="1"/>
+        </w:numPr>
+        <w:spacing w:after="60"/>
+      </w:pPr>
+      <w:r>
+        <w:rPr>
+          <w:color w:val="1F2937"/>
+          <w:sz w:val="22"/>
+          <w:szCs w:val="22"/>
+        </w:rPr>
+        <w:t xml:space="preserve">Extract-transform-load pipelines with automated validation, reconciliation and exception reporting.</w:t>
+      </w:r>
+    </w:p>
+    <w:p>
+      <w:pPr>
+        <w:pStyle w:val="ListParagraph"/>
+        <w:numPr>
+          <w:ilvl w:val="0"/>
+          <w:numId w:val="1"/>
+        </w:numPr>
+        <w:spacing w:after="60"/>
+      </w:pPr>
+      <w:r>
+        <w:rPr>
+          <w:color w:val="1F2937"/>
+          <w:sz w:val="22"/>
+          <w:szCs w:val="22"/>
+        </w:rPr>
+        <w:t xml:space="preserve">Iterative migration rehearsals (mock runs) with sign-off before the production cut-over.</w:t>
+      </w:r>
+    </w:p>
+    <w:p>
+      <w:pPr>
+        <w:pStyle w:val="ListParagraph"/>
+        <w:numPr>
+          <w:ilvl w:val="0"/>
+          <w:numId w:val="1"/>
+        </w:numPr>
+        <w:spacing w:after="60"/>
+      </w:pPr>
+      <w:r>
+        <w:rPr>
+          <w:color w:val="1F2937"/>
+          <w:sz w:val="22"/>
+          <w:szCs w:val="22"/>
+        </w:rPr>
+        <w:t xml:space="preserve">Reconciliation reports and a rollback position for every run; personal data masked in non-production.</w:t>
+      </w:r>
+    </w:p>
+    <w:p>
+      <w:pPr>
+        <w:spacing w:after="80" w:before="160"/>
+      </w:pPr>
+      <w:r>
+        <w:rPr>
+          <w:b/>
+          <w:bCs/>
+          <w:color w:val="1F2937"/>
+          <w:sz w:val="24"/>
+          <w:szCs w:val="24"/>
+        </w:rPr>
+        <w:t xml:space="preserve">6.3 Deliverable Breakdown Structure and Acceptance</w:t>
+      </w:r>
+    </w:p>
+    <w:p>
+      <w:pPr>
+        <w:spacing w:after="120"/>
+      </w:pPr>
+      <w:r>
+        <w:rPr>
+          <w:color w:val="1F2937"/>
+          <w:sz w:val="22"/>
+          <w:szCs w:val="22"/>
+        </w:rPr>
+        <w:t xml:space="preserve">Each priced deliverable is defined, produced and formally accepted before the associated payment milestone is invoiced, matching the tender's deliverable-based acceptance model.</w:t>
+      </w:r>
+    </w:p>
+    <w:p>
+      <w:pPr>
+        <w:pStyle w:val="ListParagraph"/>
+        <w:numPr>
+          <w:ilvl w:val="0"/>
+          <w:numId w:val="1"/>
+        </w:numPr>
+        <w:spacing w:after="60"/>
+      </w:pPr>
+      <w:r>
+        <w:rPr>
+          <w:color w:val="1F2937"/>
+          <w:sz w:val="22"/>
+          <w:szCs w:val="22"/>
+        </w:rPr>
+        <w:t xml:space="preserve">A Deliverable Breakdown Structure maps every deliverable to its work package, acceptance criteria and payment milestone (see Section 17.7).</w:t>
+      </w:r>
+    </w:p>
+    <w:p>
+      <w:pPr>
+        <w:pStyle w:val="ListParagraph"/>
+        <w:numPr>
+          <w:ilvl w:val="0"/>
+          <w:numId w:val="1"/>
+        </w:numPr>
+        <w:spacing w:after="60"/>
+      </w:pPr>
+      <w:r>
+        <w:rPr>
+          <w:color w:val="1F2937"/>
+          <w:sz w:val="22"/>
+          <w:szCs w:val="22"/>
+        </w:rPr>
+        <w:t xml:space="preserve">Each deliverable is reviewed against pre-agreed acceptance criteria before sign-off.</w:t>
+      </w:r>
+    </w:p>
+    <w:p>
+      <w:pPr>
+        <w:pStyle w:val="ListParagraph"/>
+        <w:numPr>
+          <w:ilvl w:val="0"/>
+          <w:numId w:val="1"/>
+        </w:numPr>
+        <w:spacing w:after="60"/>
+      </w:pPr>
+      <w:r>
+        <w:rPr>
+          <w:color w:val="1F2937"/>
+          <w:sz w:val="22"/>
+          <w:szCs w:val="22"/>
+        </w:rPr>
+        <w:t xml:space="preserve">A Delivery Acceptance Certificate is issued and signed by the Client for each accepted deliverable.</w:t>
+      </w:r>
+    </w:p>
+    <w:p>
+      <w:pPr>
+        <w:pStyle w:val="ListParagraph"/>
+        <w:numPr>
+          <w:ilvl w:val="0"/>
+          <w:numId w:val="1"/>
+        </w:numPr>
+        <w:spacing w:after="60"/>
+      </w:pPr>
+      <w:r>
+        <w:rPr>
+          <w:color w:val="1F2937"/>
+          <w:sz w:val="22"/>
+          <w:szCs w:val="22"/>
+        </w:rPr>
+        <w:t xml:space="preserve">Only accepted deliverables trigger invoicing, giving the Client clear cost-to-value control.</w:t>
+      </w:r>
+    </w:p>
+    <w:p>
+      <w:pPr>
         <w:pStyle w:val="Heading1"/>
         <w:pageBreakBefore/>
         <w:spacing w:after="40" w:before="200"/>
@@ -3430,6 +3966,206 @@
     </w:p>
     <w:p>
       <w:pPr>
+        <w:spacing w:after="80" w:before="160"/>
+      </w:pPr>
+      <w:r>
+        <w:rPr>
+          <w:b/>
+          <w:bCs/>
+          <w:color w:val="1F2937"/>
+          <w:sz w:val="24"/>
+          <w:szCs w:val="24"/>
+        </w:rPr>
+        <w:t xml:space="preserve">7.2 Enterprise Architecture Governance Gates</w:t>
+      </w:r>
+    </w:p>
+    <w:p>
+      <w:pPr>
+        <w:spacing w:after="120"/>
+      </w:pPr>
+      <w:r>
+        <w:rPr>
+          <w:color w:val="1F2937"/>
+          <w:sz w:val="22"/>
+          <w:szCs w:val="22"/>
+        </w:rPr>
+        <w:t xml:space="preserve">The programme aligns to Eskom's Enterprise Architecture governance. Two formal approval gates are respected in addition to the delivery stage gates, and no downstream activity proceeds until the corresponding approval is obtained.</w:t>
+      </w:r>
+    </w:p>
+    <w:p>
+      <w:pPr>
+        <w:pStyle w:val="ListParagraph"/>
+        <w:numPr>
+          <w:ilvl w:val="0"/>
+          <w:numId w:val="1"/>
+        </w:numPr>
+        <w:spacing w:after="60"/>
+      </w:pPr>
+      <w:r>
+        <w:rPr>
+          <w:color w:val="1F2937"/>
+          <w:sz w:val="22"/>
+          <w:szCs w:val="22"/>
+        </w:rPr>
+        <w:t xml:space="preserve">Project Architecture Document (PAD) approval is obtained before build commences.</w:t>
+      </w:r>
+    </w:p>
+    <w:p>
+      <w:pPr>
+        <w:pStyle w:val="ListParagraph"/>
+        <w:numPr>
+          <w:ilvl w:val="0"/>
+          <w:numId w:val="1"/>
+        </w:numPr>
+        <w:spacing w:after="60"/>
+      </w:pPr>
+      <w:r>
+        <w:rPr>
+          <w:color w:val="1F2937"/>
+          <w:sz w:val="22"/>
+          <w:szCs w:val="22"/>
+        </w:rPr>
+        <w:t xml:space="preserve">Pre-Transfer (production readiness) approval is obtained before go-live and handover to operations.</w:t>
+      </w:r>
+    </w:p>
+    <w:p>
+      <w:pPr>
+        <w:pStyle w:val="ListParagraph"/>
+        <w:numPr>
+          <w:ilvl w:val="0"/>
+          <w:numId w:val="1"/>
+        </w:numPr>
+        <w:spacing w:after="60"/>
+      </w:pPr>
+      <w:r>
+        <w:rPr>
+          <w:color w:val="1F2937"/>
+          <w:sz w:val="22"/>
+          <w:szCs w:val="22"/>
+        </w:rPr>
+        <w:t xml:space="preserve">Architecture and security decisions are logged, with exceptions escalated through the Architecture / Security Review forum.</w:t>
+      </w:r>
+    </w:p>
+    <w:p>
+      <w:pPr>
+        <w:pStyle w:val="ListParagraph"/>
+        <w:numPr>
+          <w:ilvl w:val="0"/>
+          <w:numId w:val="1"/>
+        </w:numPr>
+        <w:spacing w:after="60"/>
+      </w:pPr>
+      <w:r>
+        <w:rPr>
+          <w:color w:val="1F2937"/>
+          <w:sz w:val="22"/>
+          <w:szCs w:val="22"/>
+        </w:rPr>
+        <w:t xml:space="preserve">Governance evidence is retained to support internal and external audit.</w:t>
+      </w:r>
+    </w:p>
+    <w:p>
+      <w:pPr>
+        <w:spacing w:after="80" w:before="160"/>
+      </w:pPr>
+      <w:r>
+        <w:rPr>
+          <w:b/>
+          <w:bCs/>
+          <w:color w:val="1F2937"/>
+          <w:sz w:val="24"/>
+          <w:szCs w:val="24"/>
+        </w:rPr>
+        <w:t xml:space="preserve">7.3 Team Competency and Certification</w:t>
+      </w:r>
+    </w:p>
+    <w:p>
+      <w:pPr>
+        <w:spacing w:after="120"/>
+      </w:pPr>
+      <w:r>
+        <w:rPr>
+          <w:color w:val="1F2937"/>
+          <w:sz w:val="22"/>
+          <w:szCs w:val="22"/>
+        </w:rPr>
+        <w:t xml:space="preserve">T2 Technologies will staff the programme with suitably qualified and experienced resources, and will provide supporting CVs and certificates as returnable evidence.</w:t>
+      </w:r>
+    </w:p>
+    <w:p>
+      <w:pPr>
+        <w:pStyle w:val="ListParagraph"/>
+        <w:numPr>
+          <w:ilvl w:val="0"/>
+          <w:numId w:val="1"/>
+        </w:numPr>
+        <w:spacing w:after="60"/>
+      </w:pPr>
+      <w:r>
+        <w:rPr>
+          <w:color w:val="1F2937"/>
+          <w:sz w:val="22"/>
+          <w:szCs w:val="22"/>
+        </w:rPr>
+        <w:t xml:space="preserve">Key roles staffed with a minimum of eight years' relevant experience, as required by the tender.</w:t>
+      </w:r>
+    </w:p>
+    <w:p>
+      <w:pPr>
+        <w:pStyle w:val="ListParagraph"/>
+        <w:numPr>
+          <w:ilvl w:val="0"/>
+          <w:numId w:val="1"/>
+        </w:numPr>
+        <w:spacing w:after="60"/>
+      </w:pPr>
+      <w:r>
+        <w:rPr>
+          <w:color w:val="1F2937"/>
+          <w:sz w:val="22"/>
+          <w:szCs w:val="22"/>
+        </w:rPr>
+        <w:t xml:space="preserve">Test resources hold ISTQB certification.</w:t>
+      </w:r>
+    </w:p>
+    <w:p>
+      <w:pPr>
+        <w:pStyle w:val="ListParagraph"/>
+        <w:numPr>
+          <w:ilvl w:val="0"/>
+          <w:numId w:val="1"/>
+        </w:numPr>
+        <w:spacing w:after="60"/>
+      </w:pPr>
+      <w:r>
+        <w:rPr>
+          <w:color w:val="1F2937"/>
+          <w:sz w:val="22"/>
+          <w:szCs w:val="22"/>
+        </w:rPr>
+        <w:t xml:space="preserve">Role-appropriate certifications for cloud, security and architecture disciplines.</w:t>
+      </w:r>
+    </w:p>
+    <w:p>
+      <w:pPr>
+        <w:pStyle w:val="ListParagraph"/>
+        <w:numPr>
+          <w:ilvl w:val="0"/>
+          <w:numId w:val="1"/>
+        </w:numPr>
+        <w:spacing w:after="60"/>
+      </w:pPr>
+      <w:r>
+        <w:rPr>
+          <w:color w:val="1F2937"/>
+          <w:sz w:val="22"/>
+          <w:szCs w:val="22"/>
+        </w:rPr>
+        <w:t xml:space="preserve">Named CVs, certificates and contactable references provided with the submission.</w:t>
+      </w:r>
+    </w:p>
+    <w:p>
+      <w:pPr>
         <w:pStyle w:val="Heading1"/>
         <w:pageBreakBefore/>
         <w:spacing w:after="40" w:before="200"/>
@@ -5614,6 +6350,331 @@
     </w:p>
     <w:p>
       <w:pPr>
+        <w:spacing w:after="80" w:before="160"/>
+      </w:pPr>
+      <w:r>
+        <w:rPr>
+          <w:b/>
+          <w:bCs/>
+          <w:color w:val="1F2937"/>
+          <w:sz w:val="24"/>
+          <w:szCs w:val="24"/>
+        </w:rPr>
+        <w:t xml:space="preserve">9.7 Well-Architected Framework Alignment</w:t>
+      </w:r>
+    </w:p>
+    <w:p>
+      <w:pPr>
+        <w:spacing w:after="120"/>
+      </w:pPr>
+      <w:r>
+        <w:rPr>
+          <w:color w:val="1F2937"/>
+          <w:sz w:val="22"/>
+          <w:szCs w:val="22"/>
+        </w:rPr>
+        <w:t xml:space="preserve">As required by the SoW, the design is governed by the Microsoft Azure Well-Architected Framework, which provides the reference architecture and review discipline for the solution across its five pillars.</w:t>
+      </w:r>
+    </w:p>
+    <w:tbl>
+      <w:tblPr>
+        <w:tblW w:type="pct" w:w="100%"/>
+        <w:tblBorders>
+          <w:top w:val="single" w:color="D1D5DB" w:sz="4"/>
+          <w:left w:val="single" w:color="D1D5DB" w:sz="4"/>
+          <w:bottom w:val="single" w:color="D1D5DB" w:sz="4"/>
+          <w:right w:val="single" w:color="D1D5DB" w:sz="4"/>
+          <w:insideH w:val="single" w:color="D1D5DB" w:sz="4"/>
+          <w:insideV w:val="single" w:color="D1D5DB" w:sz="4"/>
+        </w:tblBorders>
+      </w:tblPr>
+      <w:tblGrid>
+        <w:gridCol w:w="100"/>
+        <w:gridCol w:w="100"/>
+      </w:tblGrid>
+      <w:tr>
+        <w:trPr>
+          <w:tblHeader/>
+        </w:trPr>
+        <w:tc>
+          <w:tcPr>
+            <w:shd w:fill="004898" w:val="clear"/>
+            <w:tcMar>
+              <w:top w:type="dxa" w:w="60"/>
+              <w:left w:type="dxa" w:w="80"/>
+              <w:bottom w:type="dxa" w:w="60"/>
+              <w:right w:type="dxa" w:w="80"/>
+            </w:tcMar>
+          </w:tcPr>
+          <w:p>
+            <w:r>
+              <w:rPr>
+                <w:b/>
+                <w:bCs/>
+                <w:color w:val="FFFFFF"/>
+                <w:sz w:val="20"/>
+                <w:szCs w:val="20"/>
+              </w:rPr>
+              <w:t xml:space="preserve">Pillar</w:t>
+            </w:r>
+          </w:p>
+        </w:tc>
+        <w:tc>
+          <w:tcPr>
+            <w:shd w:fill="004898" w:val="clear"/>
+            <w:tcMar>
+              <w:top w:type="dxa" w:w="60"/>
+              <w:left w:type="dxa" w:w="80"/>
+              <w:bottom w:type="dxa" w:w="60"/>
+              <w:right w:type="dxa" w:w="80"/>
+            </w:tcMar>
+          </w:tcPr>
+          <w:p>
+            <w:r>
+              <w:rPr>
+                <w:b/>
+                <w:bCs/>
+                <w:color w:val="FFFFFF"/>
+                <w:sz w:val="20"/>
+                <w:szCs w:val="20"/>
+              </w:rPr>
+              <w:t xml:space="preserve">How the FBM solution addresses it</w:t>
+            </w:r>
+          </w:p>
+        </w:tc>
+      </w:tr>
+      <w:tr>
+        <w:tc>
+          <w:tcPr>
+            <w:tcMar>
+              <w:top w:type="dxa" w:w="50"/>
+              <w:left w:type="dxa" w:w="80"/>
+              <w:bottom w:type="dxa" w:w="50"/>
+              <w:right w:type="dxa" w:w="80"/>
+            </w:tcMar>
+          </w:tcPr>
+          <w:p>
+            <w:r>
+              <w:rPr>
+                <w:color w:val="1F2937"/>
+                <w:sz w:val="19"/>
+                <w:szCs w:val="19"/>
+              </w:rPr>
+              <w:t xml:space="preserve">Reliability</w:t>
+            </w:r>
+          </w:p>
+        </w:tc>
+        <w:tc>
+          <w:tcPr>
+            <w:tcMar>
+              <w:top w:type="dxa" w:w="50"/>
+              <w:left w:type="dxa" w:w="80"/>
+              <w:bottom w:type="dxa" w:w="50"/>
+              <w:right w:type="dxa" w:w="80"/>
+            </w:tcMar>
+          </w:tcPr>
+          <w:p>
+            <w:r>
+              <w:rPr>
+                <w:color w:val="1F2937"/>
+                <w:sz w:val="19"/>
+                <w:szCs w:val="19"/>
+              </w:rPr>
+              <w:t xml:space="preserve">Zone-redundant services, paired-region DR, automated backups and tested recovery.</w:t>
+            </w:r>
+          </w:p>
+        </w:tc>
+      </w:tr>
+      <w:tr>
+        <w:tc>
+          <w:tcPr>
+            <w:shd w:fill="F3F4F6" w:val="clear"/>
+            <w:tcMar>
+              <w:top w:type="dxa" w:w="50"/>
+              <w:left w:type="dxa" w:w="80"/>
+              <w:bottom w:type="dxa" w:w="50"/>
+              <w:right w:type="dxa" w:w="80"/>
+            </w:tcMar>
+          </w:tcPr>
+          <w:p>
+            <w:r>
+              <w:rPr>
+                <w:color w:val="1F2937"/>
+                <w:sz w:val="19"/>
+                <w:szCs w:val="19"/>
+              </w:rPr>
+              <w:t xml:space="preserve">Security</w:t>
+            </w:r>
+          </w:p>
+        </w:tc>
+        <w:tc>
+          <w:tcPr>
+            <w:shd w:fill="F3F4F6" w:val="clear"/>
+            <w:tcMar>
+              <w:top w:type="dxa" w:w="50"/>
+              <w:left w:type="dxa" w:w="80"/>
+              <w:bottom w:type="dxa" w:w="50"/>
+              <w:right w:type="dxa" w:w="80"/>
+            </w:tcMar>
+          </w:tcPr>
+          <w:p>
+            <w:r>
+              <w:rPr>
+                <w:color w:val="1F2937"/>
+                <w:sz w:val="19"/>
+                <w:szCs w:val="19"/>
+              </w:rPr>
+              <w:t xml:space="preserve">Defence-in-depth, zero-trust access, encryption and continuous monitoring (Section 8).</w:t>
+            </w:r>
+          </w:p>
+        </w:tc>
+      </w:tr>
+      <w:tr>
+        <w:tc>
+          <w:tcPr>
+            <w:tcMar>
+              <w:top w:type="dxa" w:w="50"/>
+              <w:left w:type="dxa" w:w="80"/>
+              <w:bottom w:type="dxa" w:w="50"/>
+              <w:right w:type="dxa" w:w="80"/>
+            </w:tcMar>
+          </w:tcPr>
+          <w:p>
+            <w:r>
+              <w:rPr>
+                <w:color w:val="1F2937"/>
+                <w:sz w:val="19"/>
+                <w:szCs w:val="19"/>
+              </w:rPr>
+              <w:t xml:space="preserve">Cost Optimisation</w:t>
+            </w:r>
+          </w:p>
+        </w:tc>
+        <w:tc>
+          <w:tcPr>
+            <w:tcMar>
+              <w:top w:type="dxa" w:w="50"/>
+              <w:left w:type="dxa" w:w="80"/>
+              <w:bottom w:type="dxa" w:w="50"/>
+              <w:right w:type="dxa" w:w="80"/>
+            </w:tcMar>
+          </w:tcPr>
+          <w:p>
+            <w:r>
+              <w:rPr>
+                <w:color w:val="1F2937"/>
+                <w:sz w:val="19"/>
+                <w:szCs w:val="19"/>
+              </w:rPr>
+              <w:t xml:space="preserve">Elastic, consumption-based scaling; right-sized environments; IaC to avoid drift and waste.</w:t>
+            </w:r>
+          </w:p>
+        </w:tc>
+      </w:tr>
+      <w:tr>
+        <w:tc>
+          <w:tcPr>
+            <w:shd w:fill="F3F4F6" w:val="clear"/>
+            <w:tcMar>
+              <w:top w:type="dxa" w:w="50"/>
+              <w:left w:type="dxa" w:w="80"/>
+              <w:bottom w:type="dxa" w:w="50"/>
+              <w:right w:type="dxa" w:w="80"/>
+            </w:tcMar>
+          </w:tcPr>
+          <w:p>
+            <w:r>
+              <w:rPr>
+                <w:color w:val="1F2937"/>
+                <w:sz w:val="19"/>
+                <w:szCs w:val="19"/>
+              </w:rPr>
+              <w:t xml:space="preserve">Operational Excellence</w:t>
+            </w:r>
+          </w:p>
+        </w:tc>
+        <w:tc>
+          <w:tcPr>
+            <w:shd w:fill="F3F4F6" w:val="clear"/>
+            <w:tcMar>
+              <w:top w:type="dxa" w:w="50"/>
+              <w:left w:type="dxa" w:w="80"/>
+              <w:bottom w:type="dxa" w:w="50"/>
+              <w:right w:type="dxa" w:w="80"/>
+            </w:tcMar>
+          </w:tcPr>
+          <w:p>
+            <w:r>
+              <w:rPr>
+                <w:color w:val="1F2937"/>
+                <w:sz w:val="19"/>
+                <w:szCs w:val="19"/>
+              </w:rPr>
+              <w:t xml:space="preserve">IaC, CI/CD with quality gates, full observability and service management.</w:t>
+            </w:r>
+          </w:p>
+        </w:tc>
+      </w:tr>
+      <w:tr>
+        <w:tc>
+          <w:tcPr>
+            <w:tcMar>
+              <w:top w:type="dxa" w:w="50"/>
+              <w:left w:type="dxa" w:w="80"/>
+              <w:bottom w:type="dxa" w:w="50"/>
+              <w:right w:type="dxa" w:w="80"/>
+            </w:tcMar>
+          </w:tcPr>
+          <w:p>
+            <w:r>
+              <w:rPr>
+                <w:color w:val="1F2937"/>
+                <w:sz w:val="19"/>
+                <w:szCs w:val="19"/>
+              </w:rPr>
+              <w:t xml:space="preserve">Performance Efficiency</w:t>
+            </w:r>
+          </w:p>
+        </w:tc>
+        <w:tc>
+          <w:tcPr>
+            <w:tcMar>
+              <w:top w:type="dxa" w:w="50"/>
+              <w:left w:type="dxa" w:w="80"/>
+              <w:bottom w:type="dxa" w:w="50"/>
+              <w:right w:type="dxa" w:w="80"/>
+            </w:tcMar>
+          </w:tcPr>
+          <w:p>
+            <w:r>
+              <w:rPr>
+                <w:color w:val="1F2937"/>
+                <w:sz w:val="19"/>
+                <w:szCs w:val="19"/>
+              </w:rPr>
+              <w:t xml:space="preserve">Stateless horizontal scaling, caching and separation of operational and reporting workloads.</w:t>
+            </w:r>
+          </w:p>
+        </w:tc>
+      </w:tr>
+    </w:tbl>
+    <w:p>
+      <w:pPr>
+        <w:spacing w:after="140" w:before="100"/>
+      </w:pPr>
+      <w:r>
+        <w:rPr>
+          <w:i/>
+          <w:iCs/>
+          <w:color w:val="6B7280"/>
+          <w:sz w:val="18"/>
+          <w:szCs w:val="18"/>
+        </w:rPr>
+        <w:t xml:space="preserve">A formal Well-Architected Review will be conducted during design and at defined checkpoints, with findings tracked to closure through the Architecture / Security Review forum.</w:t>
+      </w:r>
+    </w:p>
+    <w:p>
+      <w:pPr>
         <w:pStyle w:val="Heading1"/>
         <w:pageBreakBefore/>
         <w:spacing w:after="40" w:before="200"/>
@@ -5656,7 +6717,7 @@
           <w:sz w:val="22"/>
           <w:szCs w:val="22"/>
         </w:rPr>
-        <w:t xml:space="preserve">This section presents a fully costed commercial estimate aligned to the structure of the tender's Pricing Schedule (Annexure L): a software/subscription licence line, itemised implementation work-packages, a professional-services rate card, support &amp; maintenance, a five-year total cost of ownership and a milestone-based payment plan. All figures are in South African Rand and exclude VAT unless stated otherwise.</w:t>
+        <w:t xml:space="preserve">This section presents a fully costed commercial estimate aligned to the structure of the tender's Pricing Schedule (Annexure L): a software/subscription licence on the SoW's named-user sliding scale, itemised implementation work-packages, a professional-services rate card, five years of support &amp; maintenance, a total cost of ownership and a milestone-based payment plan. All figures are in South African Rand and exclude VAT unless stated otherwise.</w:t>
       </w:r>
     </w:p>
     <w:p>
@@ -5669,7 +6730,7 @@
           <w:sz w:val="22"/>
           <w:szCs w:val="22"/>
         </w:rPr>
-        <w:t xml:space="preserve">The estimate assumes an 18-month implementation of the business requirements followed by managed support &amp; maintenance to the five-year (60-month) mark, delivered by a standard blended team of approximately 8-10 resources. Every currency figure is derived from the rate card and the effort plan below, so the totals reconcile across all tables.</w:t>
+        <w:t xml:space="preserve">The estimate assumes an 18-month implementation of the business requirements, followed by a full five operational years of managed support &amp; maintenance after go-live (per SoW 6.1), delivered by a standard blended team of approximately 8-10 resources. Licence volumes follow the mandated sliding scale (20 users during implementation, 40 in operational Year 1, 50 in Years 2-5). Every currency figure is derived from the rate card and the effort plan below, so the totals reconcile across all tables.</w:t>
       </w:r>
     </w:p>
     <w:p>
@@ -5735,7 +6796,7 @@
           <w:sz w:val="22"/>
           <w:szCs w:val="22"/>
         </w:rPr>
-        <w:t xml:space="preserve">Prices exclude VAT; VAT at 15% is shown separately in the five-year summary.</w:t>
+        <w:t xml:space="preserve">Prices exclude VAT; VAT at 15% is shown separately in the total-cost-of-ownership summary.</w:t>
       </w:r>
     </w:p>
     <w:p>
@@ -5753,7 +6814,7 @@
           <w:sz w:val="22"/>
           <w:szCs w:val="22"/>
         </w:rPr>
-        <w:t xml:space="preserve">Software is licensed as T2's proprietary SaaS platform on a named-user basis: 20 users at R 3 600 per user per month.</w:t>
+        <w:t xml:space="preserve">Software is licensed as T2's proprietary SaaS platform on a named-user basis at R 3 600 per user per month, on the SoW-mandated sliding scale (20 users during implementation, 40 in operational Year 1, 50 in Years 2-5).</w:t>
       </w:r>
     </w:p>
     <w:p>
@@ -5789,7 +6850,7 @@
           <w:sz w:val="22"/>
           <w:szCs w:val="22"/>
         </w:rPr>
-        <w:t xml:space="preserve">Support &amp; maintenance begins at production go-live (a three-month warranty is included in Stabilisation) and runs to the five-year mark.</w:t>
+        <w:t xml:space="preserve">Support &amp; maintenance begins at production go-live (a three-month warranty is included in Stabilisation) and runs for a full five operational years, as required by SoW 6.1.</w:t>
       </w:r>
     </w:p>
     <w:p>
@@ -5823,6 +6884,19 @@
           <w:szCs w:val="24"/>
         </w:rPr>
         <w:t xml:space="preserve">17.2 Software / Subscription Licence</w:t>
+      </w:r>
+    </w:p>
+    <w:p>
+      <w:pPr>
+        <w:spacing w:after="120"/>
+      </w:pPr>
+      <w:r>
+        <w:rPr>
+          <w:color w:val="1F2937"/>
+          <w:sz w:val="22"/>
+          <w:szCs w:val="22"/>
+        </w:rPr>
+        <w:t xml:space="preserve">T2 FBM SaaS named-user licence at R 3 600 per user per month, priced on the SoW-mandated sliding scale.</w:t>
       </w:r>
     </w:p>
     <w:tbl>
@@ -5867,7 +6941,7 @@
                 <w:sz w:val="20"/>
                 <w:szCs w:val="20"/>
               </w:rPr>
-              <w:t xml:space="preserve">Item</w:t>
+              <w:t xml:space="preserve">Phase</w:t>
             </w:r>
           </w:p>
         </w:tc>
@@ -5890,7 +6964,7 @@
                 <w:sz w:val="20"/>
                 <w:szCs w:val="20"/>
               </w:rPr>
-              <w:t xml:space="preserve">Qty</w:t>
+              <w:t xml:space="preserve">Users</w:t>
             </w:r>
           </w:p>
         </w:tc>
@@ -5913,7 +6987,7 @@
                 <w:sz w:val="20"/>
                 <w:szCs w:val="20"/>
               </w:rPr>
-              <w:t xml:space="preserve">Unit Basis</w:t>
+              <w:t xml:space="preserve">Months</w:t>
             </w:r>
           </w:p>
         </w:tc>
@@ -5959,7 +7033,7 @@
                 <w:sz w:val="20"/>
                 <w:szCs w:val="20"/>
               </w:rPr>
-              <w:t xml:space="preserve">5-Year (excl. VAT)</w:t>
+              <w:t xml:space="preserve">Phase Cost (excl. VAT)</w:t>
             </w:r>
           </w:p>
         </w:tc>
@@ -5981,7 +7055,7 @@
                 <w:sz w:val="19"/>
                 <w:szCs w:val="19"/>
               </w:rPr>
-              <w:t xml:space="preserve">T2 FBM SaaS — named-user licence</w:t>
+              <w:t xml:space="preserve">Implementation (Months 1-18)</w:t>
             </w:r>
           </w:p>
         </w:tc>
@@ -6021,7 +7095,7 @@
                 <w:sz w:val="19"/>
                 <w:szCs w:val="19"/>
               </w:rPr>
-              <w:t xml:space="preserve">R 3 600 / user / month</w:t>
+              <w:t xml:space="preserve">18</w:t>
             </w:r>
           </w:p>
         </w:tc>
@@ -6061,7 +7135,634 @@
                 <w:sz w:val="19"/>
                 <w:szCs w:val="19"/>
               </w:rPr>
-              <w:t xml:space="preserve">R 4 320 000</w:t>
+              <w:t xml:space="preserve">R 1 296 000</w:t>
+            </w:r>
+          </w:p>
+        </w:tc>
+      </w:tr>
+      <w:tr>
+        <w:tc>
+          <w:tcPr>
+            <w:shd w:fill="F3F4F6" w:val="clear"/>
+            <w:tcMar>
+              <w:top w:type="dxa" w:w="50"/>
+              <w:left w:type="dxa" w:w="80"/>
+              <w:bottom w:type="dxa" w:w="50"/>
+              <w:right w:type="dxa" w:w="80"/>
+            </w:tcMar>
+          </w:tcPr>
+          <w:p>
+            <w:r>
+              <w:rPr>
+                <w:color w:val="1F2937"/>
+                <w:sz w:val="19"/>
+                <w:szCs w:val="19"/>
+              </w:rPr>
+              <w:t xml:space="preserve">Operational Year 1</w:t>
+            </w:r>
+          </w:p>
+        </w:tc>
+        <w:tc>
+          <w:tcPr>
+            <w:shd w:fill="F3F4F6" w:val="clear"/>
+            <w:tcMar>
+              <w:top w:type="dxa" w:w="50"/>
+              <w:left w:type="dxa" w:w="80"/>
+              <w:bottom w:type="dxa" w:w="50"/>
+              <w:right w:type="dxa" w:w="80"/>
+            </w:tcMar>
+          </w:tcPr>
+          <w:p>
+            <w:r>
+              <w:rPr>
+                <w:color w:val="1F2937"/>
+                <w:sz w:val="19"/>
+                <w:szCs w:val="19"/>
+              </w:rPr>
+              <w:t xml:space="preserve">40</w:t>
+            </w:r>
+          </w:p>
+        </w:tc>
+        <w:tc>
+          <w:tcPr>
+            <w:shd w:fill="F3F4F6" w:val="clear"/>
+            <w:tcMar>
+              <w:top w:type="dxa" w:w="50"/>
+              <w:left w:type="dxa" w:w="80"/>
+              <w:bottom w:type="dxa" w:w="50"/>
+              <w:right w:type="dxa" w:w="80"/>
+            </w:tcMar>
+          </w:tcPr>
+          <w:p>
+            <w:r>
+              <w:rPr>
+                <w:color w:val="1F2937"/>
+                <w:sz w:val="19"/>
+                <w:szCs w:val="19"/>
+              </w:rPr>
+              <w:t xml:space="preserve">12</w:t>
+            </w:r>
+          </w:p>
+        </w:tc>
+        <w:tc>
+          <w:tcPr>
+            <w:shd w:fill="F3F4F6" w:val="clear"/>
+            <w:tcMar>
+              <w:top w:type="dxa" w:w="50"/>
+              <w:left w:type="dxa" w:w="80"/>
+              <w:bottom w:type="dxa" w:w="50"/>
+              <w:right w:type="dxa" w:w="80"/>
+            </w:tcMar>
+          </w:tcPr>
+          <w:p>
+            <w:r>
+              <w:rPr>
+                <w:color w:val="1F2937"/>
+                <w:sz w:val="19"/>
+                <w:szCs w:val="19"/>
+              </w:rPr>
+              <w:t xml:space="preserve">R 1 728 000</w:t>
+            </w:r>
+          </w:p>
+        </w:tc>
+        <w:tc>
+          <w:tcPr>
+            <w:shd w:fill="F3F4F6" w:val="clear"/>
+            <w:tcMar>
+              <w:top w:type="dxa" w:w="50"/>
+              <w:left w:type="dxa" w:w="80"/>
+              <w:bottom w:type="dxa" w:w="50"/>
+              <w:right w:type="dxa" w:w="80"/>
+            </w:tcMar>
+          </w:tcPr>
+          <w:p>
+            <w:r>
+              <w:rPr>
+                <w:color w:val="1F2937"/>
+                <w:sz w:val="19"/>
+                <w:szCs w:val="19"/>
+              </w:rPr>
+              <w:t xml:space="preserve">R 1 728 000</w:t>
+            </w:r>
+          </w:p>
+        </w:tc>
+      </w:tr>
+      <w:tr>
+        <w:tc>
+          <w:tcPr>
+            <w:tcMar>
+              <w:top w:type="dxa" w:w="50"/>
+              <w:left w:type="dxa" w:w="80"/>
+              <w:bottom w:type="dxa" w:w="50"/>
+              <w:right w:type="dxa" w:w="80"/>
+            </w:tcMar>
+          </w:tcPr>
+          <w:p>
+            <w:r>
+              <w:rPr>
+                <w:color w:val="1F2937"/>
+                <w:sz w:val="19"/>
+                <w:szCs w:val="19"/>
+              </w:rPr>
+              <w:t xml:space="preserve">Operational Year 2</w:t>
+            </w:r>
+          </w:p>
+        </w:tc>
+        <w:tc>
+          <w:tcPr>
+            <w:tcMar>
+              <w:top w:type="dxa" w:w="50"/>
+              <w:left w:type="dxa" w:w="80"/>
+              <w:bottom w:type="dxa" w:w="50"/>
+              <w:right w:type="dxa" w:w="80"/>
+            </w:tcMar>
+          </w:tcPr>
+          <w:p>
+            <w:r>
+              <w:rPr>
+                <w:color w:val="1F2937"/>
+                <w:sz w:val="19"/>
+                <w:szCs w:val="19"/>
+              </w:rPr>
+              <w:t xml:space="preserve">50</w:t>
+            </w:r>
+          </w:p>
+        </w:tc>
+        <w:tc>
+          <w:tcPr>
+            <w:tcMar>
+              <w:top w:type="dxa" w:w="50"/>
+              <w:left w:type="dxa" w:w="80"/>
+              <w:bottom w:type="dxa" w:w="50"/>
+              <w:right w:type="dxa" w:w="80"/>
+            </w:tcMar>
+          </w:tcPr>
+          <w:p>
+            <w:r>
+              <w:rPr>
+                <w:color w:val="1F2937"/>
+                <w:sz w:val="19"/>
+                <w:szCs w:val="19"/>
+              </w:rPr>
+              <w:t xml:space="preserve">12</w:t>
+            </w:r>
+          </w:p>
+        </w:tc>
+        <w:tc>
+          <w:tcPr>
+            <w:tcMar>
+              <w:top w:type="dxa" w:w="50"/>
+              <w:left w:type="dxa" w:w="80"/>
+              <w:bottom w:type="dxa" w:w="50"/>
+              <w:right w:type="dxa" w:w="80"/>
+            </w:tcMar>
+          </w:tcPr>
+          <w:p>
+            <w:r>
+              <w:rPr>
+                <w:color w:val="1F2937"/>
+                <w:sz w:val="19"/>
+                <w:szCs w:val="19"/>
+              </w:rPr>
+              <w:t xml:space="preserve">R 2 160 000</w:t>
+            </w:r>
+          </w:p>
+        </w:tc>
+        <w:tc>
+          <w:tcPr>
+            <w:tcMar>
+              <w:top w:type="dxa" w:w="50"/>
+              <w:left w:type="dxa" w:w="80"/>
+              <w:bottom w:type="dxa" w:w="50"/>
+              <w:right w:type="dxa" w:w="80"/>
+            </w:tcMar>
+          </w:tcPr>
+          <w:p>
+            <w:r>
+              <w:rPr>
+                <w:color w:val="1F2937"/>
+                <w:sz w:val="19"/>
+                <w:szCs w:val="19"/>
+              </w:rPr>
+              <w:t xml:space="preserve">R 2 160 000</w:t>
+            </w:r>
+          </w:p>
+        </w:tc>
+      </w:tr>
+      <w:tr>
+        <w:tc>
+          <w:tcPr>
+            <w:shd w:fill="F3F4F6" w:val="clear"/>
+            <w:tcMar>
+              <w:top w:type="dxa" w:w="50"/>
+              <w:left w:type="dxa" w:w="80"/>
+              <w:bottom w:type="dxa" w:w="50"/>
+              <w:right w:type="dxa" w:w="80"/>
+            </w:tcMar>
+          </w:tcPr>
+          <w:p>
+            <w:r>
+              <w:rPr>
+                <w:color w:val="1F2937"/>
+                <w:sz w:val="19"/>
+                <w:szCs w:val="19"/>
+              </w:rPr>
+              <w:t xml:space="preserve">Operational Year 3</w:t>
+            </w:r>
+          </w:p>
+        </w:tc>
+        <w:tc>
+          <w:tcPr>
+            <w:shd w:fill="F3F4F6" w:val="clear"/>
+            <w:tcMar>
+              <w:top w:type="dxa" w:w="50"/>
+              <w:left w:type="dxa" w:w="80"/>
+              <w:bottom w:type="dxa" w:w="50"/>
+              <w:right w:type="dxa" w:w="80"/>
+            </w:tcMar>
+          </w:tcPr>
+          <w:p>
+            <w:r>
+              <w:rPr>
+                <w:color w:val="1F2937"/>
+                <w:sz w:val="19"/>
+                <w:szCs w:val="19"/>
+              </w:rPr>
+              <w:t xml:space="preserve">50</w:t>
+            </w:r>
+          </w:p>
+        </w:tc>
+        <w:tc>
+          <w:tcPr>
+            <w:shd w:fill="F3F4F6" w:val="clear"/>
+            <w:tcMar>
+              <w:top w:type="dxa" w:w="50"/>
+              <w:left w:type="dxa" w:w="80"/>
+              <w:bottom w:type="dxa" w:w="50"/>
+              <w:right w:type="dxa" w:w="80"/>
+            </w:tcMar>
+          </w:tcPr>
+          <w:p>
+            <w:r>
+              <w:rPr>
+                <w:color w:val="1F2937"/>
+                <w:sz w:val="19"/>
+                <w:szCs w:val="19"/>
+              </w:rPr>
+              <w:t xml:space="preserve">12</w:t>
+            </w:r>
+          </w:p>
+        </w:tc>
+        <w:tc>
+          <w:tcPr>
+            <w:shd w:fill="F3F4F6" w:val="clear"/>
+            <w:tcMar>
+              <w:top w:type="dxa" w:w="50"/>
+              <w:left w:type="dxa" w:w="80"/>
+              <w:bottom w:type="dxa" w:w="50"/>
+              <w:right w:type="dxa" w:w="80"/>
+            </w:tcMar>
+          </w:tcPr>
+          <w:p>
+            <w:r>
+              <w:rPr>
+                <w:color w:val="1F2937"/>
+                <w:sz w:val="19"/>
+                <w:szCs w:val="19"/>
+              </w:rPr>
+              <w:t xml:space="preserve">R 2 160 000</w:t>
+            </w:r>
+          </w:p>
+        </w:tc>
+        <w:tc>
+          <w:tcPr>
+            <w:shd w:fill="F3F4F6" w:val="clear"/>
+            <w:tcMar>
+              <w:top w:type="dxa" w:w="50"/>
+              <w:left w:type="dxa" w:w="80"/>
+              <w:bottom w:type="dxa" w:w="50"/>
+              <w:right w:type="dxa" w:w="80"/>
+            </w:tcMar>
+          </w:tcPr>
+          <w:p>
+            <w:r>
+              <w:rPr>
+                <w:color w:val="1F2937"/>
+                <w:sz w:val="19"/>
+                <w:szCs w:val="19"/>
+              </w:rPr>
+              <w:t xml:space="preserve">R 2 160 000</w:t>
+            </w:r>
+          </w:p>
+        </w:tc>
+      </w:tr>
+      <w:tr>
+        <w:tc>
+          <w:tcPr>
+            <w:tcMar>
+              <w:top w:type="dxa" w:w="50"/>
+              <w:left w:type="dxa" w:w="80"/>
+              <w:bottom w:type="dxa" w:w="50"/>
+              <w:right w:type="dxa" w:w="80"/>
+            </w:tcMar>
+          </w:tcPr>
+          <w:p>
+            <w:r>
+              <w:rPr>
+                <w:color w:val="1F2937"/>
+                <w:sz w:val="19"/>
+                <w:szCs w:val="19"/>
+              </w:rPr>
+              <w:t xml:space="preserve">Operational Year 4</w:t>
+            </w:r>
+          </w:p>
+        </w:tc>
+        <w:tc>
+          <w:tcPr>
+            <w:tcMar>
+              <w:top w:type="dxa" w:w="50"/>
+              <w:left w:type="dxa" w:w="80"/>
+              <w:bottom w:type="dxa" w:w="50"/>
+              <w:right w:type="dxa" w:w="80"/>
+            </w:tcMar>
+          </w:tcPr>
+          <w:p>
+            <w:r>
+              <w:rPr>
+                <w:color w:val="1F2937"/>
+                <w:sz w:val="19"/>
+                <w:szCs w:val="19"/>
+              </w:rPr>
+              <w:t xml:space="preserve">50</w:t>
+            </w:r>
+          </w:p>
+        </w:tc>
+        <w:tc>
+          <w:tcPr>
+            <w:tcMar>
+              <w:top w:type="dxa" w:w="50"/>
+              <w:left w:type="dxa" w:w="80"/>
+              <w:bottom w:type="dxa" w:w="50"/>
+              <w:right w:type="dxa" w:w="80"/>
+            </w:tcMar>
+          </w:tcPr>
+          <w:p>
+            <w:r>
+              <w:rPr>
+                <w:color w:val="1F2937"/>
+                <w:sz w:val="19"/>
+                <w:szCs w:val="19"/>
+              </w:rPr>
+              <w:t xml:space="preserve">12</w:t>
+            </w:r>
+          </w:p>
+        </w:tc>
+        <w:tc>
+          <w:tcPr>
+            <w:tcMar>
+              <w:top w:type="dxa" w:w="50"/>
+              <w:left w:type="dxa" w:w="80"/>
+              <w:bottom w:type="dxa" w:w="50"/>
+              <w:right w:type="dxa" w:w="80"/>
+            </w:tcMar>
+          </w:tcPr>
+          <w:p>
+            <w:r>
+              <w:rPr>
+                <w:color w:val="1F2937"/>
+                <w:sz w:val="19"/>
+                <w:szCs w:val="19"/>
+              </w:rPr>
+              <w:t xml:space="preserve">R 2 160 000</w:t>
+            </w:r>
+          </w:p>
+        </w:tc>
+        <w:tc>
+          <w:tcPr>
+            <w:tcMar>
+              <w:top w:type="dxa" w:w="50"/>
+              <w:left w:type="dxa" w:w="80"/>
+              <w:bottom w:type="dxa" w:w="50"/>
+              <w:right w:type="dxa" w:w="80"/>
+            </w:tcMar>
+          </w:tcPr>
+          <w:p>
+            <w:r>
+              <w:rPr>
+                <w:color w:val="1F2937"/>
+                <w:sz w:val="19"/>
+                <w:szCs w:val="19"/>
+              </w:rPr>
+              <w:t xml:space="preserve">R 2 160 000</w:t>
+            </w:r>
+          </w:p>
+        </w:tc>
+      </w:tr>
+      <w:tr>
+        <w:tc>
+          <w:tcPr>
+            <w:shd w:fill="F3F4F6" w:val="clear"/>
+            <w:tcMar>
+              <w:top w:type="dxa" w:w="50"/>
+              <w:left w:type="dxa" w:w="80"/>
+              <w:bottom w:type="dxa" w:w="50"/>
+              <w:right w:type="dxa" w:w="80"/>
+            </w:tcMar>
+          </w:tcPr>
+          <w:p>
+            <w:r>
+              <w:rPr>
+                <w:color w:val="1F2937"/>
+                <w:sz w:val="19"/>
+                <w:szCs w:val="19"/>
+              </w:rPr>
+              <w:t xml:space="preserve">Operational Year 5</w:t>
+            </w:r>
+          </w:p>
+        </w:tc>
+        <w:tc>
+          <w:tcPr>
+            <w:shd w:fill="F3F4F6" w:val="clear"/>
+            <w:tcMar>
+              <w:top w:type="dxa" w:w="50"/>
+              <w:left w:type="dxa" w:w="80"/>
+              <w:bottom w:type="dxa" w:w="50"/>
+              <w:right w:type="dxa" w:w="80"/>
+            </w:tcMar>
+          </w:tcPr>
+          <w:p>
+            <w:r>
+              <w:rPr>
+                <w:color w:val="1F2937"/>
+                <w:sz w:val="19"/>
+                <w:szCs w:val="19"/>
+              </w:rPr>
+              <w:t xml:space="preserve">50</w:t>
+            </w:r>
+          </w:p>
+        </w:tc>
+        <w:tc>
+          <w:tcPr>
+            <w:shd w:fill="F3F4F6" w:val="clear"/>
+            <w:tcMar>
+              <w:top w:type="dxa" w:w="50"/>
+              <w:left w:type="dxa" w:w="80"/>
+              <w:bottom w:type="dxa" w:w="50"/>
+              <w:right w:type="dxa" w:w="80"/>
+            </w:tcMar>
+          </w:tcPr>
+          <w:p>
+            <w:r>
+              <w:rPr>
+                <w:color w:val="1F2937"/>
+                <w:sz w:val="19"/>
+                <w:szCs w:val="19"/>
+              </w:rPr>
+              <w:t xml:space="preserve">12</w:t>
+            </w:r>
+          </w:p>
+        </w:tc>
+        <w:tc>
+          <w:tcPr>
+            <w:shd w:fill="F3F4F6" w:val="clear"/>
+            <w:tcMar>
+              <w:top w:type="dxa" w:w="50"/>
+              <w:left w:type="dxa" w:w="80"/>
+              <w:bottom w:type="dxa" w:w="50"/>
+              <w:right w:type="dxa" w:w="80"/>
+            </w:tcMar>
+          </w:tcPr>
+          <w:p>
+            <w:r>
+              <w:rPr>
+                <w:color w:val="1F2937"/>
+                <w:sz w:val="19"/>
+                <w:szCs w:val="19"/>
+              </w:rPr>
+              <w:t xml:space="preserve">R 2 160 000</w:t>
+            </w:r>
+          </w:p>
+        </w:tc>
+        <w:tc>
+          <w:tcPr>
+            <w:shd w:fill="F3F4F6" w:val="clear"/>
+            <w:tcMar>
+              <w:top w:type="dxa" w:w="50"/>
+              <w:left w:type="dxa" w:w="80"/>
+              <w:bottom w:type="dxa" w:w="50"/>
+              <w:right w:type="dxa" w:w="80"/>
+            </w:tcMar>
+          </w:tcPr>
+          <w:p>
+            <w:r>
+              <w:rPr>
+                <w:color w:val="1F2937"/>
+                <w:sz w:val="19"/>
+                <w:szCs w:val="19"/>
+              </w:rPr>
+              <w:t xml:space="preserve">R 2 160 000</w:t>
+            </w:r>
+          </w:p>
+        </w:tc>
+      </w:tr>
+      <w:tr>
+        <w:tc>
+          <w:tcPr>
+            <w:tcMar>
+              <w:top w:type="dxa" w:w="50"/>
+              <w:left w:type="dxa" w:w="80"/>
+              <w:bottom w:type="dxa" w:w="50"/>
+              <w:right w:type="dxa" w:w="80"/>
+            </w:tcMar>
+          </w:tcPr>
+          <w:p>
+            <w:r>
+              <w:rPr>
+                <w:color w:val="1F2937"/>
+                <w:sz w:val="19"/>
+                <w:szCs w:val="19"/>
+              </w:rPr>
+              <w:t xml:space="preserve">Total licence (contract term)</w:t>
+            </w:r>
+          </w:p>
+        </w:tc>
+        <w:tc>
+          <w:tcPr>
+            <w:tcMar>
+              <w:top w:type="dxa" w:w="50"/>
+              <w:left w:type="dxa" w:w="80"/>
+              <w:bottom w:type="dxa" w:w="50"/>
+              <w:right w:type="dxa" w:w="80"/>
+            </w:tcMar>
+          </w:tcPr>
+          <w:p>
+            <w:r>
+              <w:rPr>
+                <w:color w:val="1F2937"/>
+                <w:sz w:val="19"/>
+                <w:szCs w:val="19"/>
+              </w:rPr>
+              <w:t xml:space="preserve"/>
+            </w:r>
+          </w:p>
+        </w:tc>
+        <w:tc>
+          <w:tcPr>
+            <w:tcMar>
+              <w:top w:type="dxa" w:w="50"/>
+              <w:left w:type="dxa" w:w="80"/>
+              <w:bottom w:type="dxa" w:w="50"/>
+              <w:right w:type="dxa" w:w="80"/>
+            </w:tcMar>
+          </w:tcPr>
+          <w:p>
+            <w:r>
+              <w:rPr>
+                <w:color w:val="1F2937"/>
+                <w:sz w:val="19"/>
+                <w:szCs w:val="19"/>
+              </w:rPr>
+              <w:t xml:space="preserve"/>
+            </w:r>
+          </w:p>
+        </w:tc>
+        <w:tc>
+          <w:tcPr>
+            <w:tcMar>
+              <w:top w:type="dxa" w:w="50"/>
+              <w:left w:type="dxa" w:w="80"/>
+              <w:bottom w:type="dxa" w:w="50"/>
+              <w:right w:type="dxa" w:w="80"/>
+            </w:tcMar>
+          </w:tcPr>
+          <w:p>
+            <w:r>
+              <w:rPr>
+                <w:color w:val="1F2937"/>
+                <w:sz w:val="19"/>
+                <w:szCs w:val="19"/>
+              </w:rPr>
+              <w:t xml:space="preserve"/>
+            </w:r>
+          </w:p>
+        </w:tc>
+        <w:tc>
+          <w:tcPr>
+            <w:tcMar>
+              <w:top w:type="dxa" w:w="50"/>
+              <w:left w:type="dxa" w:w="80"/>
+              <w:bottom w:type="dxa" w:w="50"/>
+              <w:right w:type="dxa" w:w="80"/>
+            </w:tcMar>
+          </w:tcPr>
+          <w:p>
+            <w:r>
+              <w:rPr>
+                <w:color w:val="1F2937"/>
+                <w:sz w:val="19"/>
+                <w:szCs w:val="19"/>
+              </w:rPr>
+              <w:t xml:space="preserve">R 11 664 000</w:t>
             </w:r>
           </w:p>
         </w:tc>
@@ -7972,27 +9673,27 @@
                 <w:sz w:val="19"/>
                 <w:szCs w:val="19"/>
               </w:rPr>
-              <w:t xml:space="preserve">4 yrs (post go-live)</w:t>
-            </w:r>
-          </w:p>
-        </w:tc>
-        <w:tc>
-          <w:tcPr>
-            <w:tcMar>
-              <w:top w:type="dxa" w:w="50"/>
-              <w:left w:type="dxa" w:w="80"/>
-              <w:bottom w:type="dxa" w:w="50"/>
-              <w:right w:type="dxa" w:w="80"/>
-            </w:tcMar>
-          </w:tcPr>
-          <w:p>
-            <w:r>
-              <w:rPr>
-                <w:color w:val="1F2937"/>
-                <w:sz w:val="19"/>
-                <w:szCs w:val="19"/>
-              </w:rPr>
-              <w:t xml:space="preserve">R 13 321 600</w:t>
+              <w:t xml:space="preserve">5 yrs (post go-live)</w:t>
+            </w:r>
+          </w:p>
+        </w:tc>
+        <w:tc>
+          <w:tcPr>
+            <w:tcMar>
+              <w:top w:type="dxa" w:w="50"/>
+              <w:left w:type="dxa" w:w="80"/>
+              <w:bottom w:type="dxa" w:w="50"/>
+              <w:right w:type="dxa" w:w="80"/>
+            </w:tcMar>
+          </w:tcPr>
+          <w:p>
+            <w:r>
+              <w:rPr>
+                <w:color w:val="1F2937"/>
+                <w:sz w:val="19"/>
+                <w:szCs w:val="19"/>
+              </w:rPr>
+              <w:t xml:space="preserve">R 16 652 000</w:t>
             </w:r>
           </w:p>
         </w:tc>
@@ -8025,7 +9726,20 @@
           <w:sz w:val="24"/>
           <w:szCs w:val="24"/>
         </w:rPr>
-        <w:t xml:space="preserve">17.6 Five-Year Total Cost of Ownership</w:t>
+        <w:t xml:space="preserve">17.6 Total Cost of Ownership</w:t>
+      </w:r>
+    </w:p>
+    <w:p>
+      <w:pPr>
+        <w:spacing w:after="120"/>
+      </w:pPr>
+      <w:r>
+        <w:rPr>
+          <w:color w:val="1F2937"/>
+          <w:sz w:val="22"/>
+          <w:szCs w:val="22"/>
+        </w:rPr>
+        <w:t xml:space="preserve">Full contract term: an 18-month implementation phase followed by five operational years of licence and support &amp; maintenance.</w:t>
       </w:r>
     </w:p>
     <w:tbl>
@@ -8070,7 +9784,7 @@
                 <w:sz w:val="20"/>
                 <w:szCs w:val="20"/>
               </w:rPr>
-              <w:t xml:space="preserve">Year</w:t>
+              <w:t xml:space="preserve">Phase</w:t>
             </w:r>
           </w:p>
         </w:tc>
@@ -8162,7 +9876,7 @@
                 <w:sz w:val="20"/>
                 <w:szCs w:val="20"/>
               </w:rPr>
-              <w:t xml:space="preserve">Annual Total</w:t>
+              <w:t xml:space="preserve">Phase Total</w:t>
             </w:r>
           </w:p>
         </w:tc>
@@ -8184,7 +9898,7 @@
                 <w:sz w:val="19"/>
                 <w:szCs w:val="19"/>
               </w:rPr>
-              <w:t xml:space="preserve">Year 1</w:t>
+              <w:t xml:space="preserve">Implementation</w:t>
             </w:r>
           </w:p>
         </w:tc>
@@ -8224,7 +9938,7 @@
                 <w:sz w:val="19"/>
                 <w:szCs w:val="19"/>
               </w:rPr>
-              <w:t xml:space="preserve">R 864 000</w:t>
+              <w:t xml:space="preserve">R 1 296 000</w:t>
             </w:r>
           </w:p>
         </w:tc>
@@ -8264,7 +9978,7 @@
                 <w:sz w:val="19"/>
                 <w:szCs w:val="19"/>
               </w:rPr>
-              <w:t xml:space="preserve">R 25 844 000</w:t>
+              <w:t xml:space="preserve">R 26 276 000</w:t>
             </w:r>
           </w:p>
         </w:tc>
@@ -8287,7 +10001,7 @@
                 <w:sz w:val="19"/>
                 <w:szCs w:val="19"/>
               </w:rPr>
-              <w:t xml:space="preserve">Year 2</w:t>
+              <w:t xml:space="preserve">Op. Year 1</w:t>
             </w:r>
           </w:p>
         </w:tc>
@@ -8329,7 +10043,7 @@
                 <w:sz w:val="19"/>
                 <w:szCs w:val="19"/>
               </w:rPr>
-              <w:t xml:space="preserve">R 864 000</w:t>
+              <w:t xml:space="preserve">R 1 728 000</w:t>
             </w:r>
           </w:p>
         </w:tc>
@@ -8371,7 +10085,7 @@
                 <w:sz w:val="19"/>
                 <w:szCs w:val="19"/>
               </w:rPr>
-              <w:t xml:space="preserve">R 4 194 400</w:t>
+              <w:t xml:space="preserve">R 5 058 400</w:t>
             </w:r>
           </w:p>
         </w:tc>
@@ -8393,7 +10107,7 @@
                 <w:sz w:val="19"/>
                 <w:szCs w:val="19"/>
               </w:rPr>
-              <w:t xml:space="preserve">Year 3</w:t>
+              <w:t xml:space="preserve">Op. Year 2</w:t>
             </w:r>
           </w:p>
         </w:tc>
@@ -8433,7 +10147,7 @@
                 <w:sz w:val="19"/>
                 <w:szCs w:val="19"/>
               </w:rPr>
-              <w:t xml:space="preserve">R 864 000</w:t>
+              <w:t xml:space="preserve">R 2 160 000</w:t>
             </w:r>
           </w:p>
         </w:tc>
@@ -8473,7 +10187,7 @@
                 <w:sz w:val="19"/>
                 <w:szCs w:val="19"/>
               </w:rPr>
-              <w:t xml:space="preserve">R 4 194 400</w:t>
+              <w:t xml:space="preserve">R 5 490 400</w:t>
             </w:r>
           </w:p>
         </w:tc>
@@ -8496,7 +10210,7 @@
                 <w:sz w:val="19"/>
                 <w:szCs w:val="19"/>
               </w:rPr>
-              <w:t xml:space="preserve">Year 4</w:t>
+              <w:t xml:space="preserve">Op. Year 3</w:t>
             </w:r>
           </w:p>
         </w:tc>
@@ -8538,7 +10252,7 @@
                 <w:sz w:val="19"/>
                 <w:szCs w:val="19"/>
               </w:rPr>
-              <w:t xml:space="preserve">R 864 000</w:t>
+              <w:t xml:space="preserve">R 2 160 000</w:t>
             </w:r>
           </w:p>
         </w:tc>
@@ -8580,7 +10294,7 @@
                 <w:sz w:val="19"/>
                 <w:szCs w:val="19"/>
               </w:rPr>
-              <w:t xml:space="preserve">R 4 194 400</w:t>
+              <w:t xml:space="preserve">R 5 490 400</w:t>
             </w:r>
           </w:p>
         </w:tc>
@@ -8602,7 +10316,7 @@
                 <w:sz w:val="19"/>
                 <w:szCs w:val="19"/>
               </w:rPr>
-              <w:t xml:space="preserve">Year 5</w:t>
+              <w:t xml:space="preserve">Op. Year 4</w:t>
             </w:r>
           </w:p>
         </w:tc>
@@ -8642,7 +10356,7 @@
                 <w:sz w:val="19"/>
                 <w:szCs w:val="19"/>
               </w:rPr>
-              <w:t xml:space="preserve">R 864 000</w:t>
+              <w:t xml:space="preserve">R 2 160 000</w:t>
             </w:r>
           </w:p>
         </w:tc>
@@ -8682,7 +10396,7 @@
                 <w:sz w:val="19"/>
                 <w:szCs w:val="19"/>
               </w:rPr>
-              <w:t xml:space="preserve">R 4 194 400</w:t>
+              <w:t xml:space="preserve">R 5 490 400</w:t>
             </w:r>
           </w:p>
         </w:tc>
@@ -8705,91 +10419,91 @@
                 <w:sz w:val="19"/>
                 <w:szCs w:val="19"/>
               </w:rPr>
-              <w:t xml:space="preserve">Total (excl. VAT)</w:t>
-            </w:r>
-          </w:p>
-        </w:tc>
-        <w:tc>
-          <w:tcPr>
-            <w:shd w:fill="F3F4F6" w:val="clear"/>
-            <w:tcMar>
-              <w:top w:type="dxa" w:w="50"/>
-              <w:left w:type="dxa" w:w="80"/>
-              <w:bottom w:type="dxa" w:w="50"/>
-              <w:right w:type="dxa" w:w="80"/>
-            </w:tcMar>
-          </w:tcPr>
-          <w:p>
-            <w:r>
-              <w:rPr>
-                <w:color w:val="1F2937"/>
-                <w:sz w:val="19"/>
-                <w:szCs w:val="19"/>
-              </w:rPr>
-              <w:t xml:space="preserve"/>
-            </w:r>
-          </w:p>
-        </w:tc>
-        <w:tc>
-          <w:tcPr>
-            <w:shd w:fill="F3F4F6" w:val="clear"/>
-            <w:tcMar>
-              <w:top w:type="dxa" w:w="50"/>
-              <w:left w:type="dxa" w:w="80"/>
-              <w:bottom w:type="dxa" w:w="50"/>
-              <w:right w:type="dxa" w:w="80"/>
-            </w:tcMar>
-          </w:tcPr>
-          <w:p>
-            <w:r>
-              <w:rPr>
-                <w:color w:val="1F2937"/>
-                <w:sz w:val="19"/>
-                <w:szCs w:val="19"/>
-              </w:rPr>
-              <w:t xml:space="preserve"/>
-            </w:r>
-          </w:p>
-        </w:tc>
-        <w:tc>
-          <w:tcPr>
-            <w:shd w:fill="F3F4F6" w:val="clear"/>
-            <w:tcMar>
-              <w:top w:type="dxa" w:w="50"/>
-              <w:left w:type="dxa" w:w="80"/>
-              <w:bottom w:type="dxa" w:w="50"/>
-              <w:right w:type="dxa" w:w="80"/>
-            </w:tcMar>
-          </w:tcPr>
-          <w:p>
-            <w:r>
-              <w:rPr>
-                <w:color w:val="1F2937"/>
-                <w:sz w:val="19"/>
-                <w:szCs w:val="19"/>
-              </w:rPr>
-              <w:t xml:space="preserve"/>
-            </w:r>
-          </w:p>
-        </w:tc>
-        <w:tc>
-          <w:tcPr>
-            <w:shd w:fill="F3F4F6" w:val="clear"/>
-            <w:tcMar>
-              <w:top w:type="dxa" w:w="50"/>
-              <w:left w:type="dxa" w:w="80"/>
-              <w:bottom w:type="dxa" w:w="50"/>
-              <w:right w:type="dxa" w:w="80"/>
-            </w:tcMar>
-          </w:tcPr>
-          <w:p>
-            <w:r>
-              <w:rPr>
-                <w:color w:val="1F2937"/>
-                <w:sz w:val="19"/>
-                <w:szCs w:val="19"/>
-              </w:rPr>
-              <w:t xml:space="preserve">R 42 621 600</w:t>
+              <w:t xml:space="preserve">Op. Year 5</w:t>
+            </w:r>
+          </w:p>
+        </w:tc>
+        <w:tc>
+          <w:tcPr>
+            <w:shd w:fill="F3F4F6" w:val="clear"/>
+            <w:tcMar>
+              <w:top w:type="dxa" w:w="50"/>
+              <w:left w:type="dxa" w:w="80"/>
+              <w:bottom w:type="dxa" w:w="50"/>
+              <w:right w:type="dxa" w:w="80"/>
+            </w:tcMar>
+          </w:tcPr>
+          <w:p>
+            <w:r>
+              <w:rPr>
+                <w:color w:val="1F2937"/>
+                <w:sz w:val="19"/>
+                <w:szCs w:val="19"/>
+              </w:rPr>
+              <w:t xml:space="preserve">—</w:t>
+            </w:r>
+          </w:p>
+        </w:tc>
+        <w:tc>
+          <w:tcPr>
+            <w:shd w:fill="F3F4F6" w:val="clear"/>
+            <w:tcMar>
+              <w:top w:type="dxa" w:w="50"/>
+              <w:left w:type="dxa" w:w="80"/>
+              <w:bottom w:type="dxa" w:w="50"/>
+              <w:right w:type="dxa" w:w="80"/>
+            </w:tcMar>
+          </w:tcPr>
+          <w:p>
+            <w:r>
+              <w:rPr>
+                <w:color w:val="1F2937"/>
+                <w:sz w:val="19"/>
+                <w:szCs w:val="19"/>
+              </w:rPr>
+              <w:t xml:space="preserve">R 2 160 000</w:t>
+            </w:r>
+          </w:p>
+        </w:tc>
+        <w:tc>
+          <w:tcPr>
+            <w:shd w:fill="F3F4F6" w:val="clear"/>
+            <w:tcMar>
+              <w:top w:type="dxa" w:w="50"/>
+              <w:left w:type="dxa" w:w="80"/>
+              <w:bottom w:type="dxa" w:w="50"/>
+              <w:right w:type="dxa" w:w="80"/>
+            </w:tcMar>
+          </w:tcPr>
+          <w:p>
+            <w:r>
+              <w:rPr>
+                <w:color w:val="1F2937"/>
+                <w:sz w:val="19"/>
+                <w:szCs w:val="19"/>
+              </w:rPr>
+              <w:t xml:space="preserve">R 3 330 400</w:t>
+            </w:r>
+          </w:p>
+        </w:tc>
+        <w:tc>
+          <w:tcPr>
+            <w:shd w:fill="F3F4F6" w:val="clear"/>
+            <w:tcMar>
+              <w:top w:type="dxa" w:w="50"/>
+              <w:left w:type="dxa" w:w="80"/>
+              <w:bottom w:type="dxa" w:w="50"/>
+              <w:right w:type="dxa" w:w="80"/>
+            </w:tcMar>
+          </w:tcPr>
+          <w:p>
+            <w:r>
+              <w:rPr>
+                <w:color w:val="1F2937"/>
+                <w:sz w:val="19"/>
+                <w:szCs w:val="19"/>
+              </w:rPr>
+              <w:t xml:space="preserve">R 5 490 400</w:t>
             </w:r>
           </w:p>
         </w:tc>
@@ -8811,7 +10525,7 @@
                 <w:sz w:val="19"/>
                 <w:szCs w:val="19"/>
               </w:rPr>
-              <w:t xml:space="preserve">VAT @ 15%</w:t>
+              <w:t xml:space="preserve">Total (excl. VAT)</w:t>
             </w:r>
           </w:p>
         </w:tc>
@@ -8891,7 +10605,7 @@
                 <w:sz w:val="19"/>
                 <w:szCs w:val="19"/>
               </w:rPr>
-              <w:t xml:space="preserve">R 6 393 240</w:t>
+              <w:t xml:space="preserve">R 53 296 000</w:t>
             </w:r>
           </w:p>
         </w:tc>
@@ -8914,13 +10628,118 @@
                 <w:sz w:val="19"/>
                 <w:szCs w:val="19"/>
               </w:rPr>
+              <w:t xml:space="preserve">VAT @ 15%</w:t>
+            </w:r>
+          </w:p>
+        </w:tc>
+        <w:tc>
+          <w:tcPr>
+            <w:shd w:fill="F3F4F6" w:val="clear"/>
+            <w:tcMar>
+              <w:top w:type="dxa" w:w="50"/>
+              <w:left w:type="dxa" w:w="80"/>
+              <w:bottom w:type="dxa" w:w="50"/>
+              <w:right w:type="dxa" w:w="80"/>
+            </w:tcMar>
+          </w:tcPr>
+          <w:p>
+            <w:r>
+              <w:rPr>
+                <w:color w:val="1F2937"/>
+                <w:sz w:val="19"/>
+                <w:szCs w:val="19"/>
+              </w:rPr>
+              <w:t xml:space="preserve"/>
+            </w:r>
+          </w:p>
+        </w:tc>
+        <w:tc>
+          <w:tcPr>
+            <w:shd w:fill="F3F4F6" w:val="clear"/>
+            <w:tcMar>
+              <w:top w:type="dxa" w:w="50"/>
+              <w:left w:type="dxa" w:w="80"/>
+              <w:bottom w:type="dxa" w:w="50"/>
+              <w:right w:type="dxa" w:w="80"/>
+            </w:tcMar>
+          </w:tcPr>
+          <w:p>
+            <w:r>
+              <w:rPr>
+                <w:color w:val="1F2937"/>
+                <w:sz w:val="19"/>
+                <w:szCs w:val="19"/>
+              </w:rPr>
+              <w:t xml:space="preserve"/>
+            </w:r>
+          </w:p>
+        </w:tc>
+        <w:tc>
+          <w:tcPr>
+            <w:shd w:fill="F3F4F6" w:val="clear"/>
+            <w:tcMar>
+              <w:top w:type="dxa" w:w="50"/>
+              <w:left w:type="dxa" w:w="80"/>
+              <w:bottom w:type="dxa" w:w="50"/>
+              <w:right w:type="dxa" w:w="80"/>
+            </w:tcMar>
+          </w:tcPr>
+          <w:p>
+            <w:r>
+              <w:rPr>
+                <w:color w:val="1F2937"/>
+                <w:sz w:val="19"/>
+                <w:szCs w:val="19"/>
+              </w:rPr>
+              <w:t xml:space="preserve"/>
+            </w:r>
+          </w:p>
+        </w:tc>
+        <w:tc>
+          <w:tcPr>
+            <w:shd w:fill="F3F4F6" w:val="clear"/>
+            <w:tcMar>
+              <w:top w:type="dxa" w:w="50"/>
+              <w:left w:type="dxa" w:w="80"/>
+              <w:bottom w:type="dxa" w:w="50"/>
+              <w:right w:type="dxa" w:w="80"/>
+            </w:tcMar>
+          </w:tcPr>
+          <w:p>
+            <w:r>
+              <w:rPr>
+                <w:color w:val="1F2937"/>
+                <w:sz w:val="19"/>
+                <w:szCs w:val="19"/>
+              </w:rPr>
+              <w:t xml:space="preserve">R 7 994 400</w:t>
+            </w:r>
+          </w:p>
+        </w:tc>
+      </w:tr>
+      <w:tr>
+        <w:tc>
+          <w:tcPr>
+            <w:tcMar>
+              <w:top w:type="dxa" w:w="50"/>
+              <w:left w:type="dxa" w:w="80"/>
+              <w:bottom w:type="dxa" w:w="50"/>
+              <w:right w:type="dxa" w:w="80"/>
+            </w:tcMar>
+          </w:tcPr>
+          <w:p>
+            <w:r>
+              <w:rPr>
+                <w:color w:val="1F2937"/>
+                <w:sz w:val="19"/>
+                <w:szCs w:val="19"/>
+              </w:rPr>
               <w:t xml:space="preserve">Total (incl. VAT)</w:t>
             </w:r>
           </w:p>
         </w:tc>
         <w:tc>
           <w:tcPr>
-            <w:shd w:fill="F3F4F6" w:val="clear"/>
             <w:tcMar>
               <w:top w:type="dxa" w:w="50"/>
               <w:left w:type="dxa" w:w="80"/>
@@ -8941,7 +10760,6 @@
         </w:tc>
         <w:tc>
           <w:tcPr>
-            <w:shd w:fill="F3F4F6" w:val="clear"/>
             <w:tcMar>
               <w:top w:type="dxa" w:w="50"/>
               <w:left w:type="dxa" w:w="80"/>
@@ -8962,7 +10780,6 @@
         </w:tc>
         <w:tc>
           <w:tcPr>
-            <w:shd w:fill="F3F4F6" w:val="clear"/>
             <w:tcMar>
               <w:top w:type="dxa" w:w="50"/>
               <w:left w:type="dxa" w:w="80"/>
@@ -8983,22 +10800,21 @@
         </w:tc>
         <w:tc>
           <w:tcPr>
-            <w:shd w:fill="F3F4F6" w:val="clear"/>
-            <w:tcMar>
-              <w:top w:type="dxa" w:w="50"/>
-              <w:left w:type="dxa" w:w="80"/>
-              <w:bottom w:type="dxa" w:w="50"/>
-              <w:right w:type="dxa" w:w="80"/>
-            </w:tcMar>
-          </w:tcPr>
-          <w:p>
-            <w:r>
-              <w:rPr>
-                <w:color w:val="1F2937"/>
-                <w:sz w:val="19"/>
-                <w:szCs w:val="19"/>
-              </w:rPr>
-              <w:t xml:space="preserve">R 49 014 840</w:t>
+            <w:tcMar>
+              <w:top w:type="dxa" w:w="50"/>
+              <w:left w:type="dxa" w:w="80"/>
+              <w:bottom w:type="dxa" w:w="50"/>
+              <w:right w:type="dxa" w:w="80"/>
+            </w:tcMar>
+          </w:tcPr>
+          <w:p>
+            <w:r>
+              <w:rPr>
+                <w:color w:val="1F2937"/>
+                <w:sz w:val="19"/>
+                <w:szCs w:val="19"/>
+              </w:rPr>
+              <w:t xml:space="preserve">R 61 290 400</w:t>
             </w:r>
           </w:p>
         </w:tc>

</xml_diff>